<commit_message>
conditionally show inputed table
</commit_message>
<xml_diff>
--- a/landflak.docx
+++ b/landflak.docx
@@ -19,10 +19,10 @@
         <w:t xml:space="preserve"> </w:t>
       </w:r>
       <w:r>
-        <w:t xml:space="preserve">Tanzania</w:t>
+        <w:t xml:space="preserve">Mexico</w:t>
       </w:r>
     </w:p>
-    <w:bookmarkStart w:id="23" w:name="internasjonal-bistand-til-tanzania"/>
+    <w:bookmarkStart w:id="23" w:name="internasjonal-bistand-til-mexico"/>
     <w:p>
       <w:pPr>
         <w:pStyle w:val="Heading1"/>
@@ -37,7 +37,7 @@
         <w:tab/>
       </w:r>
       <w:r>
-        <w:t xml:space="preserve">Internasjonal bistand til Tanzania</w:t>
+        <w:t xml:space="preserve">Internasjonal bistand til Mexico</w:t>
       </w:r>
     </w:p>
     <w:p>
@@ -45,7 +45,7 @@
         <w:pStyle w:val="FirstParagraph"/>
       </w:pPr>
       <w:r>
-        <w:t xml:space="preserve">I 2021 var Norge det åttende største giverlandet i OECDs utviklingskomite (DAC) av øremerket bistand til Tanzania. 2021 er den mest oppdaterte statistikken for landfordelt internasjonal bistand.</w:t>
+        <w:t xml:space="preserve">I 2021 var Norge det største giverlandet i OECDs utviklingskomite (DAC) av øremerket bistand til Mexico. 2021 er den mest oppdaterte statistikken for landfordelt internasjonal bistand.</w:t>
       </w:r>
     </w:p>
     <w:p>
@@ -96,7 +96,7 @@
       </w:r>
     </w:p>
     <w:bookmarkEnd w:id="23"/>
-    <w:bookmarkStart w:id="42" w:name="norsk-bistand-til-tanzania"/>
+    <w:bookmarkStart w:id="39" w:name="norsk-bistand-til-mexico"/>
     <w:p>
       <w:pPr>
         <w:pStyle w:val="Heading1"/>
@@ -111,7 +111,7 @@
         <w:tab/>
       </w:r>
       <w:r>
-        <w:t xml:space="preserve">Norsk bistand til Tanzania</w:t>
+        <w:t xml:space="preserve">Norsk bistand til Mexico</w:t>
       </w:r>
     </w:p>
     <w:p>
@@ -119,7 +119,7 @@
         <w:pStyle w:val="FirstParagraph"/>
       </w:pPr>
       <w:r>
-        <w:t xml:space="preserve">I 2022 utbetalte Norge 451 millioner kroner øremerket bistand til Tanzania gjennom bilaterale og multilaterale kanaler</w:t>
+        <w:t xml:space="preserve">I 2022 utbetalte Norge 3 millioner kroner øremerket bistand til Mexico gjennom bilaterale og multilaterale kanaler</w:t>
       </w:r>
       <w:r>
         <w:rPr>
@@ -141,6 +141,2070 @@
       </w:r>
       <w:r>
         <w:t xml:space="preserve"> </w:t>
+      </w:r>
+    </w:p>
+    <w:tbl xmlns:w="http://schemas.openxmlformats.org/wordprocessingml/2006/main" xmlns:r="http://schemas.openxmlformats.org/officeDocument/2006/relationships" xmlns:w14="http://schemas.microsoft.com/office/word/2010/wordml" xmlns:wp="http://schemas.openxmlformats.org/drawingml/2006/wordprocessingDrawing" xmlns:a="http://schemas.openxmlformats.org/drawingml/2006/main" xmlns:pic="http://schemas.openxmlformats.org/drawingml/2006/picture">
+      <w:tblPr>
+        <w:tblLayout w:type="fixed"/>
+        <w:jc w:val="start"/>
+        <w:tblLook w:firstRow="1" w:lastRow="0" w:firstColumn="0" w:lastColumn="0" w:noHBand="0" w:noVBand="1"/>
+      </w:tblPr>
+      <w:tblGrid>
+        <w:gridCol w:w="2736"/>
+        <w:gridCol w:w="712"/>
+        <w:gridCol w:w="712"/>
+        <w:gridCol w:w="712"/>
+        <w:gridCol w:w="712"/>
+        <w:gridCol w:w="712"/>
+        <w:gridCol w:w="712"/>
+        <w:gridCol w:w="712"/>
+        <w:gridCol w:w="712"/>
+        <w:gridCol w:w="712"/>
+        <w:gridCol w:w="712"/>
+      </w:tblGrid>
+      <w:tr>
+        <w:trPr>
+          <w:cantSplit/>
+          <w:trHeight w:val="452" w:hRule="auto"/>
+          <w:tblHeader/>
+        </w:trPr>
+        header1
+        <w:tc>
+          <w:tcPr>
+            <w:gridSpan w:val="11"/>
+            <w:tcBorders>
+              <w:bottom w:val="single" w:sz="8" w:space="0" w:color="000000"/>
+              <w:top w:val="none" w:sz="0" w:space="0" w:color="000000"/>
+              <w:left w:val="none" w:sz="0" w:space="0" w:color="000000"/>
+              <w:right w:val="none" w:sz="0" w:space="0" w:color="000000"/>
+            </w:tcBorders>
+            <w:shd w:val="clear" w:color="auto" w:fill="FFFFFF"/>
+            <w:tcMar>
+              <w:top w:w="0" w:type="dxa"/>
+              <w:bottom w:w="0" w:type="dxa"/>
+              <w:left w:w="0" w:type="dxa"/>
+              <w:right w:w="0" w:type="dxa"/>
+            </w:tcMar>
+            <w:vAlign w:val="center"/>
+          </w:tcPr>
+          <w:p>
+            <w:pPr>
+              <w:pStyle w:val="Normal"/>
+              <w:jc w:val="left"/>
+              <w:pBdr>
+                <w:bottom w:val="none" w:sz="0" w:space="0" w:color="000000"/>
+                <w:top w:val="none" w:sz="0" w:space="0" w:color="000000"/>
+                <w:left w:val="none" w:sz="0" w:space="0" w:color="000000"/>
+                <w:right w:val="none" w:sz="0" w:space="0" w:color="000000"/>
+              </w:pBdr>
+              <w:spacing w:after="100" w:before="100" w:line="240"/>
+              <w:ind w:left="100" w:right="100" w:firstLine="0" w:firstLineChars="0"/>
+            </w:pPr>
+            <w:r xmlns:w="http://schemas.openxmlformats.org/wordprocessingml/2006/main" xmlns:wp="http://schemas.openxmlformats.org/drawingml/2006/wordprocessingDrawing" xmlns:r="http://schemas.openxmlformats.org/officeDocument/2006/relationships" xmlns:w14="http://schemas.microsoft.com/office/word/2010/wordml">
+              <w:rPr>
+                <w:rFonts w:ascii="Cambria" w:hAnsi="Cambria" w:eastAsia="Cambria" w:cs="Cambria"/>
+                <w:i w:val="false"/>
+                <w:b w:val="true"/>
+                <w:u w:val="none"/>
+                <w:sz w:val="22"/>
+                <w:szCs w:val="22"/>
+                <w:color w:val="000000"/>
+              </w:rPr>
+              <w:t xml:space="preserve">Bistand til Mexico 2013-2022, fordelt på type bistand. NOK mill.</w:t>
+            </w:r>
+          </w:p>
+        </w:tc>
+      </w:tr>
+      <w:tr>
+        <w:trPr>
+          <w:cantSplit/>
+          <w:trHeight w:val="452" w:hRule="auto"/>
+          <w:tblHeader/>
+        </w:trPr>
+        header2
+        <w:tc>
+          <w:tcPr>
+            <w:tcBorders>
+              <w:bottom w:val="single" w:sz="8" w:space="0" w:color="000000"/>
+              <w:top w:val="single" w:sz="8" w:space="0" w:color="000000"/>
+              <w:left w:val="none" w:sz="0" w:space="0" w:color="000000"/>
+              <w:right w:val="none" w:sz="0" w:space="0" w:color="000000"/>
+            </w:tcBorders>
+            <w:shd w:val="clear" w:color="auto" w:fill="FFFFFF"/>
+            <w:tcMar>
+              <w:top w:w="0" w:type="dxa"/>
+              <w:bottom w:w="0" w:type="dxa"/>
+              <w:left w:w="0" w:type="dxa"/>
+              <w:right w:w="0" w:type="dxa"/>
+            </w:tcMar>
+            <w:vAlign w:val="center"/>
+          </w:tcPr>
+          <w:p>
+            <w:pPr>
+              <w:pStyle w:val="Normal"/>
+              <w:jc w:val="left"/>
+              <w:pBdr>
+                <w:bottom w:val="none" w:sz="0" w:space="0" w:color="000000"/>
+                <w:top w:val="none" w:sz="0" w:space="0" w:color="000000"/>
+                <w:left w:val="none" w:sz="0" w:space="0" w:color="000000"/>
+                <w:right w:val="none" w:sz="0" w:space="0" w:color="000000"/>
+              </w:pBdr>
+              <w:spacing w:after="100" w:before="100" w:line="240"/>
+              <w:ind w:left="100" w:right="100" w:firstLine="0" w:firstLineChars="0"/>
+            </w:pPr>
+            <w:r xmlns:w="http://schemas.openxmlformats.org/wordprocessingml/2006/main" xmlns:wp="http://schemas.openxmlformats.org/drawingml/2006/wordprocessingDrawing" xmlns:r="http://schemas.openxmlformats.org/officeDocument/2006/relationships" xmlns:w14="http://schemas.microsoft.com/office/word/2010/wordml">
+              <w:rPr>
+                <w:rFonts w:ascii="Cambria" w:hAnsi="Cambria" w:eastAsia="Cambria" w:cs="Cambria"/>
+                <w:i w:val="false"/>
+                <w:b w:val="false"/>
+                <w:u w:val="none"/>
+                <w:sz w:val="18"/>
+                <w:szCs w:val="18"/>
+                <w:color w:val="000000"/>
+              </w:rPr>
+              <w:t xml:space="preserve">Type bistand</w:t>
+            </w:r>
+          </w:p>
+        </w:tc>
+        <w:tc>
+          <w:tcPr>
+            <w:tcBorders>
+              <w:bottom w:val="single" w:sz="8" w:space="0" w:color="000000"/>
+              <w:top w:val="single" w:sz="8" w:space="0" w:color="000000"/>
+              <w:left w:val="none" w:sz="0" w:space="0" w:color="000000"/>
+              <w:right w:val="none" w:sz="0" w:space="0" w:color="000000"/>
+            </w:tcBorders>
+            <w:shd w:val="clear" w:color="auto" w:fill="FFFFFF"/>
+            <w:tcMar>
+              <w:top w:w="0" w:type="dxa"/>
+              <w:bottom w:w="0" w:type="dxa"/>
+              <w:left w:w="0" w:type="dxa"/>
+              <w:right w:w="0" w:type="dxa"/>
+            </w:tcMar>
+            <w:vAlign w:val="center"/>
+          </w:tcPr>
+          <w:p>
+            <w:pPr>
+              <w:pStyle w:val="Normal"/>
+              <w:jc w:val="right"/>
+              <w:pBdr>
+                <w:bottom w:val="none" w:sz="0" w:space="0" w:color="000000"/>
+                <w:top w:val="none" w:sz="0" w:space="0" w:color="000000"/>
+                <w:left w:val="none" w:sz="0" w:space="0" w:color="000000"/>
+                <w:right w:val="none" w:sz="0" w:space="0" w:color="000000"/>
+              </w:pBdr>
+              <w:spacing w:after="100" w:before="100" w:line="240"/>
+              <w:ind w:left="100" w:right="100" w:firstLine="0" w:firstLineChars="0"/>
+            </w:pPr>
+            <w:r xmlns:w="http://schemas.openxmlformats.org/wordprocessingml/2006/main" xmlns:wp="http://schemas.openxmlformats.org/drawingml/2006/wordprocessingDrawing" xmlns:r="http://schemas.openxmlformats.org/officeDocument/2006/relationships" xmlns:w14="http://schemas.microsoft.com/office/word/2010/wordml">
+              <w:rPr>
+                <w:rFonts w:ascii="Cambria" w:hAnsi="Cambria" w:eastAsia="Cambria" w:cs="Cambria"/>
+                <w:i w:val="false"/>
+                <w:b w:val="false"/>
+                <w:u w:val="none"/>
+                <w:sz w:val="18"/>
+                <w:szCs w:val="18"/>
+                <w:color w:val="000000"/>
+              </w:rPr>
+              <w:t xml:space="preserve">2013</w:t>
+            </w:r>
+          </w:p>
+        </w:tc>
+        <w:tc>
+          <w:tcPr>
+            <w:tcBorders>
+              <w:bottom w:val="single" w:sz="8" w:space="0" w:color="000000"/>
+              <w:top w:val="single" w:sz="8" w:space="0" w:color="000000"/>
+              <w:left w:val="none" w:sz="0" w:space="0" w:color="000000"/>
+              <w:right w:val="none" w:sz="0" w:space="0" w:color="000000"/>
+            </w:tcBorders>
+            <w:shd w:val="clear" w:color="auto" w:fill="FFFFFF"/>
+            <w:tcMar>
+              <w:top w:w="0" w:type="dxa"/>
+              <w:bottom w:w="0" w:type="dxa"/>
+              <w:left w:w="0" w:type="dxa"/>
+              <w:right w:w="0" w:type="dxa"/>
+            </w:tcMar>
+            <w:vAlign w:val="center"/>
+          </w:tcPr>
+          <w:p>
+            <w:pPr>
+              <w:pStyle w:val="Normal"/>
+              <w:jc w:val="right"/>
+              <w:pBdr>
+                <w:bottom w:val="none" w:sz="0" w:space="0" w:color="000000"/>
+                <w:top w:val="none" w:sz="0" w:space="0" w:color="000000"/>
+                <w:left w:val="none" w:sz="0" w:space="0" w:color="000000"/>
+                <w:right w:val="none" w:sz="0" w:space="0" w:color="000000"/>
+              </w:pBdr>
+              <w:spacing w:after="100" w:before="100" w:line="240"/>
+              <w:ind w:left="100" w:right="100" w:firstLine="0" w:firstLineChars="0"/>
+            </w:pPr>
+            <w:r xmlns:w="http://schemas.openxmlformats.org/wordprocessingml/2006/main" xmlns:wp="http://schemas.openxmlformats.org/drawingml/2006/wordprocessingDrawing" xmlns:r="http://schemas.openxmlformats.org/officeDocument/2006/relationships" xmlns:w14="http://schemas.microsoft.com/office/word/2010/wordml">
+              <w:rPr>
+                <w:rFonts w:ascii="Cambria" w:hAnsi="Cambria" w:eastAsia="Cambria" w:cs="Cambria"/>
+                <w:i w:val="false"/>
+                <w:b w:val="false"/>
+                <w:u w:val="none"/>
+                <w:sz w:val="18"/>
+                <w:szCs w:val="18"/>
+                <w:color w:val="000000"/>
+              </w:rPr>
+              <w:t xml:space="preserve">2014</w:t>
+            </w:r>
+          </w:p>
+        </w:tc>
+        <w:tc>
+          <w:tcPr>
+            <w:tcBorders>
+              <w:bottom w:val="single" w:sz="8" w:space="0" w:color="000000"/>
+              <w:top w:val="single" w:sz="8" w:space="0" w:color="000000"/>
+              <w:left w:val="none" w:sz="0" w:space="0" w:color="000000"/>
+              <w:right w:val="none" w:sz="0" w:space="0" w:color="000000"/>
+            </w:tcBorders>
+            <w:shd w:val="clear" w:color="auto" w:fill="FFFFFF"/>
+            <w:tcMar>
+              <w:top w:w="0" w:type="dxa"/>
+              <w:bottom w:w="0" w:type="dxa"/>
+              <w:left w:w="0" w:type="dxa"/>
+              <w:right w:w="0" w:type="dxa"/>
+            </w:tcMar>
+            <w:vAlign w:val="center"/>
+          </w:tcPr>
+          <w:p>
+            <w:pPr>
+              <w:pStyle w:val="Normal"/>
+              <w:jc w:val="right"/>
+              <w:pBdr>
+                <w:bottom w:val="none" w:sz="0" w:space="0" w:color="000000"/>
+                <w:top w:val="none" w:sz="0" w:space="0" w:color="000000"/>
+                <w:left w:val="none" w:sz="0" w:space="0" w:color="000000"/>
+                <w:right w:val="none" w:sz="0" w:space="0" w:color="000000"/>
+              </w:pBdr>
+              <w:spacing w:after="100" w:before="100" w:line="240"/>
+              <w:ind w:left="100" w:right="100" w:firstLine="0" w:firstLineChars="0"/>
+            </w:pPr>
+            <w:r xmlns:w="http://schemas.openxmlformats.org/wordprocessingml/2006/main" xmlns:wp="http://schemas.openxmlformats.org/drawingml/2006/wordprocessingDrawing" xmlns:r="http://schemas.openxmlformats.org/officeDocument/2006/relationships" xmlns:w14="http://schemas.microsoft.com/office/word/2010/wordml">
+              <w:rPr>
+                <w:rFonts w:ascii="Cambria" w:hAnsi="Cambria" w:eastAsia="Cambria" w:cs="Cambria"/>
+                <w:i w:val="false"/>
+                <w:b w:val="false"/>
+                <w:u w:val="none"/>
+                <w:sz w:val="18"/>
+                <w:szCs w:val="18"/>
+                <w:color w:val="000000"/>
+              </w:rPr>
+              <w:t xml:space="preserve">2015</w:t>
+            </w:r>
+          </w:p>
+        </w:tc>
+        <w:tc>
+          <w:tcPr>
+            <w:tcBorders>
+              <w:bottom w:val="single" w:sz="8" w:space="0" w:color="000000"/>
+              <w:top w:val="single" w:sz="8" w:space="0" w:color="000000"/>
+              <w:left w:val="none" w:sz="0" w:space="0" w:color="000000"/>
+              <w:right w:val="none" w:sz="0" w:space="0" w:color="000000"/>
+            </w:tcBorders>
+            <w:shd w:val="clear" w:color="auto" w:fill="FFFFFF"/>
+            <w:tcMar>
+              <w:top w:w="0" w:type="dxa"/>
+              <w:bottom w:w="0" w:type="dxa"/>
+              <w:left w:w="0" w:type="dxa"/>
+              <w:right w:w="0" w:type="dxa"/>
+            </w:tcMar>
+            <w:vAlign w:val="center"/>
+          </w:tcPr>
+          <w:p>
+            <w:pPr>
+              <w:pStyle w:val="Normal"/>
+              <w:jc w:val="right"/>
+              <w:pBdr>
+                <w:bottom w:val="none" w:sz="0" w:space="0" w:color="000000"/>
+                <w:top w:val="none" w:sz="0" w:space="0" w:color="000000"/>
+                <w:left w:val="none" w:sz="0" w:space="0" w:color="000000"/>
+                <w:right w:val="none" w:sz="0" w:space="0" w:color="000000"/>
+              </w:pBdr>
+              <w:spacing w:after="100" w:before="100" w:line="240"/>
+              <w:ind w:left="100" w:right="100" w:firstLine="0" w:firstLineChars="0"/>
+            </w:pPr>
+            <w:r xmlns:w="http://schemas.openxmlformats.org/wordprocessingml/2006/main" xmlns:wp="http://schemas.openxmlformats.org/drawingml/2006/wordprocessingDrawing" xmlns:r="http://schemas.openxmlformats.org/officeDocument/2006/relationships" xmlns:w14="http://schemas.microsoft.com/office/word/2010/wordml">
+              <w:rPr>
+                <w:rFonts w:ascii="Cambria" w:hAnsi="Cambria" w:eastAsia="Cambria" w:cs="Cambria"/>
+                <w:i w:val="false"/>
+                <w:b w:val="false"/>
+                <w:u w:val="none"/>
+                <w:sz w:val="18"/>
+                <w:szCs w:val="18"/>
+                <w:color w:val="000000"/>
+              </w:rPr>
+              <w:t xml:space="preserve">2016</w:t>
+            </w:r>
+          </w:p>
+        </w:tc>
+        <w:tc>
+          <w:tcPr>
+            <w:tcBorders>
+              <w:bottom w:val="single" w:sz="8" w:space="0" w:color="000000"/>
+              <w:top w:val="single" w:sz="8" w:space="0" w:color="000000"/>
+              <w:left w:val="none" w:sz="0" w:space="0" w:color="000000"/>
+              <w:right w:val="none" w:sz="0" w:space="0" w:color="000000"/>
+            </w:tcBorders>
+            <w:shd w:val="clear" w:color="auto" w:fill="FFFFFF"/>
+            <w:tcMar>
+              <w:top w:w="0" w:type="dxa"/>
+              <w:bottom w:w="0" w:type="dxa"/>
+              <w:left w:w="0" w:type="dxa"/>
+              <w:right w:w="0" w:type="dxa"/>
+            </w:tcMar>
+            <w:vAlign w:val="center"/>
+          </w:tcPr>
+          <w:p>
+            <w:pPr>
+              <w:pStyle w:val="Normal"/>
+              <w:jc w:val="right"/>
+              <w:pBdr>
+                <w:bottom w:val="none" w:sz="0" w:space="0" w:color="000000"/>
+                <w:top w:val="none" w:sz="0" w:space="0" w:color="000000"/>
+                <w:left w:val="none" w:sz="0" w:space="0" w:color="000000"/>
+                <w:right w:val="none" w:sz="0" w:space="0" w:color="000000"/>
+              </w:pBdr>
+              <w:spacing w:after="100" w:before="100" w:line="240"/>
+              <w:ind w:left="100" w:right="100" w:firstLine="0" w:firstLineChars="0"/>
+            </w:pPr>
+            <w:r xmlns:w="http://schemas.openxmlformats.org/wordprocessingml/2006/main" xmlns:wp="http://schemas.openxmlformats.org/drawingml/2006/wordprocessingDrawing" xmlns:r="http://schemas.openxmlformats.org/officeDocument/2006/relationships" xmlns:w14="http://schemas.microsoft.com/office/word/2010/wordml">
+              <w:rPr>
+                <w:rFonts w:ascii="Cambria" w:hAnsi="Cambria" w:eastAsia="Cambria" w:cs="Cambria"/>
+                <w:i w:val="false"/>
+                <w:b w:val="false"/>
+                <w:u w:val="none"/>
+                <w:sz w:val="18"/>
+                <w:szCs w:val="18"/>
+                <w:color w:val="000000"/>
+              </w:rPr>
+              <w:t xml:space="preserve">2017</w:t>
+            </w:r>
+          </w:p>
+        </w:tc>
+        <w:tc>
+          <w:tcPr>
+            <w:tcBorders>
+              <w:bottom w:val="single" w:sz="8" w:space="0" w:color="000000"/>
+              <w:top w:val="single" w:sz="8" w:space="0" w:color="000000"/>
+              <w:left w:val="none" w:sz="0" w:space="0" w:color="000000"/>
+              <w:right w:val="none" w:sz="0" w:space="0" w:color="000000"/>
+            </w:tcBorders>
+            <w:shd w:val="clear" w:color="auto" w:fill="FFFFFF"/>
+            <w:tcMar>
+              <w:top w:w="0" w:type="dxa"/>
+              <w:bottom w:w="0" w:type="dxa"/>
+              <w:left w:w="0" w:type="dxa"/>
+              <w:right w:w="0" w:type="dxa"/>
+            </w:tcMar>
+            <w:vAlign w:val="center"/>
+          </w:tcPr>
+          <w:p>
+            <w:pPr>
+              <w:pStyle w:val="Normal"/>
+              <w:jc w:val="right"/>
+              <w:pBdr>
+                <w:bottom w:val="none" w:sz="0" w:space="0" w:color="000000"/>
+                <w:top w:val="none" w:sz="0" w:space="0" w:color="000000"/>
+                <w:left w:val="none" w:sz="0" w:space="0" w:color="000000"/>
+                <w:right w:val="none" w:sz="0" w:space="0" w:color="000000"/>
+              </w:pBdr>
+              <w:spacing w:after="100" w:before="100" w:line="240"/>
+              <w:ind w:left="100" w:right="100" w:firstLine="0" w:firstLineChars="0"/>
+            </w:pPr>
+            <w:r xmlns:w="http://schemas.openxmlformats.org/wordprocessingml/2006/main" xmlns:wp="http://schemas.openxmlformats.org/drawingml/2006/wordprocessingDrawing" xmlns:r="http://schemas.openxmlformats.org/officeDocument/2006/relationships" xmlns:w14="http://schemas.microsoft.com/office/word/2010/wordml">
+              <w:rPr>
+                <w:rFonts w:ascii="Cambria" w:hAnsi="Cambria" w:eastAsia="Cambria" w:cs="Cambria"/>
+                <w:i w:val="false"/>
+                <w:b w:val="false"/>
+                <w:u w:val="none"/>
+                <w:sz w:val="18"/>
+                <w:szCs w:val="18"/>
+                <w:color w:val="000000"/>
+              </w:rPr>
+              <w:t xml:space="preserve">2018</w:t>
+            </w:r>
+          </w:p>
+        </w:tc>
+        <w:tc>
+          <w:tcPr>
+            <w:tcBorders>
+              <w:bottom w:val="single" w:sz="8" w:space="0" w:color="000000"/>
+              <w:top w:val="single" w:sz="8" w:space="0" w:color="000000"/>
+              <w:left w:val="none" w:sz="0" w:space="0" w:color="000000"/>
+              <w:right w:val="none" w:sz="0" w:space="0" w:color="000000"/>
+            </w:tcBorders>
+            <w:shd w:val="clear" w:color="auto" w:fill="FFFFFF"/>
+            <w:tcMar>
+              <w:top w:w="0" w:type="dxa"/>
+              <w:bottom w:w="0" w:type="dxa"/>
+              <w:left w:w="0" w:type="dxa"/>
+              <w:right w:w="0" w:type="dxa"/>
+            </w:tcMar>
+            <w:vAlign w:val="center"/>
+          </w:tcPr>
+          <w:p>
+            <w:pPr>
+              <w:pStyle w:val="Normal"/>
+              <w:jc w:val="right"/>
+              <w:pBdr>
+                <w:bottom w:val="none" w:sz="0" w:space="0" w:color="000000"/>
+                <w:top w:val="none" w:sz="0" w:space="0" w:color="000000"/>
+                <w:left w:val="none" w:sz="0" w:space="0" w:color="000000"/>
+                <w:right w:val="none" w:sz="0" w:space="0" w:color="000000"/>
+              </w:pBdr>
+              <w:spacing w:after="100" w:before="100" w:line="240"/>
+              <w:ind w:left="100" w:right="100" w:firstLine="0" w:firstLineChars="0"/>
+            </w:pPr>
+            <w:r xmlns:w="http://schemas.openxmlformats.org/wordprocessingml/2006/main" xmlns:wp="http://schemas.openxmlformats.org/drawingml/2006/wordprocessingDrawing" xmlns:r="http://schemas.openxmlformats.org/officeDocument/2006/relationships" xmlns:w14="http://schemas.microsoft.com/office/word/2010/wordml">
+              <w:rPr>
+                <w:rFonts w:ascii="Cambria" w:hAnsi="Cambria" w:eastAsia="Cambria" w:cs="Cambria"/>
+                <w:i w:val="false"/>
+                <w:b w:val="false"/>
+                <w:u w:val="none"/>
+                <w:sz w:val="18"/>
+                <w:szCs w:val="18"/>
+                <w:color w:val="000000"/>
+              </w:rPr>
+              <w:t xml:space="preserve">2019</w:t>
+            </w:r>
+          </w:p>
+        </w:tc>
+        <w:tc>
+          <w:tcPr>
+            <w:tcBorders>
+              <w:bottom w:val="single" w:sz="8" w:space="0" w:color="000000"/>
+              <w:top w:val="single" w:sz="8" w:space="0" w:color="000000"/>
+              <w:left w:val="none" w:sz="0" w:space="0" w:color="000000"/>
+              <w:right w:val="none" w:sz="0" w:space="0" w:color="000000"/>
+            </w:tcBorders>
+            <w:shd w:val="clear" w:color="auto" w:fill="FFFFFF"/>
+            <w:tcMar>
+              <w:top w:w="0" w:type="dxa"/>
+              <w:bottom w:w="0" w:type="dxa"/>
+              <w:left w:w="0" w:type="dxa"/>
+              <w:right w:w="0" w:type="dxa"/>
+            </w:tcMar>
+            <w:vAlign w:val="center"/>
+          </w:tcPr>
+          <w:p>
+            <w:pPr>
+              <w:pStyle w:val="Normal"/>
+              <w:jc w:val="right"/>
+              <w:pBdr>
+                <w:bottom w:val="none" w:sz="0" w:space="0" w:color="000000"/>
+                <w:top w:val="none" w:sz="0" w:space="0" w:color="000000"/>
+                <w:left w:val="none" w:sz="0" w:space="0" w:color="000000"/>
+                <w:right w:val="none" w:sz="0" w:space="0" w:color="000000"/>
+              </w:pBdr>
+              <w:spacing w:after="100" w:before="100" w:line="240"/>
+              <w:ind w:left="100" w:right="100" w:firstLine="0" w:firstLineChars="0"/>
+            </w:pPr>
+            <w:r xmlns:w="http://schemas.openxmlformats.org/wordprocessingml/2006/main" xmlns:wp="http://schemas.openxmlformats.org/drawingml/2006/wordprocessingDrawing" xmlns:r="http://schemas.openxmlformats.org/officeDocument/2006/relationships" xmlns:w14="http://schemas.microsoft.com/office/word/2010/wordml">
+              <w:rPr>
+                <w:rFonts w:ascii="Cambria" w:hAnsi="Cambria" w:eastAsia="Cambria" w:cs="Cambria"/>
+                <w:i w:val="false"/>
+                <w:b w:val="false"/>
+                <w:u w:val="none"/>
+                <w:sz w:val="18"/>
+                <w:szCs w:val="18"/>
+                <w:color w:val="000000"/>
+              </w:rPr>
+              <w:t xml:space="preserve">2020</w:t>
+            </w:r>
+          </w:p>
+        </w:tc>
+        <w:tc>
+          <w:tcPr>
+            <w:tcBorders>
+              <w:bottom w:val="single" w:sz="8" w:space="0" w:color="000000"/>
+              <w:top w:val="single" w:sz="8" w:space="0" w:color="000000"/>
+              <w:left w:val="none" w:sz="0" w:space="0" w:color="000000"/>
+              <w:right w:val="none" w:sz="0" w:space="0" w:color="000000"/>
+            </w:tcBorders>
+            <w:shd w:val="clear" w:color="auto" w:fill="FFFFFF"/>
+            <w:tcMar>
+              <w:top w:w="0" w:type="dxa"/>
+              <w:bottom w:w="0" w:type="dxa"/>
+              <w:left w:w="0" w:type="dxa"/>
+              <w:right w:w="0" w:type="dxa"/>
+            </w:tcMar>
+            <w:vAlign w:val="center"/>
+          </w:tcPr>
+          <w:p>
+            <w:pPr>
+              <w:pStyle w:val="Normal"/>
+              <w:jc w:val="right"/>
+              <w:pBdr>
+                <w:bottom w:val="none" w:sz="0" w:space="0" w:color="000000"/>
+                <w:top w:val="none" w:sz="0" w:space="0" w:color="000000"/>
+                <w:left w:val="none" w:sz="0" w:space="0" w:color="000000"/>
+                <w:right w:val="none" w:sz="0" w:space="0" w:color="000000"/>
+              </w:pBdr>
+              <w:spacing w:after="100" w:before="100" w:line="240"/>
+              <w:ind w:left="100" w:right="100" w:firstLine="0" w:firstLineChars="0"/>
+            </w:pPr>
+            <w:r xmlns:w="http://schemas.openxmlformats.org/wordprocessingml/2006/main" xmlns:wp="http://schemas.openxmlformats.org/drawingml/2006/wordprocessingDrawing" xmlns:r="http://schemas.openxmlformats.org/officeDocument/2006/relationships" xmlns:w14="http://schemas.microsoft.com/office/word/2010/wordml">
+              <w:rPr>
+                <w:rFonts w:ascii="Cambria" w:hAnsi="Cambria" w:eastAsia="Cambria" w:cs="Cambria"/>
+                <w:i w:val="false"/>
+                <w:b w:val="false"/>
+                <w:u w:val="none"/>
+                <w:sz w:val="18"/>
+                <w:szCs w:val="18"/>
+                <w:color w:val="000000"/>
+              </w:rPr>
+              <w:t xml:space="preserve">2021</w:t>
+            </w:r>
+          </w:p>
+        </w:tc>
+        <w:tc>
+          <w:tcPr>
+            <w:tcBorders>
+              <w:bottom w:val="single" w:sz="8" w:space="0" w:color="000000"/>
+              <w:top w:val="single" w:sz="8" w:space="0" w:color="000000"/>
+              <w:left w:val="none" w:sz="0" w:space="0" w:color="000000"/>
+              <w:right w:val="none" w:sz="0" w:space="0" w:color="000000"/>
+            </w:tcBorders>
+            <w:shd w:val="clear" w:color="auto" w:fill="FFFFFF"/>
+            <w:tcMar>
+              <w:top w:w="0" w:type="dxa"/>
+              <w:bottom w:w="0" w:type="dxa"/>
+              <w:left w:w="0" w:type="dxa"/>
+              <w:right w:w="0" w:type="dxa"/>
+            </w:tcMar>
+            <w:vAlign w:val="center"/>
+          </w:tcPr>
+          <w:p>
+            <w:pPr>
+              <w:pStyle w:val="Normal"/>
+              <w:jc w:val="right"/>
+              <w:pBdr>
+                <w:bottom w:val="none" w:sz="0" w:space="0" w:color="000000"/>
+                <w:top w:val="none" w:sz="0" w:space="0" w:color="000000"/>
+                <w:left w:val="none" w:sz="0" w:space="0" w:color="000000"/>
+                <w:right w:val="none" w:sz="0" w:space="0" w:color="000000"/>
+              </w:pBdr>
+              <w:spacing w:after="100" w:before="100" w:line="240"/>
+              <w:ind w:left="100" w:right="100" w:firstLine="0" w:firstLineChars="0"/>
+            </w:pPr>
+            <w:r xmlns:w="http://schemas.openxmlformats.org/wordprocessingml/2006/main" xmlns:wp="http://schemas.openxmlformats.org/drawingml/2006/wordprocessingDrawing" xmlns:r="http://schemas.openxmlformats.org/officeDocument/2006/relationships" xmlns:w14="http://schemas.microsoft.com/office/word/2010/wordml">
+              <w:rPr>
+                <w:rFonts w:ascii="Cambria" w:hAnsi="Cambria" w:eastAsia="Cambria" w:cs="Cambria"/>
+                <w:i w:val="false"/>
+                <w:b w:val="false"/>
+                <w:u w:val="none"/>
+                <w:sz w:val="18"/>
+                <w:szCs w:val="18"/>
+                <w:color w:val="000000"/>
+              </w:rPr>
+              <w:t xml:space="preserve">2022</w:t>
+            </w:r>
+          </w:p>
+        </w:tc>
+      </w:tr>
+      <w:tr>
+        <w:trPr>
+          <w:cantSplit/>
+          <w:trHeight w:val="439" w:hRule="auto"/>
+        </w:trPr>
+        body1
+        <w:tc>
+          <w:tcPr>
+            <w:tcBorders>
+              <w:bottom w:val="none" w:sz="0" w:space="0" w:color="000000"/>
+              <w:top w:val="single" w:sz="8" w:space="0" w:color="000000"/>
+              <w:left w:val="none" w:sz="0" w:space="0" w:color="000000"/>
+              <w:right w:val="none" w:sz="0" w:space="0" w:color="000000"/>
+            </w:tcBorders>
+            <w:shd w:val="clear" w:color="auto" w:fill="B4EAC9"/>
+            <w:tcMar>
+              <w:top w:w="0" w:type="dxa"/>
+              <w:bottom w:w="0" w:type="dxa"/>
+              <w:left w:w="0" w:type="dxa"/>
+              <w:right w:w="0" w:type="dxa"/>
+            </w:tcMar>
+            <w:vAlign w:val="center"/>
+          </w:tcPr>
+          <w:p>
+            <w:pPr>
+              <w:pStyle w:val="Normal"/>
+              <w:jc w:val="left"/>
+              <w:pBdr>
+                <w:bottom w:val="none" w:sz="0" w:space="0" w:color="000000"/>
+                <w:top w:val="none" w:sz="0" w:space="0" w:color="000000"/>
+                <w:left w:val="none" w:sz="0" w:space="0" w:color="000000"/>
+                <w:right w:val="none" w:sz="0" w:space="0" w:color="000000"/>
+              </w:pBdr>
+              <w:spacing w:after="100" w:before="100" w:line="240"/>
+              <w:ind w:left="100" w:right="100" w:firstLine="0" w:firstLineChars="0"/>
+            </w:pPr>
+            <w:r xmlns:w="http://schemas.openxmlformats.org/wordprocessingml/2006/main" xmlns:wp="http://schemas.openxmlformats.org/drawingml/2006/wordprocessingDrawing" xmlns:r="http://schemas.openxmlformats.org/officeDocument/2006/relationships" xmlns:w14="http://schemas.microsoft.com/office/word/2010/wordml">
+              <w:rPr>
+                <w:rFonts w:ascii="Cambria" w:hAnsi="Cambria" w:eastAsia="Cambria" w:cs="Cambria"/>
+                <w:i w:val="false"/>
+                <w:b w:val="false"/>
+                <w:u w:val="none"/>
+                <w:sz w:val="18"/>
+                <w:szCs w:val="18"/>
+                <w:color w:val="000000"/>
+              </w:rPr>
+              <w:t xml:space="preserve">Øremerket bistand</w:t>
+            </w:r>
+          </w:p>
+        </w:tc>
+        <w:tc>
+          <w:tcPr>
+            <w:tcBorders>
+              <w:bottom w:val="none" w:sz="0" w:space="0" w:color="000000"/>
+              <w:top w:val="single" w:sz="8" w:space="0" w:color="000000"/>
+              <w:left w:val="none" w:sz="0" w:space="0" w:color="000000"/>
+              <w:right w:val="none" w:sz="0" w:space="0" w:color="000000"/>
+            </w:tcBorders>
+            <w:shd w:val="clear" w:color="auto" w:fill="B4EAC9"/>
+            <w:tcMar>
+              <w:top w:w="0" w:type="dxa"/>
+              <w:bottom w:w="0" w:type="dxa"/>
+              <w:left w:w="0" w:type="dxa"/>
+              <w:right w:w="0" w:type="dxa"/>
+            </w:tcMar>
+            <w:vAlign w:val="center"/>
+          </w:tcPr>
+          <w:p>
+            <w:pPr>
+              <w:pStyle w:val="Normal"/>
+              <w:jc w:val="right"/>
+              <w:pBdr>
+                <w:bottom w:val="none" w:sz="0" w:space="0" w:color="000000"/>
+                <w:top w:val="none" w:sz="0" w:space="0" w:color="000000"/>
+                <w:left w:val="none" w:sz="0" w:space="0" w:color="000000"/>
+                <w:right w:val="none" w:sz="0" w:space="0" w:color="000000"/>
+              </w:pBdr>
+              <w:spacing w:after="100" w:before="100" w:line="240"/>
+              <w:ind w:left="100" w:right="100" w:firstLine="0" w:firstLineChars="0"/>
+            </w:pPr>
+            <w:r xmlns:w="http://schemas.openxmlformats.org/wordprocessingml/2006/main" xmlns:wp="http://schemas.openxmlformats.org/drawingml/2006/wordprocessingDrawing" xmlns:r="http://schemas.openxmlformats.org/officeDocument/2006/relationships" xmlns:w14="http://schemas.microsoft.com/office/word/2010/wordml">
+              <w:rPr>
+                <w:rFonts w:ascii="Cambria" w:hAnsi="Cambria" w:eastAsia="Cambria" w:cs="Cambria"/>
+                <w:i w:val="false"/>
+                <w:b w:val="false"/>
+                <w:u w:val="none"/>
+                <w:sz w:val="18"/>
+                <w:szCs w:val="18"/>
+                <w:color w:val="000000"/>
+              </w:rPr>
+              <w:t xml:space="preserve">10</w:t>
+            </w:r>
+          </w:p>
+        </w:tc>
+        <w:tc>
+          <w:tcPr>
+            <w:tcBorders>
+              <w:bottom w:val="none" w:sz="0" w:space="0" w:color="000000"/>
+              <w:top w:val="single" w:sz="8" w:space="0" w:color="000000"/>
+              <w:left w:val="none" w:sz="0" w:space="0" w:color="000000"/>
+              <w:right w:val="none" w:sz="0" w:space="0" w:color="000000"/>
+            </w:tcBorders>
+            <w:shd w:val="clear" w:color="auto" w:fill="B4EAC9"/>
+            <w:tcMar>
+              <w:top w:w="0" w:type="dxa"/>
+              <w:bottom w:w="0" w:type="dxa"/>
+              <w:left w:w="0" w:type="dxa"/>
+              <w:right w:w="0" w:type="dxa"/>
+            </w:tcMar>
+            <w:vAlign w:val="center"/>
+          </w:tcPr>
+          <w:p>
+            <w:pPr>
+              <w:pStyle w:val="Normal"/>
+              <w:jc w:val="right"/>
+              <w:pBdr>
+                <w:bottom w:val="none" w:sz="0" w:space="0" w:color="000000"/>
+                <w:top w:val="none" w:sz="0" w:space="0" w:color="000000"/>
+                <w:left w:val="none" w:sz="0" w:space="0" w:color="000000"/>
+                <w:right w:val="none" w:sz="0" w:space="0" w:color="000000"/>
+              </w:pBdr>
+              <w:spacing w:after="100" w:before="100" w:line="240"/>
+              <w:ind w:left="100" w:right="100" w:firstLine="0" w:firstLineChars="0"/>
+            </w:pPr>
+            <w:r xmlns:w="http://schemas.openxmlformats.org/wordprocessingml/2006/main" xmlns:wp="http://schemas.openxmlformats.org/drawingml/2006/wordprocessingDrawing" xmlns:r="http://schemas.openxmlformats.org/officeDocument/2006/relationships" xmlns:w14="http://schemas.microsoft.com/office/word/2010/wordml">
+              <w:rPr>
+                <w:rFonts w:ascii="Cambria" w:hAnsi="Cambria" w:eastAsia="Cambria" w:cs="Cambria"/>
+                <w:i w:val="false"/>
+                <w:b w:val="false"/>
+                <w:u w:val="none"/>
+                <w:sz w:val="18"/>
+                <w:szCs w:val="18"/>
+                <w:color w:val="000000"/>
+              </w:rPr>
+              <w:t xml:space="preserve">41</w:t>
+            </w:r>
+          </w:p>
+        </w:tc>
+        <w:tc>
+          <w:tcPr>
+            <w:tcBorders>
+              <w:bottom w:val="none" w:sz="0" w:space="0" w:color="000000"/>
+              <w:top w:val="single" w:sz="8" w:space="0" w:color="000000"/>
+              <w:left w:val="none" w:sz="0" w:space="0" w:color="000000"/>
+              <w:right w:val="none" w:sz="0" w:space="0" w:color="000000"/>
+            </w:tcBorders>
+            <w:shd w:val="clear" w:color="auto" w:fill="B4EAC9"/>
+            <w:tcMar>
+              <w:top w:w="0" w:type="dxa"/>
+              <w:bottom w:w="0" w:type="dxa"/>
+              <w:left w:w="0" w:type="dxa"/>
+              <w:right w:w="0" w:type="dxa"/>
+            </w:tcMar>
+            <w:vAlign w:val="center"/>
+          </w:tcPr>
+          <w:p>
+            <w:pPr>
+              <w:pStyle w:val="Normal"/>
+              <w:jc w:val="right"/>
+              <w:pBdr>
+                <w:bottom w:val="none" w:sz="0" w:space="0" w:color="000000"/>
+                <w:top w:val="none" w:sz="0" w:space="0" w:color="000000"/>
+                <w:left w:val="none" w:sz="0" w:space="0" w:color="000000"/>
+                <w:right w:val="none" w:sz="0" w:space="0" w:color="000000"/>
+              </w:pBdr>
+              <w:spacing w:after="100" w:before="100" w:line="240"/>
+              <w:ind w:left="100" w:right="100" w:firstLine="0" w:firstLineChars="0"/>
+            </w:pPr>
+            <w:r xmlns:w="http://schemas.openxmlformats.org/wordprocessingml/2006/main" xmlns:wp="http://schemas.openxmlformats.org/drawingml/2006/wordprocessingDrawing" xmlns:r="http://schemas.openxmlformats.org/officeDocument/2006/relationships" xmlns:w14="http://schemas.microsoft.com/office/word/2010/wordml">
+              <w:rPr>
+                <w:rFonts w:ascii="Cambria" w:hAnsi="Cambria" w:eastAsia="Cambria" w:cs="Cambria"/>
+                <w:i w:val="false"/>
+                <w:b w:val="false"/>
+                <w:u w:val="none"/>
+                <w:sz w:val="18"/>
+                <w:szCs w:val="18"/>
+                <w:color w:val="000000"/>
+              </w:rPr>
+              <w:t xml:space="preserve">23</w:t>
+            </w:r>
+          </w:p>
+        </w:tc>
+        <w:tc>
+          <w:tcPr>
+            <w:tcBorders>
+              <w:bottom w:val="none" w:sz="0" w:space="0" w:color="000000"/>
+              <w:top w:val="single" w:sz="8" w:space="0" w:color="000000"/>
+              <w:left w:val="none" w:sz="0" w:space="0" w:color="000000"/>
+              <w:right w:val="none" w:sz="0" w:space="0" w:color="000000"/>
+            </w:tcBorders>
+            <w:shd w:val="clear" w:color="auto" w:fill="B4EAC9"/>
+            <w:tcMar>
+              <w:top w:w="0" w:type="dxa"/>
+              <w:bottom w:w="0" w:type="dxa"/>
+              <w:left w:w="0" w:type="dxa"/>
+              <w:right w:w="0" w:type="dxa"/>
+            </w:tcMar>
+            <w:vAlign w:val="center"/>
+          </w:tcPr>
+          <w:p>
+            <w:pPr>
+              <w:pStyle w:val="Normal"/>
+              <w:jc w:val="right"/>
+              <w:pBdr>
+                <w:bottom w:val="none" w:sz="0" w:space="0" w:color="000000"/>
+                <w:top w:val="none" w:sz="0" w:space="0" w:color="000000"/>
+                <w:left w:val="none" w:sz="0" w:space="0" w:color="000000"/>
+                <w:right w:val="none" w:sz="0" w:space="0" w:color="000000"/>
+              </w:pBdr>
+              <w:spacing w:after="100" w:before="100" w:line="240"/>
+              <w:ind w:left="100" w:right="100" w:firstLine="0" w:firstLineChars="0"/>
+            </w:pPr>
+            <w:r xmlns:w="http://schemas.openxmlformats.org/wordprocessingml/2006/main" xmlns:wp="http://schemas.openxmlformats.org/drawingml/2006/wordprocessingDrawing" xmlns:r="http://schemas.openxmlformats.org/officeDocument/2006/relationships" xmlns:w14="http://schemas.microsoft.com/office/word/2010/wordml">
+              <w:rPr>
+                <w:rFonts w:ascii="Cambria" w:hAnsi="Cambria" w:eastAsia="Cambria" w:cs="Cambria"/>
+                <w:i w:val="false"/>
+                <w:b w:val="false"/>
+                <w:u w:val="none"/>
+                <w:sz w:val="18"/>
+                <w:szCs w:val="18"/>
+                <w:color w:val="000000"/>
+              </w:rPr>
+              <w:t xml:space="preserve"> 0,0</w:t>
+            </w:r>
+          </w:p>
+        </w:tc>
+        <w:tc>
+          <w:tcPr>
+            <w:tcBorders>
+              <w:bottom w:val="none" w:sz="0" w:space="0" w:color="000000"/>
+              <w:top w:val="single" w:sz="8" w:space="0" w:color="000000"/>
+              <w:left w:val="none" w:sz="0" w:space="0" w:color="000000"/>
+              <w:right w:val="none" w:sz="0" w:space="0" w:color="000000"/>
+            </w:tcBorders>
+            <w:shd w:val="clear" w:color="auto" w:fill="B4EAC9"/>
+            <w:tcMar>
+              <w:top w:w="0" w:type="dxa"/>
+              <w:bottom w:w="0" w:type="dxa"/>
+              <w:left w:w="0" w:type="dxa"/>
+              <w:right w:w="0" w:type="dxa"/>
+            </w:tcMar>
+            <w:vAlign w:val="center"/>
+          </w:tcPr>
+          <w:p>
+            <w:pPr>
+              <w:pStyle w:val="Normal"/>
+              <w:jc w:val="right"/>
+              <w:pBdr>
+                <w:bottom w:val="none" w:sz="0" w:space="0" w:color="000000"/>
+                <w:top w:val="none" w:sz="0" w:space="0" w:color="000000"/>
+                <w:left w:val="none" w:sz="0" w:space="0" w:color="000000"/>
+                <w:right w:val="none" w:sz="0" w:space="0" w:color="000000"/>
+              </w:pBdr>
+              <w:spacing w:after="100" w:before="100" w:line="240"/>
+              <w:ind w:left="100" w:right="100" w:firstLine="0" w:firstLineChars="0"/>
+            </w:pPr>
+            <w:r xmlns:w="http://schemas.openxmlformats.org/wordprocessingml/2006/main" xmlns:wp="http://schemas.openxmlformats.org/drawingml/2006/wordprocessingDrawing" xmlns:r="http://schemas.openxmlformats.org/officeDocument/2006/relationships" xmlns:w14="http://schemas.microsoft.com/office/word/2010/wordml">
+              <w:rPr>
+                <w:rFonts w:ascii="Cambria" w:hAnsi="Cambria" w:eastAsia="Cambria" w:cs="Cambria"/>
+                <w:i w:val="false"/>
+                <w:b w:val="false"/>
+                <w:u w:val="none"/>
+                <w:sz w:val="18"/>
+                <w:szCs w:val="18"/>
+                <w:color w:val="000000"/>
+              </w:rPr>
+              <w:t xml:space="preserve">0</w:t>
+            </w:r>
+          </w:p>
+        </w:tc>
+        <w:tc>
+          <w:tcPr>
+            <w:tcBorders>
+              <w:bottom w:val="none" w:sz="0" w:space="0" w:color="000000"/>
+              <w:top w:val="single" w:sz="8" w:space="0" w:color="000000"/>
+              <w:left w:val="none" w:sz="0" w:space="0" w:color="000000"/>
+              <w:right w:val="none" w:sz="0" w:space="0" w:color="000000"/>
+            </w:tcBorders>
+            <w:shd w:val="clear" w:color="auto" w:fill="B4EAC9"/>
+            <w:tcMar>
+              <w:top w:w="0" w:type="dxa"/>
+              <w:bottom w:w="0" w:type="dxa"/>
+              <w:left w:w="0" w:type="dxa"/>
+              <w:right w:w="0" w:type="dxa"/>
+            </w:tcMar>
+            <w:vAlign w:val="center"/>
+          </w:tcPr>
+          <w:p>
+            <w:pPr>
+              <w:pStyle w:val="Normal"/>
+              <w:jc w:val="right"/>
+              <w:pBdr>
+                <w:bottom w:val="none" w:sz="0" w:space="0" w:color="000000"/>
+                <w:top w:val="none" w:sz="0" w:space="0" w:color="000000"/>
+                <w:left w:val="none" w:sz="0" w:space="0" w:color="000000"/>
+                <w:right w:val="none" w:sz="0" w:space="0" w:color="000000"/>
+              </w:pBdr>
+              <w:spacing w:after="100" w:before="100" w:line="240"/>
+              <w:ind w:left="100" w:right="100" w:firstLine="0" w:firstLineChars="0"/>
+            </w:pPr>
+            <w:r xmlns:w="http://schemas.openxmlformats.org/wordprocessingml/2006/main" xmlns:wp="http://schemas.openxmlformats.org/drawingml/2006/wordprocessingDrawing" xmlns:r="http://schemas.openxmlformats.org/officeDocument/2006/relationships" xmlns:w14="http://schemas.microsoft.com/office/word/2010/wordml">
+              <w:rPr>
+                <w:rFonts w:ascii="Cambria" w:hAnsi="Cambria" w:eastAsia="Cambria" w:cs="Cambria"/>
+                <w:i w:val="false"/>
+                <w:b w:val="false"/>
+                <w:u w:val="none"/>
+                <w:sz w:val="18"/>
+                <w:szCs w:val="18"/>
+                <w:color w:val="000000"/>
+              </w:rPr>
+              <w:t xml:space="preserve">0,0</w:t>
+            </w:r>
+          </w:p>
+        </w:tc>
+        <w:tc>
+          <w:tcPr>
+            <w:tcBorders>
+              <w:bottom w:val="none" w:sz="0" w:space="0" w:color="000000"/>
+              <w:top w:val="single" w:sz="8" w:space="0" w:color="000000"/>
+              <w:left w:val="none" w:sz="0" w:space="0" w:color="000000"/>
+              <w:right w:val="none" w:sz="0" w:space="0" w:color="000000"/>
+            </w:tcBorders>
+            <w:shd w:val="clear" w:color="auto" w:fill="B4EAC9"/>
+            <w:tcMar>
+              <w:top w:w="0" w:type="dxa"/>
+              <w:bottom w:w="0" w:type="dxa"/>
+              <w:left w:w="0" w:type="dxa"/>
+              <w:right w:w="0" w:type="dxa"/>
+            </w:tcMar>
+            <w:vAlign w:val="center"/>
+          </w:tcPr>
+          <w:p>
+            <w:pPr>
+              <w:pStyle w:val="Normal"/>
+              <w:jc w:val="right"/>
+              <w:pBdr>
+                <w:bottom w:val="none" w:sz="0" w:space="0" w:color="000000"/>
+                <w:top w:val="none" w:sz="0" w:space="0" w:color="000000"/>
+                <w:left w:val="none" w:sz="0" w:space="0" w:color="000000"/>
+                <w:right w:val="none" w:sz="0" w:space="0" w:color="000000"/>
+              </w:pBdr>
+              <w:spacing w:after="100" w:before="100" w:line="240"/>
+              <w:ind w:left="100" w:right="100" w:firstLine="0" w:firstLineChars="0"/>
+            </w:pPr>
+            <w:r xmlns:w="http://schemas.openxmlformats.org/wordprocessingml/2006/main" xmlns:wp="http://schemas.openxmlformats.org/drawingml/2006/wordprocessingDrawing" xmlns:r="http://schemas.openxmlformats.org/officeDocument/2006/relationships" xmlns:w14="http://schemas.microsoft.com/office/word/2010/wordml">
+              <w:rPr>
+                <w:rFonts w:ascii="Cambria" w:hAnsi="Cambria" w:eastAsia="Cambria" w:cs="Cambria"/>
+                <w:i w:val="false"/>
+                <w:b w:val="false"/>
+                <w:u w:val="none"/>
+                <w:sz w:val="18"/>
+                <w:szCs w:val="18"/>
+                <w:color w:val="000000"/>
+              </w:rPr>
+              <w:t xml:space="preserve"> 0,0</w:t>
+            </w:r>
+          </w:p>
+        </w:tc>
+        <w:tc>
+          <w:tcPr>
+            <w:tcBorders>
+              <w:bottom w:val="none" w:sz="0" w:space="0" w:color="000000"/>
+              <w:top w:val="single" w:sz="8" w:space="0" w:color="000000"/>
+              <w:left w:val="none" w:sz="0" w:space="0" w:color="000000"/>
+              <w:right w:val="none" w:sz="0" w:space="0" w:color="000000"/>
+            </w:tcBorders>
+            <w:shd w:val="clear" w:color="auto" w:fill="B4EAC9"/>
+            <w:tcMar>
+              <w:top w:w="0" w:type="dxa"/>
+              <w:bottom w:w="0" w:type="dxa"/>
+              <w:left w:w="0" w:type="dxa"/>
+              <w:right w:w="0" w:type="dxa"/>
+            </w:tcMar>
+            <w:vAlign w:val="center"/>
+          </w:tcPr>
+          <w:p>
+            <w:pPr>
+              <w:pStyle w:val="Normal"/>
+              <w:jc w:val="right"/>
+              <w:pBdr>
+                <w:bottom w:val="none" w:sz="0" w:space="0" w:color="000000"/>
+                <w:top w:val="none" w:sz="0" w:space="0" w:color="000000"/>
+                <w:left w:val="none" w:sz="0" w:space="0" w:color="000000"/>
+                <w:right w:val="none" w:sz="0" w:space="0" w:color="000000"/>
+              </w:pBdr>
+              <w:spacing w:after="100" w:before="100" w:line="240"/>
+              <w:ind w:left="100" w:right="100" w:firstLine="0" w:firstLineChars="0"/>
+            </w:pPr>
+            <w:r xmlns:w="http://schemas.openxmlformats.org/wordprocessingml/2006/main" xmlns:wp="http://schemas.openxmlformats.org/drawingml/2006/wordprocessingDrawing" xmlns:r="http://schemas.openxmlformats.org/officeDocument/2006/relationships" xmlns:w14="http://schemas.microsoft.com/office/word/2010/wordml">
+              <w:rPr>
+                <w:rFonts w:ascii="Cambria" w:hAnsi="Cambria" w:eastAsia="Cambria" w:cs="Cambria"/>
+                <w:i w:val="false"/>
+                <w:b w:val="false"/>
+                <w:u w:val="none"/>
+                <w:sz w:val="18"/>
+                <w:szCs w:val="18"/>
+                <w:color w:val="000000"/>
+              </w:rPr>
+              <w:t xml:space="preserve"> 0,0</w:t>
+            </w:r>
+          </w:p>
+        </w:tc>
+        <w:tc>
+          <w:tcPr>
+            <w:tcBorders>
+              <w:bottom w:val="none" w:sz="0" w:space="0" w:color="000000"/>
+              <w:top w:val="single" w:sz="8" w:space="0" w:color="000000"/>
+              <w:left w:val="none" w:sz="0" w:space="0" w:color="000000"/>
+              <w:right w:val="none" w:sz="0" w:space="0" w:color="000000"/>
+            </w:tcBorders>
+            <w:shd w:val="clear" w:color="auto" w:fill="B4EAC9"/>
+            <w:tcMar>
+              <w:top w:w="0" w:type="dxa"/>
+              <w:bottom w:w="0" w:type="dxa"/>
+              <w:left w:w="0" w:type="dxa"/>
+              <w:right w:w="0" w:type="dxa"/>
+            </w:tcMar>
+            <w:vAlign w:val="center"/>
+          </w:tcPr>
+          <w:p>
+            <w:pPr>
+              <w:pStyle w:val="Normal"/>
+              <w:jc w:val="right"/>
+              <w:pBdr>
+                <w:bottom w:val="none" w:sz="0" w:space="0" w:color="000000"/>
+                <w:top w:val="none" w:sz="0" w:space="0" w:color="000000"/>
+                <w:left w:val="none" w:sz="0" w:space="0" w:color="000000"/>
+                <w:right w:val="none" w:sz="0" w:space="0" w:color="000000"/>
+              </w:pBdr>
+              <w:spacing w:after="100" w:before="100" w:line="240"/>
+              <w:ind w:left="100" w:right="100" w:firstLine="0" w:firstLineChars="0"/>
+            </w:pPr>
+            <w:r xmlns:w="http://schemas.openxmlformats.org/wordprocessingml/2006/main" xmlns:wp="http://schemas.openxmlformats.org/drawingml/2006/wordprocessingDrawing" xmlns:r="http://schemas.openxmlformats.org/officeDocument/2006/relationships" xmlns:w14="http://schemas.microsoft.com/office/word/2010/wordml">
+              <w:rPr>
+                <w:rFonts w:ascii="Cambria" w:hAnsi="Cambria" w:eastAsia="Cambria" w:cs="Cambria"/>
+                <w:i w:val="false"/>
+                <w:b w:val="false"/>
+                <w:u w:val="none"/>
+                <w:sz w:val="18"/>
+                <w:szCs w:val="18"/>
+                <w:color w:val="000000"/>
+              </w:rPr>
+              <w:t xml:space="preserve"> 0,0</w:t>
+            </w:r>
+          </w:p>
+        </w:tc>
+        <w:tc>
+          <w:tcPr>
+            <w:tcBorders>
+              <w:bottom w:val="none" w:sz="0" w:space="0" w:color="000000"/>
+              <w:top w:val="single" w:sz="8" w:space="0" w:color="000000"/>
+              <w:left w:val="none" w:sz="0" w:space="0" w:color="000000"/>
+              <w:right w:val="none" w:sz="0" w:space="0" w:color="000000"/>
+            </w:tcBorders>
+            <w:shd w:val="clear" w:color="auto" w:fill="B4EAC9"/>
+            <w:tcMar>
+              <w:top w:w="0" w:type="dxa"/>
+              <w:bottom w:w="0" w:type="dxa"/>
+              <w:left w:w="0" w:type="dxa"/>
+              <w:right w:w="0" w:type="dxa"/>
+            </w:tcMar>
+            <w:vAlign w:val="center"/>
+          </w:tcPr>
+          <w:p>
+            <w:pPr>
+              <w:pStyle w:val="Normal"/>
+              <w:jc w:val="right"/>
+              <w:pBdr>
+                <w:bottom w:val="none" w:sz="0" w:space="0" w:color="000000"/>
+                <w:top w:val="none" w:sz="0" w:space="0" w:color="000000"/>
+                <w:left w:val="none" w:sz="0" w:space="0" w:color="000000"/>
+                <w:right w:val="none" w:sz="0" w:space="0" w:color="000000"/>
+              </w:pBdr>
+              <w:spacing w:after="100" w:before="100" w:line="240"/>
+              <w:ind w:left="100" w:right="100" w:firstLine="0" w:firstLineChars="0"/>
+            </w:pPr>
+            <w:r xmlns:w="http://schemas.openxmlformats.org/wordprocessingml/2006/main" xmlns:wp="http://schemas.openxmlformats.org/drawingml/2006/wordprocessingDrawing" xmlns:r="http://schemas.openxmlformats.org/officeDocument/2006/relationships" xmlns:w14="http://schemas.microsoft.com/office/word/2010/wordml">
+              <w:rPr>
+                <w:rFonts w:ascii="Cambria" w:hAnsi="Cambria" w:eastAsia="Cambria" w:cs="Cambria"/>
+                <w:i w:val="false"/>
+                <w:b w:val="false"/>
+                <w:u w:val="none"/>
+                <w:sz w:val="18"/>
+                <w:szCs w:val="18"/>
+                <w:color w:val="000000"/>
+              </w:rPr>
+              <w:t xml:space="preserve"> 3</w:t>
+            </w:r>
+          </w:p>
+        </w:tc>
+      </w:tr>
+      <w:tr>
+        <w:trPr>
+          <w:cantSplit/>
+          <w:trHeight w:val="452" w:hRule="auto"/>
+        </w:trPr>
+        body2
+        <w:tc>
+          <w:tcPr>
+            <w:tcBorders>
+              <w:bottom w:val="single" w:sz="8" w:space="0" w:color="000000"/>
+              <w:top w:val="none" w:sz="0" w:space="0" w:color="000000"/>
+              <w:left w:val="none" w:sz="0" w:space="0" w:color="000000"/>
+              <w:right w:val="none" w:sz="0" w:space="0" w:color="000000"/>
+            </w:tcBorders>
+            <w:shd w:val="clear" w:color="auto" w:fill="FFA274"/>
+            <w:tcMar>
+              <w:top w:w="0" w:type="dxa"/>
+              <w:bottom w:w="0" w:type="dxa"/>
+              <w:left w:w="0" w:type="dxa"/>
+              <w:right w:w="0" w:type="dxa"/>
+            </w:tcMar>
+            <w:vAlign w:val="center"/>
+          </w:tcPr>
+          <w:p>
+            <w:pPr>
+              <w:pStyle w:val="Normal"/>
+              <w:jc w:val="left"/>
+              <w:pBdr>
+                <w:bottom w:val="none" w:sz="0" w:space="0" w:color="000000"/>
+                <w:top w:val="none" w:sz="0" w:space="0" w:color="000000"/>
+                <w:left w:val="none" w:sz="0" w:space="0" w:color="000000"/>
+                <w:right w:val="none" w:sz="0" w:space="0" w:color="000000"/>
+              </w:pBdr>
+              <w:spacing w:after="100" w:before="100" w:line="240"/>
+              <w:ind w:left="100" w:right="100" w:firstLine="0" w:firstLineChars="0"/>
+            </w:pPr>
+            <w:r xmlns:w="http://schemas.openxmlformats.org/wordprocessingml/2006/main" xmlns:wp="http://schemas.openxmlformats.org/drawingml/2006/wordprocessingDrawing" xmlns:r="http://schemas.openxmlformats.org/officeDocument/2006/relationships" xmlns:w14="http://schemas.microsoft.com/office/word/2010/wordml">
+              <w:rPr>
+                <w:rFonts w:ascii="Cambria" w:hAnsi="Cambria" w:eastAsia="Cambria" w:cs="Cambria"/>
+                <w:i w:val="false"/>
+                <w:b w:val="false"/>
+                <w:u w:val="none"/>
+                <w:sz w:val="18"/>
+                <w:szCs w:val="18"/>
+                <w:color w:val="000000"/>
+              </w:rPr>
+              <w:t xml:space="preserve">Beregnet multilateral kjernestøtte</w:t>
+            </w:r>
+          </w:p>
+        </w:tc>
+        <w:tc>
+          <w:tcPr>
+            <w:tcBorders>
+              <w:bottom w:val="single" w:sz="8" w:space="0" w:color="000000"/>
+              <w:top w:val="none" w:sz="0" w:space="0" w:color="000000"/>
+              <w:left w:val="none" w:sz="0" w:space="0" w:color="000000"/>
+              <w:right w:val="none" w:sz="0" w:space="0" w:color="000000"/>
+            </w:tcBorders>
+            <w:shd w:val="clear" w:color="auto" w:fill="FFA274"/>
+            <w:tcMar>
+              <w:top w:w="0" w:type="dxa"/>
+              <w:bottom w:w="0" w:type="dxa"/>
+              <w:left w:w="0" w:type="dxa"/>
+              <w:right w:w="0" w:type="dxa"/>
+            </w:tcMar>
+            <w:vAlign w:val="center"/>
+          </w:tcPr>
+          <w:p>
+            <w:pPr>
+              <w:pStyle w:val="Normal"/>
+              <w:jc w:val="right"/>
+              <w:pBdr>
+                <w:bottom w:val="none" w:sz="0" w:space="0" w:color="000000"/>
+                <w:top w:val="none" w:sz="0" w:space="0" w:color="000000"/>
+                <w:left w:val="none" w:sz="0" w:space="0" w:color="000000"/>
+                <w:right w:val="none" w:sz="0" w:space="0" w:color="000000"/>
+              </w:pBdr>
+              <w:spacing w:after="100" w:before="100" w:line="240"/>
+              <w:ind w:left="100" w:right="100" w:firstLine="0" w:firstLineChars="0"/>
+            </w:pPr>
+            <w:r xmlns:w="http://schemas.openxmlformats.org/wordprocessingml/2006/main" xmlns:wp="http://schemas.openxmlformats.org/drawingml/2006/wordprocessingDrawing" xmlns:r="http://schemas.openxmlformats.org/officeDocument/2006/relationships" xmlns:w14="http://schemas.microsoft.com/office/word/2010/wordml">
+              <w:rPr>
+                <w:rFonts w:ascii="Cambria" w:hAnsi="Cambria" w:eastAsia="Cambria" w:cs="Cambria"/>
+                <w:i w:val="false"/>
+                <w:b w:val="false"/>
+                <w:u w:val="none"/>
+                <w:sz w:val="18"/>
+                <w:szCs w:val="18"/>
+                <w:color w:val="000000"/>
+              </w:rPr>
+              <w:t xml:space="preserve">12</w:t>
+            </w:r>
+          </w:p>
+        </w:tc>
+        <w:tc>
+          <w:tcPr>
+            <w:tcBorders>
+              <w:bottom w:val="single" w:sz="8" w:space="0" w:color="000000"/>
+              <w:top w:val="none" w:sz="0" w:space="0" w:color="000000"/>
+              <w:left w:val="none" w:sz="0" w:space="0" w:color="000000"/>
+              <w:right w:val="none" w:sz="0" w:space="0" w:color="000000"/>
+            </w:tcBorders>
+            <w:shd w:val="clear" w:color="auto" w:fill="FFA274"/>
+            <w:tcMar>
+              <w:top w:w="0" w:type="dxa"/>
+              <w:bottom w:w="0" w:type="dxa"/>
+              <w:left w:w="0" w:type="dxa"/>
+              <w:right w:w="0" w:type="dxa"/>
+            </w:tcMar>
+            <w:vAlign w:val="center"/>
+          </w:tcPr>
+          <w:p>
+            <w:pPr>
+              <w:pStyle w:val="Normal"/>
+              <w:jc w:val="right"/>
+              <w:pBdr>
+                <w:bottom w:val="none" w:sz="0" w:space="0" w:color="000000"/>
+                <w:top w:val="none" w:sz="0" w:space="0" w:color="000000"/>
+                <w:left w:val="none" w:sz="0" w:space="0" w:color="000000"/>
+                <w:right w:val="none" w:sz="0" w:space="0" w:color="000000"/>
+              </w:pBdr>
+              <w:spacing w:after="100" w:before="100" w:line="240"/>
+              <w:ind w:left="100" w:right="100" w:firstLine="0" w:firstLineChars="0"/>
+            </w:pPr>
+            <w:r xmlns:w="http://schemas.openxmlformats.org/wordprocessingml/2006/main" xmlns:wp="http://schemas.openxmlformats.org/drawingml/2006/wordprocessingDrawing" xmlns:r="http://schemas.openxmlformats.org/officeDocument/2006/relationships" xmlns:w14="http://schemas.microsoft.com/office/word/2010/wordml">
+              <w:rPr>
+                <w:rFonts w:ascii="Cambria" w:hAnsi="Cambria" w:eastAsia="Cambria" w:cs="Cambria"/>
+                <w:i w:val="false"/>
+                <w:b w:val="false"/>
+                <w:u w:val="none"/>
+                <w:sz w:val="18"/>
+                <w:szCs w:val="18"/>
+                <w:color w:val="000000"/>
+              </w:rPr>
+              <w:t xml:space="preserve">20</w:t>
+            </w:r>
+          </w:p>
+        </w:tc>
+        <w:tc>
+          <w:tcPr>
+            <w:tcBorders>
+              <w:bottom w:val="single" w:sz="8" w:space="0" w:color="000000"/>
+              <w:top w:val="none" w:sz="0" w:space="0" w:color="000000"/>
+              <w:left w:val="none" w:sz="0" w:space="0" w:color="000000"/>
+              <w:right w:val="none" w:sz="0" w:space="0" w:color="000000"/>
+            </w:tcBorders>
+            <w:shd w:val="clear" w:color="auto" w:fill="FFA274"/>
+            <w:tcMar>
+              <w:top w:w="0" w:type="dxa"/>
+              <w:bottom w:w="0" w:type="dxa"/>
+              <w:left w:w="0" w:type="dxa"/>
+              <w:right w:w="0" w:type="dxa"/>
+            </w:tcMar>
+            <w:vAlign w:val="center"/>
+          </w:tcPr>
+          <w:p>
+            <w:pPr>
+              <w:pStyle w:val="Normal"/>
+              <w:jc w:val="right"/>
+              <w:pBdr>
+                <w:bottom w:val="none" w:sz="0" w:space="0" w:color="000000"/>
+                <w:top w:val="none" w:sz="0" w:space="0" w:color="000000"/>
+                <w:left w:val="none" w:sz="0" w:space="0" w:color="000000"/>
+                <w:right w:val="none" w:sz="0" w:space="0" w:color="000000"/>
+              </w:pBdr>
+              <w:spacing w:after="100" w:before="100" w:line="240"/>
+              <w:ind w:left="100" w:right="100" w:firstLine="0" w:firstLineChars="0"/>
+            </w:pPr>
+            <w:r xmlns:w="http://schemas.openxmlformats.org/wordprocessingml/2006/main" xmlns:wp="http://schemas.openxmlformats.org/drawingml/2006/wordprocessingDrawing" xmlns:r="http://schemas.openxmlformats.org/officeDocument/2006/relationships" xmlns:w14="http://schemas.microsoft.com/office/word/2010/wordml">
+              <w:rPr>
+                <w:rFonts w:ascii="Cambria" w:hAnsi="Cambria" w:eastAsia="Cambria" w:cs="Cambria"/>
+                <w:i w:val="false"/>
+                <w:b w:val="false"/>
+                <w:u w:val="none"/>
+                <w:sz w:val="18"/>
+                <w:szCs w:val="18"/>
+                <w:color w:val="000000"/>
+              </w:rPr>
+              <w:t xml:space="preserve">10</w:t>
+            </w:r>
+          </w:p>
+        </w:tc>
+        <w:tc>
+          <w:tcPr>
+            <w:tcBorders>
+              <w:bottom w:val="single" w:sz="8" w:space="0" w:color="000000"/>
+              <w:top w:val="none" w:sz="0" w:space="0" w:color="000000"/>
+              <w:left w:val="none" w:sz="0" w:space="0" w:color="000000"/>
+              <w:right w:val="none" w:sz="0" w:space="0" w:color="000000"/>
+            </w:tcBorders>
+            <w:shd w:val="clear" w:color="auto" w:fill="FFA274"/>
+            <w:tcMar>
+              <w:top w:w="0" w:type="dxa"/>
+              <w:bottom w:w="0" w:type="dxa"/>
+              <w:left w:w="0" w:type="dxa"/>
+              <w:right w:w="0" w:type="dxa"/>
+            </w:tcMar>
+            <w:vAlign w:val="center"/>
+          </w:tcPr>
+          <w:p>
+            <w:pPr>
+              <w:pStyle w:val="Normal"/>
+              <w:jc w:val="right"/>
+              <w:pBdr>
+                <w:bottom w:val="none" w:sz="0" w:space="0" w:color="000000"/>
+                <w:top w:val="none" w:sz="0" w:space="0" w:color="000000"/>
+                <w:left w:val="none" w:sz="0" w:space="0" w:color="000000"/>
+                <w:right w:val="none" w:sz="0" w:space="0" w:color="000000"/>
+              </w:pBdr>
+              <w:spacing w:after="100" w:before="100" w:line="240"/>
+              <w:ind w:left="100" w:right="100" w:firstLine="0" w:firstLineChars="0"/>
+            </w:pPr>
+            <w:r xmlns:w="http://schemas.openxmlformats.org/wordprocessingml/2006/main" xmlns:wp="http://schemas.openxmlformats.org/drawingml/2006/wordprocessingDrawing" xmlns:r="http://schemas.openxmlformats.org/officeDocument/2006/relationships" xmlns:w14="http://schemas.microsoft.com/office/word/2010/wordml">
+              <w:rPr>
+                <w:rFonts w:ascii="Cambria" w:hAnsi="Cambria" w:eastAsia="Cambria" w:cs="Cambria"/>
+                <w:i w:val="false"/>
+                <w:b w:val="false"/>
+                <w:u w:val="none"/>
+                <w:sz w:val="18"/>
+                <w:szCs w:val="18"/>
+                <w:color w:val="000000"/>
+              </w:rPr>
+              <w:t xml:space="preserve">11</w:t>
+            </w:r>
+          </w:p>
+        </w:tc>
+        <w:tc>
+          <w:tcPr>
+            <w:tcBorders>
+              <w:bottom w:val="single" w:sz="8" w:space="0" w:color="000000"/>
+              <w:top w:val="none" w:sz="0" w:space="0" w:color="000000"/>
+              <w:left w:val="none" w:sz="0" w:space="0" w:color="000000"/>
+              <w:right w:val="none" w:sz="0" w:space="0" w:color="000000"/>
+            </w:tcBorders>
+            <w:shd w:val="clear" w:color="auto" w:fill="FFA274"/>
+            <w:tcMar>
+              <w:top w:w="0" w:type="dxa"/>
+              <w:bottom w:w="0" w:type="dxa"/>
+              <w:left w:w="0" w:type="dxa"/>
+              <w:right w:w="0" w:type="dxa"/>
+            </w:tcMar>
+            <w:vAlign w:val="center"/>
+          </w:tcPr>
+          <w:p>
+            <w:pPr>
+              <w:pStyle w:val="Normal"/>
+              <w:jc w:val="right"/>
+              <w:pBdr>
+                <w:bottom w:val="none" w:sz="0" w:space="0" w:color="000000"/>
+                <w:top w:val="none" w:sz="0" w:space="0" w:color="000000"/>
+                <w:left w:val="none" w:sz="0" w:space="0" w:color="000000"/>
+                <w:right w:val="none" w:sz="0" w:space="0" w:color="000000"/>
+              </w:pBdr>
+              <w:spacing w:after="100" w:before="100" w:line="240"/>
+              <w:ind w:left="100" w:right="100" w:firstLine="0" w:firstLineChars="0"/>
+            </w:pPr>
+            <w:r xmlns:w="http://schemas.openxmlformats.org/wordprocessingml/2006/main" xmlns:wp="http://schemas.openxmlformats.org/drawingml/2006/wordprocessingDrawing" xmlns:r="http://schemas.openxmlformats.org/officeDocument/2006/relationships" xmlns:w14="http://schemas.microsoft.com/office/word/2010/wordml">
+              <w:rPr>
+                <w:rFonts w:ascii="Cambria" w:hAnsi="Cambria" w:eastAsia="Cambria" w:cs="Cambria"/>
+                <w:i w:val="false"/>
+                <w:b w:val="false"/>
+                <w:u w:val="none"/>
+                <w:sz w:val="18"/>
+                <w:szCs w:val="18"/>
+                <w:color w:val="000000"/>
+              </w:rPr>
+              <w:t xml:space="preserve">7</w:t>
+            </w:r>
+          </w:p>
+        </w:tc>
+        <w:tc>
+          <w:tcPr>
+            <w:tcBorders>
+              <w:bottom w:val="single" w:sz="8" w:space="0" w:color="000000"/>
+              <w:top w:val="none" w:sz="0" w:space="0" w:color="000000"/>
+              <w:left w:val="none" w:sz="0" w:space="0" w:color="000000"/>
+              <w:right w:val="none" w:sz="0" w:space="0" w:color="000000"/>
+            </w:tcBorders>
+            <w:shd w:val="clear" w:color="auto" w:fill="FFA274"/>
+            <w:tcMar>
+              <w:top w:w="0" w:type="dxa"/>
+              <w:bottom w:w="0" w:type="dxa"/>
+              <w:left w:w="0" w:type="dxa"/>
+              <w:right w:w="0" w:type="dxa"/>
+            </w:tcMar>
+            <w:vAlign w:val="center"/>
+          </w:tcPr>
+          <w:p>
+            <w:pPr>
+              <w:pStyle w:val="Normal"/>
+              <w:jc w:val="right"/>
+              <w:pBdr>
+                <w:bottom w:val="none" w:sz="0" w:space="0" w:color="000000"/>
+                <w:top w:val="none" w:sz="0" w:space="0" w:color="000000"/>
+                <w:left w:val="none" w:sz="0" w:space="0" w:color="000000"/>
+                <w:right w:val="none" w:sz="0" w:space="0" w:color="000000"/>
+              </w:pBdr>
+              <w:spacing w:after="100" w:before="100" w:line="240"/>
+              <w:ind w:left="100" w:right="100" w:firstLine="0" w:firstLineChars="0"/>
+            </w:pPr>
+            <w:r xmlns:w="http://schemas.openxmlformats.org/wordprocessingml/2006/main" xmlns:wp="http://schemas.openxmlformats.org/drawingml/2006/wordprocessingDrawing" xmlns:r="http://schemas.openxmlformats.org/officeDocument/2006/relationships" xmlns:w14="http://schemas.microsoft.com/office/word/2010/wordml">
+              <w:rPr>
+                <w:rFonts w:ascii="Cambria" w:hAnsi="Cambria" w:eastAsia="Cambria" w:cs="Cambria"/>
+                <w:i w:val="false"/>
+                <w:b w:val="false"/>
+                <w:u w:val="none"/>
+                <w:sz w:val="18"/>
+                <w:szCs w:val="18"/>
+                <w:color w:val="000000"/>
+              </w:rPr>
+              <w:t xml:space="preserve">9</w:t>
+            </w:r>
+          </w:p>
+        </w:tc>
+        <w:tc>
+          <w:tcPr>
+            <w:tcBorders>
+              <w:bottom w:val="single" w:sz="8" w:space="0" w:color="000000"/>
+              <w:top w:val="none" w:sz="0" w:space="0" w:color="000000"/>
+              <w:left w:val="none" w:sz="0" w:space="0" w:color="000000"/>
+              <w:right w:val="none" w:sz="0" w:space="0" w:color="000000"/>
+            </w:tcBorders>
+            <w:shd w:val="clear" w:color="auto" w:fill="FFA274"/>
+            <w:tcMar>
+              <w:top w:w="0" w:type="dxa"/>
+              <w:bottom w:w="0" w:type="dxa"/>
+              <w:left w:w="0" w:type="dxa"/>
+              <w:right w:w="0" w:type="dxa"/>
+            </w:tcMar>
+            <w:vAlign w:val="center"/>
+          </w:tcPr>
+          <w:p>
+            <w:pPr>
+              <w:pStyle w:val="Normal"/>
+              <w:jc w:val="right"/>
+              <w:pBdr>
+                <w:bottom w:val="none" w:sz="0" w:space="0" w:color="000000"/>
+                <w:top w:val="none" w:sz="0" w:space="0" w:color="000000"/>
+                <w:left w:val="none" w:sz="0" w:space="0" w:color="000000"/>
+                <w:right w:val="none" w:sz="0" w:space="0" w:color="000000"/>
+              </w:pBdr>
+              <w:spacing w:after="100" w:before="100" w:line="240"/>
+              <w:ind w:left="100" w:right="100" w:firstLine="0" w:firstLineChars="0"/>
+            </w:pPr>
+            <w:r xmlns:w="http://schemas.openxmlformats.org/wordprocessingml/2006/main" xmlns:wp="http://schemas.openxmlformats.org/drawingml/2006/wordprocessingDrawing" xmlns:r="http://schemas.openxmlformats.org/officeDocument/2006/relationships" xmlns:w14="http://schemas.microsoft.com/office/word/2010/wordml">
+              <w:rPr>
+                <w:rFonts w:ascii="Cambria" w:hAnsi="Cambria" w:eastAsia="Cambria" w:cs="Cambria"/>
+                <w:i w:val="false"/>
+                <w:b w:val="false"/>
+                <w:u w:val="none"/>
+                <w:sz w:val="18"/>
+                <w:szCs w:val="18"/>
+                <w:color w:val="000000"/>
+              </w:rPr>
+              <w:t xml:space="preserve">12</w:t>
+            </w:r>
+          </w:p>
+        </w:tc>
+        <w:tc>
+          <w:tcPr>
+            <w:tcBorders>
+              <w:bottom w:val="single" w:sz="8" w:space="0" w:color="000000"/>
+              <w:top w:val="none" w:sz="0" w:space="0" w:color="000000"/>
+              <w:left w:val="none" w:sz="0" w:space="0" w:color="000000"/>
+              <w:right w:val="none" w:sz="0" w:space="0" w:color="000000"/>
+            </w:tcBorders>
+            <w:shd w:val="clear" w:color="auto" w:fill="FFA274"/>
+            <w:tcMar>
+              <w:top w:w="0" w:type="dxa"/>
+              <w:bottom w:w="0" w:type="dxa"/>
+              <w:left w:w="0" w:type="dxa"/>
+              <w:right w:w="0" w:type="dxa"/>
+            </w:tcMar>
+            <w:vAlign w:val="center"/>
+          </w:tcPr>
+          <w:p>
+            <w:pPr>
+              <w:pStyle w:val="Normal"/>
+              <w:jc w:val="right"/>
+              <w:pBdr>
+                <w:bottom w:val="none" w:sz="0" w:space="0" w:color="000000"/>
+                <w:top w:val="none" w:sz="0" w:space="0" w:color="000000"/>
+                <w:left w:val="none" w:sz="0" w:space="0" w:color="000000"/>
+                <w:right w:val="none" w:sz="0" w:space="0" w:color="000000"/>
+              </w:pBdr>
+              <w:spacing w:after="100" w:before="100" w:line="240"/>
+              <w:ind w:left="100" w:right="100" w:firstLine="0" w:firstLineChars="0"/>
+            </w:pPr>
+            <w:r xmlns:w="http://schemas.openxmlformats.org/wordprocessingml/2006/main" xmlns:wp="http://schemas.openxmlformats.org/drawingml/2006/wordprocessingDrawing" xmlns:r="http://schemas.openxmlformats.org/officeDocument/2006/relationships" xmlns:w14="http://schemas.microsoft.com/office/word/2010/wordml">
+              <w:rPr>
+                <w:rFonts w:ascii="Cambria" w:hAnsi="Cambria" w:eastAsia="Cambria" w:cs="Cambria"/>
+                <w:i w:val="false"/>
+                <w:b w:val="false"/>
+                <w:u w:val="none"/>
+                <w:sz w:val="18"/>
+                <w:szCs w:val="18"/>
+                <w:color w:val="000000"/>
+              </w:rPr>
+              <w:t xml:space="preserve">10</w:t>
+            </w:r>
+          </w:p>
+        </w:tc>
+        <w:tc>
+          <w:tcPr>
+            <w:tcBorders>
+              <w:bottom w:val="single" w:sz="8" w:space="0" w:color="000000"/>
+              <w:top w:val="none" w:sz="0" w:space="0" w:color="000000"/>
+              <w:left w:val="none" w:sz="0" w:space="0" w:color="000000"/>
+              <w:right w:val="none" w:sz="0" w:space="0" w:color="000000"/>
+            </w:tcBorders>
+            <w:shd w:val="clear" w:color="auto" w:fill="FFA274"/>
+            <w:tcMar>
+              <w:top w:w="0" w:type="dxa"/>
+              <w:bottom w:w="0" w:type="dxa"/>
+              <w:left w:w="0" w:type="dxa"/>
+              <w:right w:w="0" w:type="dxa"/>
+            </w:tcMar>
+            <w:vAlign w:val="center"/>
+          </w:tcPr>
+          <w:p>
+            <w:pPr>
+              <w:pStyle w:val="Normal"/>
+              <w:jc w:val="right"/>
+              <w:pBdr>
+                <w:bottom w:val="none" w:sz="0" w:space="0" w:color="000000"/>
+                <w:top w:val="none" w:sz="0" w:space="0" w:color="000000"/>
+                <w:left w:val="none" w:sz="0" w:space="0" w:color="000000"/>
+                <w:right w:val="none" w:sz="0" w:space="0" w:color="000000"/>
+              </w:pBdr>
+              <w:spacing w:after="100" w:before="100" w:line="240"/>
+              <w:ind w:left="100" w:right="100" w:firstLine="0" w:firstLineChars="0"/>
+            </w:pPr>
+            <w:r xmlns:w="http://schemas.openxmlformats.org/wordprocessingml/2006/main" xmlns:wp="http://schemas.openxmlformats.org/drawingml/2006/wordprocessingDrawing" xmlns:r="http://schemas.openxmlformats.org/officeDocument/2006/relationships" xmlns:w14="http://schemas.microsoft.com/office/word/2010/wordml">
+              <w:rPr>
+                <w:rFonts w:ascii="Cambria" w:hAnsi="Cambria" w:eastAsia="Cambria" w:cs="Cambria"/>
+                <w:i w:val="false"/>
+                <w:b w:val="false"/>
+                <w:u w:val="none"/>
+                <w:sz w:val="18"/>
+                <w:szCs w:val="18"/>
+                <w:color w:val="000000"/>
+              </w:rPr>
+              <w:t xml:space="preserve">23</w:t>
+            </w:r>
+          </w:p>
+        </w:tc>
+        <w:tc>
+          <w:tcPr>
+            <w:tcBorders>
+              <w:bottom w:val="single" w:sz="8" w:space="0" w:color="000000"/>
+              <w:top w:val="none" w:sz="0" w:space="0" w:color="000000"/>
+              <w:left w:val="none" w:sz="0" w:space="0" w:color="000000"/>
+              <w:right w:val="none" w:sz="0" w:space="0" w:color="000000"/>
+            </w:tcBorders>
+            <w:shd w:val="clear" w:color="auto" w:fill="FFA274"/>
+            <w:tcMar>
+              <w:top w:w="0" w:type="dxa"/>
+              <w:bottom w:w="0" w:type="dxa"/>
+              <w:left w:w="0" w:type="dxa"/>
+              <w:right w:w="0" w:type="dxa"/>
+            </w:tcMar>
+            <w:vAlign w:val="center"/>
+          </w:tcPr>
+          <w:p>
+            <w:pPr>
+              <w:pStyle w:val="Normal"/>
+              <w:jc w:val="right"/>
+              <w:pBdr>
+                <w:bottom w:val="none" w:sz="0" w:space="0" w:color="000000"/>
+                <w:top w:val="none" w:sz="0" w:space="0" w:color="000000"/>
+                <w:left w:val="none" w:sz="0" w:space="0" w:color="000000"/>
+                <w:right w:val="none" w:sz="0" w:space="0" w:color="000000"/>
+              </w:pBdr>
+              <w:spacing w:after="100" w:before="100" w:line="240"/>
+              <w:ind w:left="100" w:right="100" w:firstLine="0" w:firstLineChars="0"/>
+            </w:pPr>
+            <w:r xmlns:w="http://schemas.openxmlformats.org/wordprocessingml/2006/main" xmlns:wp="http://schemas.openxmlformats.org/drawingml/2006/wordprocessingDrawing" xmlns:r="http://schemas.openxmlformats.org/officeDocument/2006/relationships" xmlns:w14="http://schemas.microsoft.com/office/word/2010/wordml">
+              <w:rPr>
+                <w:rFonts w:ascii="Cambria" w:hAnsi="Cambria" w:eastAsia="Cambria" w:cs="Cambria"/>
+                <w:i w:val="false"/>
+                <w:b w:val="false"/>
+                <w:u w:val="none"/>
+                <w:sz w:val="18"/>
+                <w:szCs w:val="18"/>
+                <w:color w:val="000000"/>
+              </w:rPr>
+              <w:t xml:space="preserve"> </w:t>
+            </w:r>
+          </w:p>
+        </w:tc>
+      </w:tr>
+      <w:tr>
+        <w:trPr>
+          <w:cantSplit/>
+          <w:trHeight w:val="413" w:hRule="auto"/>
+        </w:trPr>
+        body3
+        <w:tc>
+          <w:tcPr>
+            <w:tcBorders>
+              <w:bottom w:val="none" w:sz="0" w:space="0" w:color="000000"/>
+              <w:top w:val="single" w:sz="8" w:space="0" w:color="000000"/>
+              <w:left w:val="none" w:sz="0" w:space="0" w:color="000000"/>
+              <w:right w:val="none" w:sz="0" w:space="0" w:color="000000"/>
+            </w:tcBorders>
+            <w:shd w:val="clear" w:color="auto" w:fill="FFFFFF"/>
+            <w:tcMar>
+              <w:top w:w="0" w:type="dxa"/>
+              <w:bottom w:w="0" w:type="dxa"/>
+              <w:left w:w="0" w:type="dxa"/>
+              <w:right w:w="0" w:type="dxa"/>
+            </w:tcMar>
+            <w:vAlign w:val="center"/>
+          </w:tcPr>
+          <w:p>
+            <w:pPr>
+              <w:pStyle w:val="Normal"/>
+              <w:jc w:val="left"/>
+              <w:pBdr>
+                <w:bottom w:val="none" w:sz="0" w:space="0" w:color="000000"/>
+                <w:top w:val="none" w:sz="0" w:space="0" w:color="000000"/>
+                <w:left w:val="none" w:sz="0" w:space="0" w:color="000000"/>
+                <w:right w:val="none" w:sz="0" w:space="0" w:color="000000"/>
+              </w:pBdr>
+              <w:spacing w:after="100" w:before="100" w:line="240"/>
+              <w:ind w:left="100" w:right="100" w:firstLine="0" w:firstLineChars="0"/>
+            </w:pPr>
+            <w:r xmlns:w="http://schemas.openxmlformats.org/wordprocessingml/2006/main" xmlns:wp="http://schemas.openxmlformats.org/drawingml/2006/wordprocessingDrawing" xmlns:r="http://schemas.openxmlformats.org/officeDocument/2006/relationships" xmlns:w14="http://schemas.microsoft.com/office/word/2010/wordml">
+              <w:rPr>
+                <w:rFonts w:ascii="Cambria" w:hAnsi="Cambria" w:eastAsia="Cambria" w:cs="Cambria"/>
+                <w:i w:val="false"/>
+                <w:b w:val="false"/>
+                <w:u w:val="none"/>
+                <w:sz w:val="18"/>
+                <w:szCs w:val="18"/>
+                <w:color w:val="000000"/>
+              </w:rPr>
+              <w:t xml:space="preserve">Total</w:t>
+            </w:r>
+          </w:p>
+        </w:tc>
+        <w:tc>
+          <w:tcPr>
+            <w:tcBorders>
+              <w:bottom w:val="none" w:sz="0" w:space="0" w:color="000000"/>
+              <w:top w:val="single" w:sz="8" w:space="0" w:color="000000"/>
+              <w:left w:val="none" w:sz="0" w:space="0" w:color="000000"/>
+              <w:right w:val="none" w:sz="0" w:space="0" w:color="000000"/>
+            </w:tcBorders>
+            <w:shd w:val="clear" w:color="auto" w:fill="FFFFFF"/>
+            <w:tcMar>
+              <w:top w:w="0" w:type="dxa"/>
+              <w:bottom w:w="0" w:type="dxa"/>
+              <w:left w:w="0" w:type="dxa"/>
+              <w:right w:w="0" w:type="dxa"/>
+            </w:tcMar>
+            <w:vAlign w:val="center"/>
+          </w:tcPr>
+          <w:p>
+            <w:pPr>
+              <w:pStyle w:val="Normal"/>
+              <w:jc w:val="right"/>
+              <w:pBdr>
+                <w:bottom w:val="none" w:sz="0" w:space="0" w:color="000000"/>
+                <w:top w:val="none" w:sz="0" w:space="0" w:color="000000"/>
+                <w:left w:val="none" w:sz="0" w:space="0" w:color="000000"/>
+                <w:right w:val="none" w:sz="0" w:space="0" w:color="000000"/>
+              </w:pBdr>
+              <w:spacing w:after="100" w:before="100" w:line="240"/>
+              <w:ind w:left="100" w:right="100" w:firstLine="0" w:firstLineChars="0"/>
+            </w:pPr>
+            <w:r xmlns:w="http://schemas.openxmlformats.org/wordprocessingml/2006/main" xmlns:wp="http://schemas.openxmlformats.org/drawingml/2006/wordprocessingDrawing" xmlns:r="http://schemas.openxmlformats.org/officeDocument/2006/relationships" xmlns:w14="http://schemas.microsoft.com/office/word/2010/wordml">
+              <w:rPr>
+                <w:rFonts w:ascii="Cambria" w:hAnsi="Cambria" w:eastAsia="Cambria" w:cs="Cambria"/>
+                <w:i w:val="false"/>
+                <w:b w:val="false"/>
+                <w:u w:val="none"/>
+                <w:sz w:val="18"/>
+                <w:szCs w:val="18"/>
+                <w:color w:val="000000"/>
+              </w:rPr>
+              <w:t xml:space="preserve">21</w:t>
+            </w:r>
+          </w:p>
+        </w:tc>
+        <w:tc>
+          <w:tcPr>
+            <w:tcBorders>
+              <w:bottom w:val="none" w:sz="0" w:space="0" w:color="000000"/>
+              <w:top w:val="single" w:sz="8" w:space="0" w:color="000000"/>
+              <w:left w:val="none" w:sz="0" w:space="0" w:color="000000"/>
+              <w:right w:val="none" w:sz="0" w:space="0" w:color="000000"/>
+            </w:tcBorders>
+            <w:shd w:val="clear" w:color="auto" w:fill="FFFFFF"/>
+            <w:tcMar>
+              <w:top w:w="0" w:type="dxa"/>
+              <w:bottom w:w="0" w:type="dxa"/>
+              <w:left w:w="0" w:type="dxa"/>
+              <w:right w:w="0" w:type="dxa"/>
+            </w:tcMar>
+            <w:vAlign w:val="center"/>
+          </w:tcPr>
+          <w:p>
+            <w:pPr>
+              <w:pStyle w:val="Normal"/>
+              <w:jc w:val="right"/>
+              <w:pBdr>
+                <w:bottom w:val="none" w:sz="0" w:space="0" w:color="000000"/>
+                <w:top w:val="none" w:sz="0" w:space="0" w:color="000000"/>
+                <w:left w:val="none" w:sz="0" w:space="0" w:color="000000"/>
+                <w:right w:val="none" w:sz="0" w:space="0" w:color="000000"/>
+              </w:pBdr>
+              <w:spacing w:after="100" w:before="100" w:line="240"/>
+              <w:ind w:left="100" w:right="100" w:firstLine="0" w:firstLineChars="0"/>
+            </w:pPr>
+            <w:r xmlns:w="http://schemas.openxmlformats.org/wordprocessingml/2006/main" xmlns:wp="http://schemas.openxmlformats.org/drawingml/2006/wordprocessingDrawing" xmlns:r="http://schemas.openxmlformats.org/officeDocument/2006/relationships" xmlns:w14="http://schemas.microsoft.com/office/word/2010/wordml">
+              <w:rPr>
+                <w:rFonts w:ascii="Cambria" w:hAnsi="Cambria" w:eastAsia="Cambria" w:cs="Cambria"/>
+                <w:i w:val="false"/>
+                <w:b w:val="false"/>
+                <w:u w:val="none"/>
+                <w:sz w:val="18"/>
+                <w:szCs w:val="18"/>
+                <w:color w:val="000000"/>
+              </w:rPr>
+              <w:t xml:space="preserve">62</w:t>
+            </w:r>
+          </w:p>
+        </w:tc>
+        <w:tc>
+          <w:tcPr>
+            <w:tcBorders>
+              <w:bottom w:val="none" w:sz="0" w:space="0" w:color="000000"/>
+              <w:top w:val="single" w:sz="8" w:space="0" w:color="000000"/>
+              <w:left w:val="none" w:sz="0" w:space="0" w:color="000000"/>
+              <w:right w:val="none" w:sz="0" w:space="0" w:color="000000"/>
+            </w:tcBorders>
+            <w:shd w:val="clear" w:color="auto" w:fill="FFFFFF"/>
+            <w:tcMar>
+              <w:top w:w="0" w:type="dxa"/>
+              <w:bottom w:w="0" w:type="dxa"/>
+              <w:left w:w="0" w:type="dxa"/>
+              <w:right w:w="0" w:type="dxa"/>
+            </w:tcMar>
+            <w:vAlign w:val="center"/>
+          </w:tcPr>
+          <w:p>
+            <w:pPr>
+              <w:pStyle w:val="Normal"/>
+              <w:jc w:val="right"/>
+              <w:pBdr>
+                <w:bottom w:val="none" w:sz="0" w:space="0" w:color="000000"/>
+                <w:top w:val="none" w:sz="0" w:space="0" w:color="000000"/>
+                <w:left w:val="none" w:sz="0" w:space="0" w:color="000000"/>
+                <w:right w:val="none" w:sz="0" w:space="0" w:color="000000"/>
+              </w:pBdr>
+              <w:spacing w:after="100" w:before="100" w:line="240"/>
+              <w:ind w:left="100" w:right="100" w:firstLine="0" w:firstLineChars="0"/>
+            </w:pPr>
+            <w:r xmlns:w="http://schemas.openxmlformats.org/wordprocessingml/2006/main" xmlns:wp="http://schemas.openxmlformats.org/drawingml/2006/wordprocessingDrawing" xmlns:r="http://schemas.openxmlformats.org/officeDocument/2006/relationships" xmlns:w14="http://schemas.microsoft.com/office/word/2010/wordml">
+              <w:rPr>
+                <w:rFonts w:ascii="Cambria" w:hAnsi="Cambria" w:eastAsia="Cambria" w:cs="Cambria"/>
+                <w:i w:val="false"/>
+                <w:b w:val="false"/>
+                <w:u w:val="none"/>
+                <w:sz w:val="18"/>
+                <w:szCs w:val="18"/>
+                <w:color w:val="000000"/>
+              </w:rPr>
+              <w:t xml:space="preserve">33</w:t>
+            </w:r>
+          </w:p>
+        </w:tc>
+        <w:tc>
+          <w:tcPr>
+            <w:tcBorders>
+              <w:bottom w:val="none" w:sz="0" w:space="0" w:color="000000"/>
+              <w:top w:val="single" w:sz="8" w:space="0" w:color="000000"/>
+              <w:left w:val="none" w:sz="0" w:space="0" w:color="000000"/>
+              <w:right w:val="none" w:sz="0" w:space="0" w:color="000000"/>
+            </w:tcBorders>
+            <w:shd w:val="clear" w:color="auto" w:fill="FFFFFF"/>
+            <w:tcMar>
+              <w:top w:w="0" w:type="dxa"/>
+              <w:bottom w:w="0" w:type="dxa"/>
+              <w:left w:w="0" w:type="dxa"/>
+              <w:right w:w="0" w:type="dxa"/>
+            </w:tcMar>
+            <w:vAlign w:val="center"/>
+          </w:tcPr>
+          <w:p>
+            <w:pPr>
+              <w:pStyle w:val="Normal"/>
+              <w:jc w:val="right"/>
+              <w:pBdr>
+                <w:bottom w:val="none" w:sz="0" w:space="0" w:color="000000"/>
+                <w:top w:val="none" w:sz="0" w:space="0" w:color="000000"/>
+                <w:left w:val="none" w:sz="0" w:space="0" w:color="000000"/>
+                <w:right w:val="none" w:sz="0" w:space="0" w:color="000000"/>
+              </w:pBdr>
+              <w:spacing w:after="100" w:before="100" w:line="240"/>
+              <w:ind w:left="100" w:right="100" w:firstLine="0" w:firstLineChars="0"/>
+            </w:pPr>
+            <w:r xmlns:w="http://schemas.openxmlformats.org/wordprocessingml/2006/main" xmlns:wp="http://schemas.openxmlformats.org/drawingml/2006/wordprocessingDrawing" xmlns:r="http://schemas.openxmlformats.org/officeDocument/2006/relationships" xmlns:w14="http://schemas.microsoft.com/office/word/2010/wordml">
+              <w:rPr>
+                <w:rFonts w:ascii="Cambria" w:hAnsi="Cambria" w:eastAsia="Cambria" w:cs="Cambria"/>
+                <w:i w:val="false"/>
+                <w:b w:val="false"/>
+                <w:u w:val="none"/>
+                <w:sz w:val="18"/>
+                <w:szCs w:val="18"/>
+                <w:color w:val="000000"/>
+              </w:rPr>
+              <w:t xml:space="preserve">11</w:t>
+            </w:r>
+          </w:p>
+        </w:tc>
+        <w:tc>
+          <w:tcPr>
+            <w:tcBorders>
+              <w:bottom w:val="none" w:sz="0" w:space="0" w:color="000000"/>
+              <w:top w:val="single" w:sz="8" w:space="0" w:color="000000"/>
+              <w:left w:val="none" w:sz="0" w:space="0" w:color="000000"/>
+              <w:right w:val="none" w:sz="0" w:space="0" w:color="000000"/>
+            </w:tcBorders>
+            <w:shd w:val="clear" w:color="auto" w:fill="FFFFFF"/>
+            <w:tcMar>
+              <w:top w:w="0" w:type="dxa"/>
+              <w:bottom w:w="0" w:type="dxa"/>
+              <w:left w:w="0" w:type="dxa"/>
+              <w:right w:w="0" w:type="dxa"/>
+            </w:tcMar>
+            <w:vAlign w:val="center"/>
+          </w:tcPr>
+          <w:p>
+            <w:pPr>
+              <w:pStyle w:val="Normal"/>
+              <w:jc w:val="right"/>
+              <w:pBdr>
+                <w:bottom w:val="none" w:sz="0" w:space="0" w:color="000000"/>
+                <w:top w:val="none" w:sz="0" w:space="0" w:color="000000"/>
+                <w:left w:val="none" w:sz="0" w:space="0" w:color="000000"/>
+                <w:right w:val="none" w:sz="0" w:space="0" w:color="000000"/>
+              </w:pBdr>
+              <w:spacing w:after="100" w:before="100" w:line="240"/>
+              <w:ind w:left="100" w:right="100" w:firstLine="0" w:firstLineChars="0"/>
+            </w:pPr>
+            <w:r xmlns:w="http://schemas.openxmlformats.org/wordprocessingml/2006/main" xmlns:wp="http://schemas.openxmlformats.org/drawingml/2006/wordprocessingDrawing" xmlns:r="http://schemas.openxmlformats.org/officeDocument/2006/relationships" xmlns:w14="http://schemas.microsoft.com/office/word/2010/wordml">
+              <w:rPr>
+                <w:rFonts w:ascii="Cambria" w:hAnsi="Cambria" w:eastAsia="Cambria" w:cs="Cambria"/>
+                <w:i w:val="false"/>
+                <w:b w:val="false"/>
+                <w:u w:val="none"/>
+                <w:sz w:val="18"/>
+                <w:szCs w:val="18"/>
+                <w:color w:val="000000"/>
+              </w:rPr>
+              <w:t xml:space="preserve">7</w:t>
+            </w:r>
+          </w:p>
+        </w:tc>
+        <w:tc>
+          <w:tcPr>
+            <w:tcBorders>
+              <w:bottom w:val="none" w:sz="0" w:space="0" w:color="000000"/>
+              <w:top w:val="single" w:sz="8" w:space="0" w:color="000000"/>
+              <w:left w:val="none" w:sz="0" w:space="0" w:color="000000"/>
+              <w:right w:val="none" w:sz="0" w:space="0" w:color="000000"/>
+            </w:tcBorders>
+            <w:shd w:val="clear" w:color="auto" w:fill="FFFFFF"/>
+            <w:tcMar>
+              <w:top w:w="0" w:type="dxa"/>
+              <w:bottom w:w="0" w:type="dxa"/>
+              <w:left w:w="0" w:type="dxa"/>
+              <w:right w:w="0" w:type="dxa"/>
+            </w:tcMar>
+            <w:vAlign w:val="center"/>
+          </w:tcPr>
+          <w:p>
+            <w:pPr>
+              <w:pStyle w:val="Normal"/>
+              <w:jc w:val="right"/>
+              <w:pBdr>
+                <w:bottom w:val="none" w:sz="0" w:space="0" w:color="000000"/>
+                <w:top w:val="none" w:sz="0" w:space="0" w:color="000000"/>
+                <w:left w:val="none" w:sz="0" w:space="0" w:color="000000"/>
+                <w:right w:val="none" w:sz="0" w:space="0" w:color="000000"/>
+              </w:pBdr>
+              <w:spacing w:after="100" w:before="100" w:line="240"/>
+              <w:ind w:left="100" w:right="100" w:firstLine="0" w:firstLineChars="0"/>
+            </w:pPr>
+            <w:r xmlns:w="http://schemas.openxmlformats.org/wordprocessingml/2006/main" xmlns:wp="http://schemas.openxmlformats.org/drawingml/2006/wordprocessingDrawing" xmlns:r="http://schemas.openxmlformats.org/officeDocument/2006/relationships" xmlns:w14="http://schemas.microsoft.com/office/word/2010/wordml">
+              <w:rPr>
+                <w:rFonts w:ascii="Cambria" w:hAnsi="Cambria" w:eastAsia="Cambria" w:cs="Cambria"/>
+                <w:i w:val="false"/>
+                <w:b w:val="false"/>
+                <w:u w:val="none"/>
+                <w:sz w:val="18"/>
+                <w:szCs w:val="18"/>
+                <w:color w:val="000000"/>
+              </w:rPr>
+              <w:t xml:space="preserve">9</w:t>
+            </w:r>
+          </w:p>
+        </w:tc>
+        <w:tc>
+          <w:tcPr>
+            <w:tcBorders>
+              <w:bottom w:val="none" w:sz="0" w:space="0" w:color="000000"/>
+              <w:top w:val="single" w:sz="8" w:space="0" w:color="000000"/>
+              <w:left w:val="none" w:sz="0" w:space="0" w:color="000000"/>
+              <w:right w:val="none" w:sz="0" w:space="0" w:color="000000"/>
+            </w:tcBorders>
+            <w:shd w:val="clear" w:color="auto" w:fill="FFFFFF"/>
+            <w:tcMar>
+              <w:top w:w="0" w:type="dxa"/>
+              <w:bottom w:w="0" w:type="dxa"/>
+              <w:left w:w="0" w:type="dxa"/>
+              <w:right w:w="0" w:type="dxa"/>
+            </w:tcMar>
+            <w:vAlign w:val="center"/>
+          </w:tcPr>
+          <w:p>
+            <w:pPr>
+              <w:pStyle w:val="Normal"/>
+              <w:jc w:val="right"/>
+              <w:pBdr>
+                <w:bottom w:val="none" w:sz="0" w:space="0" w:color="000000"/>
+                <w:top w:val="none" w:sz="0" w:space="0" w:color="000000"/>
+                <w:left w:val="none" w:sz="0" w:space="0" w:color="000000"/>
+                <w:right w:val="none" w:sz="0" w:space="0" w:color="000000"/>
+              </w:pBdr>
+              <w:spacing w:after="100" w:before="100" w:line="240"/>
+              <w:ind w:left="100" w:right="100" w:firstLine="0" w:firstLineChars="0"/>
+            </w:pPr>
+            <w:r xmlns:w="http://schemas.openxmlformats.org/wordprocessingml/2006/main" xmlns:wp="http://schemas.openxmlformats.org/drawingml/2006/wordprocessingDrawing" xmlns:r="http://schemas.openxmlformats.org/officeDocument/2006/relationships" xmlns:w14="http://schemas.microsoft.com/office/word/2010/wordml">
+              <w:rPr>
+                <w:rFonts w:ascii="Cambria" w:hAnsi="Cambria" w:eastAsia="Cambria" w:cs="Cambria"/>
+                <w:i w:val="false"/>
+                <w:b w:val="false"/>
+                <w:u w:val="none"/>
+                <w:sz w:val="18"/>
+                <w:szCs w:val="18"/>
+                <w:color w:val="000000"/>
+              </w:rPr>
+              <w:t xml:space="preserve">12</w:t>
+            </w:r>
+          </w:p>
+        </w:tc>
+        <w:tc>
+          <w:tcPr>
+            <w:tcBorders>
+              <w:bottom w:val="none" w:sz="0" w:space="0" w:color="000000"/>
+              <w:top w:val="single" w:sz="8" w:space="0" w:color="000000"/>
+              <w:left w:val="none" w:sz="0" w:space="0" w:color="000000"/>
+              <w:right w:val="none" w:sz="0" w:space="0" w:color="000000"/>
+            </w:tcBorders>
+            <w:shd w:val="clear" w:color="auto" w:fill="FFFFFF"/>
+            <w:tcMar>
+              <w:top w:w="0" w:type="dxa"/>
+              <w:bottom w:w="0" w:type="dxa"/>
+              <w:left w:w="0" w:type="dxa"/>
+              <w:right w:w="0" w:type="dxa"/>
+            </w:tcMar>
+            <w:vAlign w:val="center"/>
+          </w:tcPr>
+          <w:p>
+            <w:pPr>
+              <w:pStyle w:val="Normal"/>
+              <w:jc w:val="right"/>
+              <w:pBdr>
+                <w:bottom w:val="none" w:sz="0" w:space="0" w:color="000000"/>
+                <w:top w:val="none" w:sz="0" w:space="0" w:color="000000"/>
+                <w:left w:val="none" w:sz="0" w:space="0" w:color="000000"/>
+                <w:right w:val="none" w:sz="0" w:space="0" w:color="000000"/>
+              </w:pBdr>
+              <w:spacing w:after="100" w:before="100" w:line="240"/>
+              <w:ind w:left="100" w:right="100" w:firstLine="0" w:firstLineChars="0"/>
+            </w:pPr>
+            <w:r xmlns:w="http://schemas.openxmlformats.org/wordprocessingml/2006/main" xmlns:wp="http://schemas.openxmlformats.org/drawingml/2006/wordprocessingDrawing" xmlns:r="http://schemas.openxmlformats.org/officeDocument/2006/relationships" xmlns:w14="http://schemas.microsoft.com/office/word/2010/wordml">
+              <w:rPr>
+                <w:rFonts w:ascii="Cambria" w:hAnsi="Cambria" w:eastAsia="Cambria" w:cs="Cambria"/>
+                <w:i w:val="false"/>
+                <w:b w:val="false"/>
+                <w:u w:val="none"/>
+                <w:sz w:val="18"/>
+                <w:szCs w:val="18"/>
+                <w:color w:val="000000"/>
+              </w:rPr>
+              <w:t xml:space="preserve">10</w:t>
+            </w:r>
+          </w:p>
+        </w:tc>
+        <w:tc>
+          <w:tcPr>
+            <w:tcBorders>
+              <w:bottom w:val="none" w:sz="0" w:space="0" w:color="000000"/>
+              <w:top w:val="single" w:sz="8" w:space="0" w:color="000000"/>
+              <w:left w:val="none" w:sz="0" w:space="0" w:color="000000"/>
+              <w:right w:val="none" w:sz="0" w:space="0" w:color="000000"/>
+            </w:tcBorders>
+            <w:shd w:val="clear" w:color="auto" w:fill="FFFFFF"/>
+            <w:tcMar>
+              <w:top w:w="0" w:type="dxa"/>
+              <w:bottom w:w="0" w:type="dxa"/>
+              <w:left w:w="0" w:type="dxa"/>
+              <w:right w:w="0" w:type="dxa"/>
+            </w:tcMar>
+            <w:vAlign w:val="center"/>
+          </w:tcPr>
+          <w:p>
+            <w:pPr>
+              <w:pStyle w:val="Normal"/>
+              <w:jc w:val="right"/>
+              <w:pBdr>
+                <w:bottom w:val="none" w:sz="0" w:space="0" w:color="000000"/>
+                <w:top w:val="none" w:sz="0" w:space="0" w:color="000000"/>
+                <w:left w:val="none" w:sz="0" w:space="0" w:color="000000"/>
+                <w:right w:val="none" w:sz="0" w:space="0" w:color="000000"/>
+              </w:pBdr>
+              <w:spacing w:after="100" w:before="100" w:line="240"/>
+              <w:ind w:left="100" w:right="100" w:firstLine="0" w:firstLineChars="0"/>
+            </w:pPr>
+            <w:r xmlns:w="http://schemas.openxmlformats.org/wordprocessingml/2006/main" xmlns:wp="http://schemas.openxmlformats.org/drawingml/2006/wordprocessingDrawing" xmlns:r="http://schemas.openxmlformats.org/officeDocument/2006/relationships" xmlns:w14="http://schemas.microsoft.com/office/word/2010/wordml">
+              <w:rPr>
+                <w:rFonts w:ascii="Cambria" w:hAnsi="Cambria" w:eastAsia="Cambria" w:cs="Cambria"/>
+                <w:i w:val="false"/>
+                <w:b w:val="false"/>
+                <w:u w:val="none"/>
+                <w:sz w:val="18"/>
+                <w:szCs w:val="18"/>
+                <w:color w:val="000000"/>
+              </w:rPr>
+              <w:t xml:space="preserve">23</w:t>
+            </w:r>
+          </w:p>
+        </w:tc>
+        <w:tc>
+          <w:tcPr>
+            <w:tcBorders>
+              <w:bottom w:val="none" w:sz="0" w:space="0" w:color="000000"/>
+              <w:top w:val="single" w:sz="8" w:space="0" w:color="000000"/>
+              <w:left w:val="none" w:sz="0" w:space="0" w:color="000000"/>
+              <w:right w:val="none" w:sz="0" w:space="0" w:color="000000"/>
+            </w:tcBorders>
+            <w:shd w:val="clear" w:color="auto" w:fill="FFFFFF"/>
+            <w:tcMar>
+              <w:top w:w="0" w:type="dxa"/>
+              <w:bottom w:w="0" w:type="dxa"/>
+              <w:left w:w="0" w:type="dxa"/>
+              <w:right w:w="0" w:type="dxa"/>
+            </w:tcMar>
+            <w:vAlign w:val="center"/>
+          </w:tcPr>
+          <w:p>
+            <w:pPr>
+              <w:pStyle w:val="Normal"/>
+              <w:jc w:val="right"/>
+              <w:pBdr>
+                <w:bottom w:val="none" w:sz="0" w:space="0" w:color="000000"/>
+                <w:top w:val="none" w:sz="0" w:space="0" w:color="000000"/>
+                <w:left w:val="none" w:sz="0" w:space="0" w:color="000000"/>
+                <w:right w:val="none" w:sz="0" w:space="0" w:color="000000"/>
+              </w:pBdr>
+              <w:spacing w:after="100" w:before="100" w:line="240"/>
+              <w:ind w:left="100" w:right="100" w:firstLine="0" w:firstLineChars="0"/>
+            </w:pPr>
+            <w:r xmlns:w="http://schemas.openxmlformats.org/wordprocessingml/2006/main" xmlns:wp="http://schemas.openxmlformats.org/drawingml/2006/wordprocessingDrawing" xmlns:r="http://schemas.openxmlformats.org/officeDocument/2006/relationships" xmlns:w14="http://schemas.microsoft.com/office/word/2010/wordml">
+              <w:rPr>
+                <w:rFonts w:ascii="Cambria" w:hAnsi="Cambria" w:eastAsia="Cambria" w:cs="Cambria"/>
+                <w:i w:val="false"/>
+                <w:b w:val="false"/>
+                <w:u w:val="none"/>
+                <w:sz w:val="18"/>
+                <w:szCs w:val="18"/>
+                <w:color w:val="000000"/>
+              </w:rPr>
+              <w:t xml:space="preserve"> </w:t>
+            </w:r>
+          </w:p>
+        </w:tc>
+      </w:tr>
+    </w:tbl>
+    <w:bookmarkStart w:id="33" w:name="norsk-øremerket-bistand-i-2022"/>
+    <w:p>
+      <w:pPr>
+        <w:pStyle w:val="Heading2"/>
+      </w:pPr>
+      <w:r>
+        <w:rPr>
+          <w:rStyle w:val="SectionNumber"/>
+        </w:rPr>
+        <w:t xml:space="preserve">2.1</w:t>
+      </w:r>
+      <w:r>
+        <w:tab/>
+      </w:r>
+      <w:r>
+        <w:t xml:space="preserve">Norsk øremerket bistand i 2022</w:t>
+      </w:r>
+    </w:p>
+    <w:p>
+      <w:pPr>
+        <w:pStyle w:val="FirstParagraph"/>
+      </w:pPr>
+      <w:r>
+        <w:t xml:space="preserve">I 2022 var den øremerkede bistanden til Mexico rettet mot Styresett, sivilt samfunn og konfliktforebygging (3 mill).</w:t>
       </w:r>
     </w:p>
     <w:p>
@@ -157,7 +2221,7 @@
               <a:graphicData uri="http://schemas.openxmlformats.org/drawingml/2006/picture">
                 <pic:pic>
                   <pic:nvPicPr>
-                    <pic:cNvPr descr="landflak_files/figure-docx/total_bistand_print-1.png" id="29" name="Picture"/>
+                    <pic:cNvPr descr="landflak_files/figure-docx/tema_plot_print-1.png" id="29" name="Picture"/>
                     <pic:cNvPicPr>
                       <a:picLocks noChangeArrowheads="1" noChangeAspect="1"/>
                     </pic:cNvPicPr>
@@ -190,30 +2254,12 @@
         </w:drawing>
       </w:r>
     </w:p>
-    <w:bookmarkStart w:id="36" w:name="norsk-øremerket-bistand-i-2022"/>
     <w:p>
       <w:pPr>
-        <w:pStyle w:val="Heading2"/>
-      </w:pPr>
-      <w:r>
-        <w:rPr>
-          <w:rStyle w:val="SectionNumber"/>
-        </w:rPr>
-        <w:t xml:space="preserve">2.1</w:t>
-      </w:r>
-      <w:r>
-        <w:tab/>
-      </w:r>
-      <w:r>
-        <w:t xml:space="preserve">Norsk øremerket bistand i 2022</w:t>
-      </w:r>
-    </w:p>
-    <w:p>
-      <w:pPr>
-        <w:pStyle w:val="FirstParagraph"/>
-      </w:pPr>
-      <w:r>
-        <w:t xml:space="preserve">I 2022 var mest av den øremerkede bistanden til Tanzania rettet mot Helse og sosiale tjenester (132 mill), Miljø og energi (104 mill) og Styresett, sivilt samfunn og konfliktforebygging ( 66 mill).</w:t>
+        <w:pStyle w:val="BodyText"/>
+      </w:pPr>
+      <w:r>
+        <w:t xml:space="preserve">I 2022 ble den øremerkede bistanden til Mexico gitt gjennom Andre ikke-statlige organisasjoner (2 mill) og Multilaterale organisasjoner (1 mill).</w:t>
       </w:r>
     </w:p>
     <w:p>
@@ -230,7 +2276,7 @@
               <a:graphicData uri="http://schemas.openxmlformats.org/drawingml/2006/picture">
                 <pic:pic>
                   <pic:nvPicPr>
-                    <pic:cNvPr descr="landflak_files/figure-docx/tema_plot_print-1.png" id="32" name="Picture"/>
+                    <pic:cNvPr descr="landflak_files/figure-docx/partnertype_plot_print-1.png" id="32" name="Picture"/>
                     <pic:cNvPicPr>
                       <a:picLocks noChangeArrowheads="1" noChangeAspect="1"/>
                     </pic:cNvPicPr>
@@ -268,62 +2314,7 @@
         <w:pStyle w:val="BodyText"/>
       </w:pPr>
       <w:r>
-        <w:t xml:space="preserve">I 2022 ble mest av den øremerkede bistanden til Tanzania gitt gjennom Offentlig sektor i mottakerland (182 mill), Norske ikke-statlige organisasjoner (117 mill) og Andre ikke-statlige organisasjoner ( 53 mill).</w:t>
-      </w:r>
-    </w:p>
-    <w:p>
-      <w:pPr>
-        <w:pStyle w:val="BodyText"/>
-      </w:pPr>
-      <w:r>
-        <w:drawing>
-          <wp:inline>
-            <wp:extent cx="3682147" cy="2025181"/>
-            <wp:effectExtent b="0" l="0" r="0" t="0"/>
-            <wp:docPr descr="" title="" id="34" name="Picture"/>
-            <a:graphic>
-              <a:graphicData uri="http://schemas.openxmlformats.org/drawingml/2006/picture">
-                <pic:pic>
-                  <pic:nvPicPr>
-                    <pic:cNvPr descr="landflak_files/figure-docx/partnertype_plot_print-1.png" id="35" name="Picture"/>
-                    <pic:cNvPicPr>
-                      <a:picLocks noChangeArrowheads="1" noChangeAspect="1"/>
-                    </pic:cNvPicPr>
-                  </pic:nvPicPr>
-                  <pic:blipFill>
-                    <a:blip r:embed="rId33"/>
-                    <a:stretch>
-                      <a:fillRect/>
-                    </a:stretch>
-                  </pic:blipFill>
-                  <pic:spPr bwMode="auto">
-                    <a:xfrm>
-                      <a:off x="0" y="0"/>
-                      <a:ext cx="3682147" cy="2025181"/>
-                    </a:xfrm>
-                    <a:prstGeom prst="rect">
-                      <a:avLst/>
-                    </a:prstGeom>
-                    <a:noFill/>
-                    <a:ln w="9525">
-                      <a:noFill/>
-                      <a:headEnd/>
-                      <a:tailEnd/>
-                    </a:ln>
-                  </pic:spPr>
-                </pic:pic>
-              </a:graphicData>
-            </a:graphic>
-          </wp:inline>
-        </w:drawing>
-      </w:r>
-    </w:p>
-    <w:p>
-      <w:pPr>
-        <w:pStyle w:val="BodyText"/>
-      </w:pPr>
-      <w:r>
-        <w:t xml:space="preserve">De tre største partnerne for den øremerkede bistanden til Tanzania i 2022 var Tanzania Ministry of Finance (178 mill), MPTF Office - Multi-Partner Trust Fund Office (40 mill) og Kirkens Nødhjelp (37 mill).</w:t>
+        <w:t xml:space="preserve">De tre største partnerne for den øremerkede bistanden til Mexico i 2022 var UNFPA - UN Population Fund (1 mill), Aluna Acompanamiento Psicosocial, A.C. (0,5 mill) og Centro de Investigacion y Capacitacion Propuesta Civica A.C. (0,5 mill).</w:t>
       </w:r>
     </w:p>
     <w:tbl xmlns:w="http://schemas.openxmlformats.org/wordprocessingml/2006/main" xmlns:r="http://schemas.openxmlformats.org/officeDocument/2006/relationships" xmlns:w14="http://schemas.microsoft.com/office/word/2010/wordml" xmlns:wp="http://schemas.openxmlformats.org/drawingml/2006/wordprocessingDrawing" xmlns:a="http://schemas.openxmlformats.org/drawingml/2006/main" xmlns:pic="http://schemas.openxmlformats.org/drawingml/2006/picture">
@@ -333,7 +2324,7 @@
         <w:tblLook w:firstRow="1" w:lastRow="0" w:firstColumn="0" w:lastColumn="0" w:noHBand="0" w:noVBand="1"/>
       </w:tblPr>
       <w:tblGrid>
-        <w:gridCol w:w="7187"/>
+        <w:gridCol w:w="6295"/>
         <w:gridCol w:w="1134"/>
       </w:tblGrid>
       <w:tr>
@@ -341,7 +2332,7 @@
           <w:trHeight w:val="360" w:hRule="exact"/>
           <w:tblHeader/>
         </w:trPr>
-        header 1
+        header1
         <w:tc>
           <w:tcPr>
             <w:gridSpan w:val="2"/>
@@ -383,7 +2374,7 @@
                 <w:szCs w:val="22"/>
                 <w:color w:val="000000"/>
               </w:rPr>
-              <w:t xml:space="preserve">Avtalepartnere, øremerket bistand til Tanzania i 2022</w:t>
+              <w:t xml:space="preserve">Avtalepartnere, øremerket bistand til Mexico i 2022</w:t>
             </w:r>
           </w:p>
         </w:tc>
@@ -393,7 +2384,7 @@
           <w:trHeight w:val="360" w:hRule="exact"/>
           <w:tblHeader/>
         </w:trPr>
-        header 2
+        header2
         <w:tc>
           <w:tcPr>
             <w:tcBorders>
@@ -487,7 +2478,7 @@
         <w:trPr>
           <w:trHeight w:val="360" w:hRule="exact"/>
         </w:trPr>
-        body 1
+        body1
         <w:tc>
           <w:tcPr>
             <w:tcBorders>
@@ -528,7 +2519,7 @@
                 <w:szCs w:val="18"/>
                 <w:color w:val="000000"/>
               </w:rPr>
-              <w:t xml:space="preserve">Tanzania Ministry of Finance</w:t>
+              <w:t xml:space="preserve">UNFPA - UN Population Fund</w:t>
             </w:r>
           </w:p>
         </w:tc>
@@ -572,7 +2563,7 @@
                 <w:szCs w:val="18"/>
                 <w:color w:val="000000"/>
               </w:rPr>
-              <w:t xml:space="preserve">178</w:t>
+              <w:t xml:space="preserve">1</w:t>
             </w:r>
           </w:p>
         </w:tc>
@@ -581,7 +2572,7 @@
         <w:trPr>
           <w:trHeight w:val="360" w:hRule="exact"/>
         </w:trPr>
-        body 2
+        body2
         <w:tc>
           <w:tcPr>
             <w:tcBorders>
@@ -622,7 +2613,7 @@
                 <w:szCs w:val="18"/>
                 <w:color w:val="000000"/>
               </w:rPr>
-              <w:t xml:space="preserve">MPTF Office - Multi-Partner Trust Fund Office</w:t>
+              <w:t xml:space="preserve">Aluna Acompanamiento Psicosocial, A.C.</w:t>
             </w:r>
           </w:p>
         </w:tc>
@@ -666,7 +2657,7 @@
                 <w:szCs w:val="18"/>
                 <w:color w:val="000000"/>
               </w:rPr>
-              <w:t xml:space="preserve">40</w:t>
+              <w:t xml:space="preserve">0,5</w:t>
             </w:r>
           </w:p>
         </w:tc>
@@ -675,7 +2666,7 @@
         <w:trPr>
           <w:trHeight w:val="360" w:hRule="exact"/>
         </w:trPr>
-        body 3
+        body3
         <w:tc>
           <w:tcPr>
             <w:tcBorders>
@@ -716,7 +2707,7 @@
                 <w:szCs w:val="18"/>
                 <w:color w:val="000000"/>
               </w:rPr>
-              <w:t xml:space="preserve">Kirkens Nødhjelp</w:t>
+              <w:t xml:space="preserve">Centro de Investigacion y Capacitacion Propuesta Civica A.C.</w:t>
             </w:r>
           </w:p>
         </w:tc>
@@ -760,7 +2751,7 @@
                 <w:szCs w:val="18"/>
                 <w:color w:val="000000"/>
               </w:rPr>
-              <w:t xml:space="preserve">37</w:t>
+              <w:t xml:space="preserve">0,5</w:t>
             </w:r>
           </w:p>
         </w:tc>
@@ -769,7 +2760,7 @@
         <w:trPr>
           <w:trHeight w:val="360" w:hRule="exact"/>
         </w:trPr>
-        body 4
+        body4
         <w:tc>
           <w:tcPr>
             <w:tcBorders>
@@ -810,7 +2801,7 @@
                 <w:szCs w:val="18"/>
                 <w:color w:val="000000"/>
               </w:rPr>
-              <w:t xml:space="preserve">SAGCOT - Southern Agricultural Growth Corridor of Tanzania</w:t>
+              <w:t xml:space="preserve">Iniciativa Sinaloa, A.C.</w:t>
             </w:r>
           </w:p>
         </w:tc>
@@ -854,7 +2845,7 @@
                 <w:szCs w:val="18"/>
                 <w:color w:val="000000"/>
               </w:rPr>
-              <w:t xml:space="preserve">15</w:t>
+              <w:t xml:space="preserve">0,5</w:t>
             </w:r>
           </w:p>
         </w:tc>
@@ -863,11 +2854,11 @@
         <w:trPr>
           <w:trHeight w:val="360" w:hRule="exact"/>
         </w:trPr>
-        body 5
-        <w:tc>
-          <w:tcPr>
-            <w:tcBorders>
-              <w:bottom w:val="none" w:sz="0" w:space="0" w:color="000000"/>
+        body5
+        <w:tc>
+          <w:tcPr>
+            <w:tcBorders>
+              <w:bottom w:val="single" w:sz="8" w:space="0" w:color="000000"/>
               <w:top w:val="none" w:sz="0" w:space="0" w:color="000000"/>
               <w:left w:val="none" w:sz="0" w:space="0" w:color="000000"/>
               <w:right w:val="none" w:sz="0" w:space="0" w:color="000000"/>
@@ -904,14 +2895,14 @@
                 <w:szCs w:val="18"/>
                 <w:color w:val="000000"/>
               </w:rPr>
-              <w:t xml:space="preserve">Det Kgl. Selskap for Norges Vel</w:t>
-            </w:r>
-          </w:p>
-        </w:tc>
-        <w:tc>
-          <w:tcPr>
-            <w:tcBorders>
-              <w:bottom w:val="none" w:sz="0" w:space="0" w:color="000000"/>
+              <w:t xml:space="preserve">Serapaz - Servicios y Asesoria para la Paz A. C.</w:t>
+            </w:r>
+          </w:p>
+        </w:tc>
+        <w:tc>
+          <w:tcPr>
+            <w:tcBorders>
+              <w:bottom w:val="single" w:sz="8" w:space="0" w:color="000000"/>
               <w:top w:val="none" w:sz="0" w:space="0" w:color="000000"/>
               <w:left w:val="none" w:sz="0" w:space="0" w:color="000000"/>
               <w:right w:val="none" w:sz="0" w:space="0" w:color="000000"/>
@@ -948,7 +2939,7 @@
                 <w:szCs w:val="18"/>
                 <w:color w:val="000000"/>
               </w:rPr>
-              <w:t xml:space="preserve">15</w:t>
+              <w:t xml:space="preserve">0,5</w:t>
             </w:r>
           </w:p>
         </w:tc>
@@ -957,571 +2948,7 @@
         <w:trPr>
           <w:trHeight w:val="360" w:hRule="exact"/>
         </w:trPr>
-        body 6
-        <w:tc>
-          <w:tcPr>
-            <w:tcBorders>
-              <w:bottom w:val="none" w:sz="0" w:space="0" w:color="000000"/>
-              <w:top w:val="none" w:sz="0" w:space="0" w:color="000000"/>
-              <w:left w:val="none" w:sz="0" w:space="0" w:color="000000"/>
-              <w:right w:val="none" w:sz="0" w:space="0" w:color="000000"/>
-            </w:tcBorders>
-            <w:shd w:val="clear" w:color="auto" w:fill="FFFFFF"/>
-            <w:tcMar>
-              <w:top w:w="0" w:type="dxa"/>
-              <w:bottom w:w="0" w:type="dxa"/>
-              <w:left w:w="0" w:type="dxa"/>
-              <w:right w:w="0" w:type="dxa"/>
-            </w:tcMar>
-            <w:vAlign w:val="center"/>
-          </w:tcPr>
-          <w:p>
-            <w:pPr>
-              <w:pStyle w:val="Normal"/>
-              <w:jc w:val="left"/>
-              <w:pBdr>
-                <w:bottom w:val="none" w:sz="0" w:space="0" w:color="000000"/>
-                <w:top w:val="none" w:sz="0" w:space="0" w:color="000000"/>
-                <w:left w:val="none" w:sz="0" w:space="0" w:color="000000"/>
-                <w:right w:val="none" w:sz="0" w:space="0" w:color="000000"/>
-              </w:pBdr>
-              <w:spacing w:after="100" w:before="100" w:line="240"/>
-              <w:ind w:left="100" w:right="100" w:firstLine="0" w:firstLineChars="0"/>
-            </w:pPr>
-            <w:r xmlns:w="http://schemas.openxmlformats.org/wordprocessingml/2006/main" xmlns:wp="http://schemas.openxmlformats.org/drawingml/2006/wordprocessingDrawing" xmlns:r="http://schemas.openxmlformats.org/officeDocument/2006/relationships" xmlns:w14="http://schemas.microsoft.com/office/word/2010/wordml">
-              <w:rPr>
-                <w:rFonts w:ascii="Cambria" w:hAnsi="Cambria" w:eastAsia="Cambria" w:cs="Cambria"/>
-                <w:i w:val="false"/>
-                <w:b w:val="false"/>
-                <w:u w:val="none"/>
-                <w:sz w:val="18"/>
-                <w:szCs w:val="18"/>
-                <w:color w:val="000000"/>
-              </w:rPr>
-              <w:t xml:space="preserve">Atlas-alliansen</w:t>
-            </w:r>
-          </w:p>
-        </w:tc>
-        <w:tc>
-          <w:tcPr>
-            <w:tcBorders>
-              <w:bottom w:val="none" w:sz="0" w:space="0" w:color="000000"/>
-              <w:top w:val="none" w:sz="0" w:space="0" w:color="000000"/>
-              <w:left w:val="none" w:sz="0" w:space="0" w:color="000000"/>
-              <w:right w:val="none" w:sz="0" w:space="0" w:color="000000"/>
-            </w:tcBorders>
-            <w:shd w:val="clear" w:color="auto" w:fill="FFFFFF"/>
-            <w:tcMar>
-              <w:top w:w="0" w:type="dxa"/>
-              <w:bottom w:w="0" w:type="dxa"/>
-              <w:left w:w="0" w:type="dxa"/>
-              <w:right w:w="0" w:type="dxa"/>
-            </w:tcMar>
-            <w:vAlign w:val="center"/>
-          </w:tcPr>
-          <w:p>
-            <w:pPr>
-              <w:pStyle w:val="Normal"/>
-              <w:jc w:val="right"/>
-              <w:pBdr>
-                <w:bottom w:val="none" w:sz="0" w:space="0" w:color="000000"/>
-                <w:top w:val="none" w:sz="0" w:space="0" w:color="000000"/>
-                <w:left w:val="none" w:sz="0" w:space="0" w:color="000000"/>
-                <w:right w:val="none" w:sz="0" w:space="0" w:color="000000"/>
-              </w:pBdr>
-              <w:spacing w:after="100" w:before="100" w:line="240"/>
-              <w:ind w:left="100" w:right="100" w:firstLine="0" w:firstLineChars="0"/>
-            </w:pPr>
-            <w:r xmlns:w="http://schemas.openxmlformats.org/wordprocessingml/2006/main" xmlns:wp="http://schemas.openxmlformats.org/drawingml/2006/wordprocessingDrawing" xmlns:r="http://schemas.openxmlformats.org/officeDocument/2006/relationships" xmlns:w14="http://schemas.microsoft.com/office/word/2010/wordml">
-              <w:rPr>
-                <w:rFonts w:ascii="Cambria" w:hAnsi="Cambria" w:eastAsia="Cambria" w:cs="Cambria"/>
-                <w:i w:val="false"/>
-                <w:b w:val="false"/>
-                <w:u w:val="none"/>
-                <w:sz w:val="18"/>
-                <w:szCs w:val="18"/>
-                <w:color w:val="000000"/>
-              </w:rPr>
-              <w:t xml:space="preserve">12</w:t>
-            </w:r>
-          </w:p>
-        </w:tc>
-      </w:tr>
-      <w:tr>
-        <w:trPr>
-          <w:trHeight w:val="360" w:hRule="exact"/>
-        </w:trPr>
-        body 7
-        <w:tc>
-          <w:tcPr>
-            <w:tcBorders>
-              <w:bottom w:val="none" w:sz="0" w:space="0" w:color="000000"/>
-              <w:top w:val="none" w:sz="0" w:space="0" w:color="000000"/>
-              <w:left w:val="none" w:sz="0" w:space="0" w:color="000000"/>
-              <w:right w:val="none" w:sz="0" w:space="0" w:color="000000"/>
-            </w:tcBorders>
-            <w:shd w:val="clear" w:color="auto" w:fill="B4EAC9"/>
-            <w:tcMar>
-              <w:top w:w="0" w:type="dxa"/>
-              <w:bottom w:w="0" w:type="dxa"/>
-              <w:left w:w="0" w:type="dxa"/>
-              <w:right w:w="0" w:type="dxa"/>
-            </w:tcMar>
-            <w:vAlign w:val="center"/>
-          </w:tcPr>
-          <w:p>
-            <w:pPr>
-              <w:pStyle w:val="Normal"/>
-              <w:jc w:val="left"/>
-              <w:pBdr>
-                <w:bottom w:val="none" w:sz="0" w:space="0" w:color="000000"/>
-                <w:top w:val="none" w:sz="0" w:space="0" w:color="000000"/>
-                <w:left w:val="none" w:sz="0" w:space="0" w:color="000000"/>
-                <w:right w:val="none" w:sz="0" w:space="0" w:color="000000"/>
-              </w:pBdr>
-              <w:spacing w:after="100" w:before="100" w:line="240"/>
-              <w:ind w:left="100" w:right="100" w:firstLine="0" w:firstLineChars="0"/>
-            </w:pPr>
-            <w:r xmlns:w="http://schemas.openxmlformats.org/wordprocessingml/2006/main" xmlns:wp="http://schemas.openxmlformats.org/drawingml/2006/wordprocessingDrawing" xmlns:r="http://schemas.openxmlformats.org/officeDocument/2006/relationships" xmlns:w14="http://schemas.microsoft.com/office/word/2010/wordml">
-              <w:rPr>
-                <w:rFonts w:ascii="Cambria" w:hAnsi="Cambria" w:eastAsia="Cambria" w:cs="Cambria"/>
-                <w:i w:val="false"/>
-                <w:b w:val="false"/>
-                <w:u w:val="none"/>
-                <w:sz w:val="18"/>
-                <w:szCs w:val="18"/>
-                <w:color w:val="000000"/>
-              </w:rPr>
-              <w:t xml:space="preserve">EAMCEF - The Eastern Arc Mountains Conservation Endowment Fund</w:t>
-            </w:r>
-          </w:p>
-        </w:tc>
-        <w:tc>
-          <w:tcPr>
-            <w:tcBorders>
-              <w:bottom w:val="none" w:sz="0" w:space="0" w:color="000000"/>
-              <w:top w:val="none" w:sz="0" w:space="0" w:color="000000"/>
-              <w:left w:val="none" w:sz="0" w:space="0" w:color="000000"/>
-              <w:right w:val="none" w:sz="0" w:space="0" w:color="000000"/>
-            </w:tcBorders>
-            <w:shd w:val="clear" w:color="auto" w:fill="B4EAC9"/>
-            <w:tcMar>
-              <w:top w:w="0" w:type="dxa"/>
-              <w:bottom w:w="0" w:type="dxa"/>
-              <w:left w:w="0" w:type="dxa"/>
-              <w:right w:w="0" w:type="dxa"/>
-            </w:tcMar>
-            <w:vAlign w:val="center"/>
-          </w:tcPr>
-          <w:p>
-            <w:pPr>
-              <w:pStyle w:val="Normal"/>
-              <w:jc w:val="right"/>
-              <w:pBdr>
-                <w:bottom w:val="none" w:sz="0" w:space="0" w:color="000000"/>
-                <w:top w:val="none" w:sz="0" w:space="0" w:color="000000"/>
-                <w:left w:val="none" w:sz="0" w:space="0" w:color="000000"/>
-                <w:right w:val="none" w:sz="0" w:space="0" w:color="000000"/>
-              </w:pBdr>
-              <w:spacing w:after="100" w:before="100" w:line="240"/>
-              <w:ind w:left="100" w:right="100" w:firstLine="0" w:firstLineChars="0"/>
-            </w:pPr>
-            <w:r xmlns:w="http://schemas.openxmlformats.org/wordprocessingml/2006/main" xmlns:wp="http://schemas.openxmlformats.org/drawingml/2006/wordprocessingDrawing" xmlns:r="http://schemas.openxmlformats.org/officeDocument/2006/relationships" xmlns:w14="http://schemas.microsoft.com/office/word/2010/wordml">
-              <w:rPr>
-                <w:rFonts w:ascii="Cambria" w:hAnsi="Cambria" w:eastAsia="Cambria" w:cs="Cambria"/>
-                <w:i w:val="false"/>
-                <w:b w:val="false"/>
-                <w:u w:val="none"/>
-                <w:sz w:val="18"/>
-                <w:szCs w:val="18"/>
-                <w:color w:val="000000"/>
-              </w:rPr>
-              <w:t xml:space="preserve">11</w:t>
-            </w:r>
-          </w:p>
-        </w:tc>
-      </w:tr>
-      <w:tr>
-        <w:trPr>
-          <w:trHeight w:val="360" w:hRule="exact"/>
-        </w:trPr>
-        body 8
-        <w:tc>
-          <w:tcPr>
-            <w:tcBorders>
-              <w:bottom w:val="none" w:sz="0" w:space="0" w:color="000000"/>
-              <w:top w:val="none" w:sz="0" w:space="0" w:color="000000"/>
-              <w:left w:val="none" w:sz="0" w:space="0" w:color="000000"/>
-              <w:right w:val="none" w:sz="0" w:space="0" w:color="000000"/>
-            </w:tcBorders>
-            <w:shd w:val="clear" w:color="auto" w:fill="FFFFFF"/>
-            <w:tcMar>
-              <w:top w:w="0" w:type="dxa"/>
-              <w:bottom w:w="0" w:type="dxa"/>
-              <w:left w:w="0" w:type="dxa"/>
-              <w:right w:w="0" w:type="dxa"/>
-            </w:tcMar>
-            <w:vAlign w:val="center"/>
-          </w:tcPr>
-          <w:p>
-            <w:pPr>
-              <w:pStyle w:val="Normal"/>
-              <w:jc w:val="left"/>
-              <w:pBdr>
-                <w:bottom w:val="none" w:sz="0" w:space="0" w:color="000000"/>
-                <w:top w:val="none" w:sz="0" w:space="0" w:color="000000"/>
-                <w:left w:val="none" w:sz="0" w:space="0" w:color="000000"/>
-                <w:right w:val="none" w:sz="0" w:space="0" w:color="000000"/>
-              </w:pBdr>
-              <w:spacing w:after="100" w:before="100" w:line="240"/>
-              <w:ind w:left="100" w:right="100" w:firstLine="0" w:firstLineChars="0"/>
-            </w:pPr>
-            <w:r xmlns:w="http://schemas.openxmlformats.org/wordprocessingml/2006/main" xmlns:wp="http://schemas.openxmlformats.org/drawingml/2006/wordprocessingDrawing" xmlns:r="http://schemas.openxmlformats.org/officeDocument/2006/relationships" xmlns:w14="http://schemas.microsoft.com/office/word/2010/wordml">
-              <w:rPr>
-                <w:rFonts w:ascii="Cambria" w:hAnsi="Cambria" w:eastAsia="Cambria" w:cs="Cambria"/>
-                <w:i w:val="false"/>
-                <w:b w:val="false"/>
-                <w:u w:val="none"/>
-                <w:sz w:val="18"/>
-                <w:szCs w:val="18"/>
-                <w:color w:val="000000"/>
-              </w:rPr>
-              <w:t xml:space="preserve">Strømmestiftelsen</w:t>
-            </w:r>
-          </w:p>
-        </w:tc>
-        <w:tc>
-          <w:tcPr>
-            <w:tcBorders>
-              <w:bottom w:val="none" w:sz="0" w:space="0" w:color="000000"/>
-              <w:top w:val="none" w:sz="0" w:space="0" w:color="000000"/>
-              <w:left w:val="none" w:sz="0" w:space="0" w:color="000000"/>
-              <w:right w:val="none" w:sz="0" w:space="0" w:color="000000"/>
-            </w:tcBorders>
-            <w:shd w:val="clear" w:color="auto" w:fill="FFFFFF"/>
-            <w:tcMar>
-              <w:top w:w="0" w:type="dxa"/>
-              <w:bottom w:w="0" w:type="dxa"/>
-              <w:left w:w="0" w:type="dxa"/>
-              <w:right w:w="0" w:type="dxa"/>
-            </w:tcMar>
-            <w:vAlign w:val="center"/>
-          </w:tcPr>
-          <w:p>
-            <w:pPr>
-              <w:pStyle w:val="Normal"/>
-              <w:jc w:val="right"/>
-              <w:pBdr>
-                <w:bottom w:val="none" w:sz="0" w:space="0" w:color="000000"/>
-                <w:top w:val="none" w:sz="0" w:space="0" w:color="000000"/>
-                <w:left w:val="none" w:sz="0" w:space="0" w:color="000000"/>
-                <w:right w:val="none" w:sz="0" w:space="0" w:color="000000"/>
-              </w:pBdr>
-              <w:spacing w:after="100" w:before="100" w:line="240"/>
-              <w:ind w:left="100" w:right="100" w:firstLine="0" w:firstLineChars="0"/>
-            </w:pPr>
-            <w:r xmlns:w="http://schemas.openxmlformats.org/wordprocessingml/2006/main" xmlns:wp="http://schemas.openxmlformats.org/drawingml/2006/wordprocessingDrawing" xmlns:r="http://schemas.openxmlformats.org/officeDocument/2006/relationships" xmlns:w14="http://schemas.microsoft.com/office/word/2010/wordml">
-              <w:rPr>
-                <w:rFonts w:ascii="Cambria" w:hAnsi="Cambria" w:eastAsia="Cambria" w:cs="Cambria"/>
-                <w:i w:val="false"/>
-                <w:b w:val="false"/>
-                <w:u w:val="none"/>
-                <w:sz w:val="18"/>
-                <w:szCs w:val="18"/>
-                <w:color w:val="000000"/>
-              </w:rPr>
-              <w:t xml:space="preserve">11</w:t>
-            </w:r>
-          </w:p>
-        </w:tc>
-      </w:tr>
-      <w:tr>
-        <w:trPr>
-          <w:trHeight w:val="360" w:hRule="exact"/>
-        </w:trPr>
-        body 9
-        <w:tc>
-          <w:tcPr>
-            <w:tcBorders>
-              <w:bottom w:val="none" w:sz="0" w:space="0" w:color="000000"/>
-              <w:top w:val="none" w:sz="0" w:space="0" w:color="000000"/>
-              <w:left w:val="none" w:sz="0" w:space="0" w:color="000000"/>
-              <w:right w:val="none" w:sz="0" w:space="0" w:color="000000"/>
-            </w:tcBorders>
-            <w:shd w:val="clear" w:color="auto" w:fill="B4EAC9"/>
-            <w:tcMar>
-              <w:top w:w="0" w:type="dxa"/>
-              <w:bottom w:w="0" w:type="dxa"/>
-              <w:left w:w="0" w:type="dxa"/>
-              <w:right w:w="0" w:type="dxa"/>
-            </w:tcMar>
-            <w:vAlign w:val="center"/>
-          </w:tcPr>
-          <w:p>
-            <w:pPr>
-              <w:pStyle w:val="Normal"/>
-              <w:jc w:val="left"/>
-              <w:pBdr>
-                <w:bottom w:val="none" w:sz="0" w:space="0" w:color="000000"/>
-                <w:top w:val="none" w:sz="0" w:space="0" w:color="000000"/>
-                <w:left w:val="none" w:sz="0" w:space="0" w:color="000000"/>
-                <w:right w:val="none" w:sz="0" w:space="0" w:color="000000"/>
-              </w:pBdr>
-              <w:spacing w:after="100" w:before="100" w:line="240"/>
-              <w:ind w:left="100" w:right="100" w:firstLine="0" w:firstLineChars="0"/>
-            </w:pPr>
-            <w:r xmlns:w="http://schemas.openxmlformats.org/wordprocessingml/2006/main" xmlns:wp="http://schemas.openxmlformats.org/drawingml/2006/wordprocessingDrawing" xmlns:r="http://schemas.openxmlformats.org/officeDocument/2006/relationships" xmlns:w14="http://schemas.microsoft.com/office/word/2010/wordml">
-              <w:rPr>
-                <w:rFonts w:ascii="Cambria" w:hAnsi="Cambria" w:eastAsia="Cambria" w:cs="Cambria"/>
-                <w:i w:val="false"/>
-                <w:b w:val="false"/>
-                <w:u w:val="none"/>
-                <w:sz w:val="18"/>
-                <w:szCs w:val="18"/>
-                <w:color w:val="000000"/>
-              </w:rPr>
-              <w:t xml:space="preserve">LHL - Landsforeningen for Hjerte- og Lungesyke</w:t>
-            </w:r>
-          </w:p>
-        </w:tc>
-        <w:tc>
-          <w:tcPr>
-            <w:tcBorders>
-              <w:bottom w:val="none" w:sz="0" w:space="0" w:color="000000"/>
-              <w:top w:val="none" w:sz="0" w:space="0" w:color="000000"/>
-              <w:left w:val="none" w:sz="0" w:space="0" w:color="000000"/>
-              <w:right w:val="none" w:sz="0" w:space="0" w:color="000000"/>
-            </w:tcBorders>
-            <w:shd w:val="clear" w:color="auto" w:fill="B4EAC9"/>
-            <w:tcMar>
-              <w:top w:w="0" w:type="dxa"/>
-              <w:bottom w:w="0" w:type="dxa"/>
-              <w:left w:w="0" w:type="dxa"/>
-              <w:right w:w="0" w:type="dxa"/>
-            </w:tcMar>
-            <w:vAlign w:val="center"/>
-          </w:tcPr>
-          <w:p>
-            <w:pPr>
-              <w:pStyle w:val="Normal"/>
-              <w:jc w:val="right"/>
-              <w:pBdr>
-                <w:bottom w:val="none" w:sz="0" w:space="0" w:color="000000"/>
-                <w:top w:val="none" w:sz="0" w:space="0" w:color="000000"/>
-                <w:left w:val="none" w:sz="0" w:space="0" w:color="000000"/>
-                <w:right w:val="none" w:sz="0" w:space="0" w:color="000000"/>
-              </w:pBdr>
-              <w:spacing w:after="100" w:before="100" w:line="240"/>
-              <w:ind w:left="100" w:right="100" w:firstLine="0" w:firstLineChars="0"/>
-            </w:pPr>
-            <w:r xmlns:w="http://schemas.openxmlformats.org/wordprocessingml/2006/main" xmlns:wp="http://schemas.openxmlformats.org/drawingml/2006/wordprocessingDrawing" xmlns:r="http://schemas.openxmlformats.org/officeDocument/2006/relationships" xmlns:w14="http://schemas.microsoft.com/office/word/2010/wordml">
-              <w:rPr>
-                <w:rFonts w:ascii="Cambria" w:hAnsi="Cambria" w:eastAsia="Cambria" w:cs="Cambria"/>
-                <w:i w:val="false"/>
-                <w:b w:val="false"/>
-                <w:u w:val="none"/>
-                <w:sz w:val="18"/>
-                <w:szCs w:val="18"/>
-                <w:color w:val="000000"/>
-              </w:rPr>
-              <w:t xml:space="preserve">10</w:t>
-            </w:r>
-          </w:p>
-        </w:tc>
-      </w:tr>
-      <w:tr>
-        <w:trPr>
-          <w:trHeight w:val="360" w:hRule="exact"/>
-        </w:trPr>
-        body10
-        <w:tc>
-          <w:tcPr>
-            <w:tcBorders>
-              <w:bottom w:val="none" w:sz="0" w:space="0" w:color="000000"/>
-              <w:top w:val="none" w:sz="0" w:space="0" w:color="000000"/>
-              <w:left w:val="none" w:sz="0" w:space="0" w:color="000000"/>
-              <w:right w:val="none" w:sz="0" w:space="0" w:color="000000"/>
-            </w:tcBorders>
-            <w:shd w:val="clear" w:color="auto" w:fill="FFFFFF"/>
-            <w:tcMar>
-              <w:top w:w="0" w:type="dxa"/>
-              <w:bottom w:w="0" w:type="dxa"/>
-              <w:left w:w="0" w:type="dxa"/>
-              <w:right w:w="0" w:type="dxa"/>
-            </w:tcMar>
-            <w:vAlign w:val="center"/>
-          </w:tcPr>
-          <w:p>
-            <w:pPr>
-              <w:pStyle w:val="Normal"/>
-              <w:jc w:val="left"/>
-              <w:pBdr>
-                <w:bottom w:val="none" w:sz="0" w:space="0" w:color="000000"/>
-                <w:top w:val="none" w:sz="0" w:space="0" w:color="000000"/>
-                <w:left w:val="none" w:sz="0" w:space="0" w:color="000000"/>
-                <w:right w:val="none" w:sz="0" w:space="0" w:color="000000"/>
-              </w:pBdr>
-              <w:spacing w:after="100" w:before="100" w:line="240"/>
-              <w:ind w:left="100" w:right="100" w:firstLine="0" w:firstLineChars="0"/>
-            </w:pPr>
-            <w:r xmlns:w="http://schemas.openxmlformats.org/wordprocessingml/2006/main" xmlns:wp="http://schemas.openxmlformats.org/drawingml/2006/wordprocessingDrawing" xmlns:r="http://schemas.openxmlformats.org/officeDocument/2006/relationships" xmlns:w14="http://schemas.microsoft.com/office/word/2010/wordml">
-              <w:rPr>
-                <w:rFonts w:ascii="Cambria" w:hAnsi="Cambria" w:eastAsia="Cambria" w:cs="Cambria"/>
-                <w:i w:val="false"/>
-                <w:b w:val="false"/>
-                <w:u w:val="none"/>
-                <w:sz w:val="18"/>
-                <w:szCs w:val="18"/>
-                <w:color w:val="000000"/>
-              </w:rPr>
-              <w:t xml:space="preserve">Flyktninghjelpen</w:t>
-            </w:r>
-          </w:p>
-        </w:tc>
-        <w:tc>
-          <w:tcPr>
-            <w:tcBorders>
-              <w:bottom w:val="none" w:sz="0" w:space="0" w:color="000000"/>
-              <w:top w:val="none" w:sz="0" w:space="0" w:color="000000"/>
-              <w:left w:val="none" w:sz="0" w:space="0" w:color="000000"/>
-              <w:right w:val="none" w:sz="0" w:space="0" w:color="000000"/>
-            </w:tcBorders>
-            <w:shd w:val="clear" w:color="auto" w:fill="FFFFFF"/>
-            <w:tcMar>
-              <w:top w:w="0" w:type="dxa"/>
-              <w:bottom w:w="0" w:type="dxa"/>
-              <w:left w:w="0" w:type="dxa"/>
-              <w:right w:w="0" w:type="dxa"/>
-            </w:tcMar>
-            <w:vAlign w:val="center"/>
-          </w:tcPr>
-          <w:p>
-            <w:pPr>
-              <w:pStyle w:val="Normal"/>
-              <w:jc w:val="right"/>
-              <w:pBdr>
-                <w:bottom w:val="none" w:sz="0" w:space="0" w:color="000000"/>
-                <w:top w:val="none" w:sz="0" w:space="0" w:color="000000"/>
-                <w:left w:val="none" w:sz="0" w:space="0" w:color="000000"/>
-                <w:right w:val="none" w:sz="0" w:space="0" w:color="000000"/>
-              </w:pBdr>
-              <w:spacing w:after="100" w:before="100" w:line="240"/>
-              <w:ind w:left="100" w:right="100" w:firstLine="0" w:firstLineChars="0"/>
-            </w:pPr>
-            <w:r xmlns:w="http://schemas.openxmlformats.org/wordprocessingml/2006/main" xmlns:wp="http://schemas.openxmlformats.org/drawingml/2006/wordprocessingDrawing" xmlns:r="http://schemas.openxmlformats.org/officeDocument/2006/relationships" xmlns:w14="http://schemas.microsoft.com/office/word/2010/wordml">
-              <w:rPr>
-                <w:rFonts w:ascii="Cambria" w:hAnsi="Cambria" w:eastAsia="Cambria" w:cs="Cambria"/>
-                <w:i w:val="false"/>
-                <w:b w:val="false"/>
-                <w:u w:val="none"/>
-                <w:sz w:val="18"/>
-                <w:szCs w:val="18"/>
-                <w:color w:val="000000"/>
-              </w:rPr>
-              <w:t xml:space="preserve">9</w:t>
-            </w:r>
-          </w:p>
-        </w:tc>
-      </w:tr>
-      <w:tr>
-        <w:trPr>
-          <w:trHeight w:val="360" w:hRule="exact"/>
-        </w:trPr>
-        body11
-        <w:tc>
-          <w:tcPr>
-            <w:tcBorders>
-              <w:bottom w:val="single" w:sz="8" w:space="0" w:color="000000"/>
-              <w:top w:val="none" w:sz="0" w:space="0" w:color="000000"/>
-              <w:left w:val="none" w:sz="0" w:space="0" w:color="000000"/>
-              <w:right w:val="none" w:sz="0" w:space="0" w:color="000000"/>
-            </w:tcBorders>
-            <w:shd w:val="clear" w:color="auto" w:fill="B4EAC9"/>
-            <w:tcMar>
-              <w:top w:w="0" w:type="dxa"/>
-              <w:bottom w:w="0" w:type="dxa"/>
-              <w:left w:w="0" w:type="dxa"/>
-              <w:right w:w="0" w:type="dxa"/>
-            </w:tcMar>
-            <w:vAlign w:val="center"/>
-          </w:tcPr>
-          <w:p>
-            <w:pPr>
-              <w:pStyle w:val="Normal"/>
-              <w:jc w:val="left"/>
-              <w:pBdr>
-                <w:bottom w:val="none" w:sz="0" w:space="0" w:color="000000"/>
-                <w:top w:val="none" w:sz="0" w:space="0" w:color="000000"/>
-                <w:left w:val="none" w:sz="0" w:space="0" w:color="000000"/>
-                <w:right w:val="none" w:sz="0" w:space="0" w:color="000000"/>
-              </w:pBdr>
-              <w:spacing w:after="100" w:before="100" w:line="240"/>
-              <w:ind w:left="100" w:right="100" w:firstLine="0" w:firstLineChars="0"/>
-            </w:pPr>
-            <w:r xmlns:w="http://schemas.openxmlformats.org/wordprocessingml/2006/main" xmlns:wp="http://schemas.openxmlformats.org/drawingml/2006/wordprocessingDrawing" xmlns:r="http://schemas.openxmlformats.org/officeDocument/2006/relationships" xmlns:w14="http://schemas.microsoft.com/office/word/2010/wordml">
-              <w:rPr>
-                <w:rFonts w:ascii="Cambria" w:hAnsi="Cambria" w:eastAsia="Cambria" w:cs="Cambria"/>
-                <w:i w:val="false"/>
-                <w:b w:val="false"/>
-                <w:u w:val="none"/>
-                <w:sz w:val="18"/>
-                <w:szCs w:val="18"/>
-                <w:color w:val="000000"/>
-              </w:rPr>
-              <w:t xml:space="preserve">Andre partnere</w:t>
-            </w:r>
-          </w:p>
-        </w:tc>
-        <w:tc>
-          <w:tcPr>
-            <w:tcBorders>
-              <w:bottom w:val="single" w:sz="8" w:space="0" w:color="000000"/>
-              <w:top w:val="none" w:sz="0" w:space="0" w:color="000000"/>
-              <w:left w:val="none" w:sz="0" w:space="0" w:color="000000"/>
-              <w:right w:val="none" w:sz="0" w:space="0" w:color="000000"/>
-            </w:tcBorders>
-            <w:shd w:val="clear" w:color="auto" w:fill="B4EAC9"/>
-            <w:tcMar>
-              <w:top w:w="0" w:type="dxa"/>
-              <w:bottom w:w="0" w:type="dxa"/>
-              <w:left w:w="0" w:type="dxa"/>
-              <w:right w:w="0" w:type="dxa"/>
-            </w:tcMar>
-            <w:vAlign w:val="center"/>
-          </w:tcPr>
-          <w:p>
-            <w:pPr>
-              <w:pStyle w:val="Normal"/>
-              <w:jc w:val="right"/>
-              <w:pBdr>
-                <w:bottom w:val="none" w:sz="0" w:space="0" w:color="000000"/>
-                <w:top w:val="none" w:sz="0" w:space="0" w:color="000000"/>
-                <w:left w:val="none" w:sz="0" w:space="0" w:color="000000"/>
-                <w:right w:val="none" w:sz="0" w:space="0" w:color="000000"/>
-              </w:pBdr>
-              <w:spacing w:after="100" w:before="100" w:line="240"/>
-              <w:ind w:left="100" w:right="100" w:firstLine="0" w:firstLineChars="0"/>
-            </w:pPr>
-            <w:r xmlns:w="http://schemas.openxmlformats.org/wordprocessingml/2006/main" xmlns:wp="http://schemas.openxmlformats.org/drawingml/2006/wordprocessingDrawing" xmlns:r="http://schemas.openxmlformats.org/officeDocument/2006/relationships" xmlns:w14="http://schemas.microsoft.com/office/word/2010/wordml">
-              <w:rPr>
-                <w:rFonts w:ascii="Cambria" w:hAnsi="Cambria" w:eastAsia="Cambria" w:cs="Cambria"/>
-                <w:i w:val="false"/>
-                <w:b w:val="false"/>
-                <w:u w:val="none"/>
-                <w:sz w:val="18"/>
-                <w:szCs w:val="18"/>
-                <w:color w:val="000000"/>
-              </w:rPr>
-              <w:t xml:space="preserve">113</w:t>
-            </w:r>
-          </w:p>
-        </w:tc>
-      </w:tr>
-      <w:tr>
-        <w:trPr>
-          <w:trHeight w:val="360" w:hRule="exact"/>
-        </w:trPr>
-        body12
+        body6
         <w:tc>
           <w:tcPr>
             <w:tcBorders>
@@ -1606,14 +3033,14 @@
                 <w:szCs w:val="18"/>
                 <w:color w:val="000000"/>
               </w:rPr>
-              <w:t xml:space="preserve">451</w:t>
+              <w:t xml:space="preserve">3</w:t>
             </w:r>
           </w:p>
         </w:tc>
       </w:tr>
     </w:tbl>
-    <w:bookmarkEnd w:id="36"/>
-    <w:bookmarkStart w:id="41" w:name="X7337204909b3d1da3050980d5a4ae8daa53145d"/>
+    <w:bookmarkEnd w:id="33"/>
+    <w:bookmarkStart w:id="38" w:name="X4e747426bc3bcad0cd7f4ac6c1778d6381da98b"/>
     <w:p>
       <w:pPr>
         <w:pStyle w:val="Heading2"/>
@@ -1628,7 +3055,7 @@
         <w:tab/>
       </w:r>
       <w:r>
-        <w:t xml:space="preserve">Beregnet norsk multilateral kjernestøtte til Tanzania</w:t>
+        <w:t xml:space="preserve">Beregnet norsk multilateral kjernestøtte til Mexico</w:t>
       </w:r>
     </w:p>
     <w:p>
@@ -1636,13 +3063,13 @@
         <w:pStyle w:val="FirstParagraph"/>
       </w:pPr>
       <w:r>
-        <w:t xml:space="preserve">OECDs beregninger tilsier at Tanzania mottok 209 millioner kroner av Norges kjernestøtte til multilaterale organisasjoner i 2021</w:t>
+        <w:t xml:space="preserve">OECDs beregninger tilsier at Mexico mottok 23 millioner kroner av Norges kjernestøtte til multilaterale organisasjoner i 2021</w:t>
       </w:r>
       <w:r>
         <w:rPr>
           <w:rStyle w:val="FootnoteReference"/>
         </w:rPr>
-        <w:footnoteReference w:id="37"/>
+        <w:footnoteReference w:id="34"/>
       </w:r>
       <w:r>
         <w:t xml:space="preserve">.</w:t>
@@ -1656,13 +3083,13 @@
         <w:pStyle w:val="BodyText"/>
       </w:pPr>
       <w:r>
-        <w:t xml:space="preserve">Tabellen under viser organisasjonsfordelingen av beregnet norsk multilateral kjernestøtte til Tanzania i 2020</w:t>
+        <w:t xml:space="preserve">Tabellen under viser organisasjonsfordelingen av beregnet norsk multilateral kjernestøtte til Mexico i 2020</w:t>
       </w:r>
       <w:r>
         <w:rPr>
           <w:rStyle w:val="FootnoteReference"/>
         </w:rPr>
-        <w:footnoteReference w:id="38"/>
+        <w:footnoteReference w:id="35"/>
       </w:r>
       <w:r>
         <w:t xml:space="preserve">. Nyere beregninger fordelt på organisasjon er ikke tilgjengelig per i dag.</w:t>
@@ -1673,1304 +3100,7 @@
         <w:pStyle w:val="BodyText"/>
       </w:pPr>
       <w:r>
-        <w:t xml:space="preserve">De tre største partnerne for den beregnede multilaterale kjernestøtten til Tanzania i 2020 var GFATM - Global Fund to Fight AIDS, Tuberculosis and Malaria (54 mill), AFDB - African Development Bank (38 mill) og AFDB - African Development Bank (1,9 mill).</w:t>
-      </w:r>
-    </w:p>
-    <w:tbl xmlns:w="http://schemas.openxmlformats.org/wordprocessingml/2006/main" xmlns:r="http://schemas.openxmlformats.org/officeDocument/2006/relationships" xmlns:w14="http://schemas.microsoft.com/office/word/2010/wordml" xmlns:wp="http://schemas.openxmlformats.org/drawingml/2006/wordprocessingDrawing" xmlns:a="http://schemas.openxmlformats.org/drawingml/2006/main" xmlns:pic="http://schemas.openxmlformats.org/drawingml/2006/picture">
-      <w:tblPr>
-        <w:tblLayout w:type="fixed"/>
-        <w:jc w:val="start"/>
-        <w:tblLook w:firstRow="1" w:lastRow="0" w:firstColumn="0" w:lastColumn="0" w:noHBand="0" w:noVBand="1"/>
-      </w:tblPr>
-      <w:tblGrid>
-        <w:gridCol w:w="6380"/>
-        <w:gridCol w:w="1134"/>
-      </w:tblGrid>
-      <w:tr>
-        <w:trPr>
-          <w:trHeight w:val="360" w:hRule="exact"/>
-          <w:tblHeader/>
-        </w:trPr>
-        header 1
-        <w:tc>
-          <w:tcPr>
-            <w:gridSpan w:val="2"/>
-            <w:tcBorders>
-              <w:bottom w:val="single" w:sz="8" w:space="0" w:color="000000"/>
-              <w:top w:val="none" w:sz="0" w:space="0" w:color="000000"/>
-              <w:left w:val="none" w:sz="0" w:space="0" w:color="000000"/>
-              <w:right w:val="none" w:sz="0" w:space="0" w:color="000000"/>
-            </w:tcBorders>
-            <w:shd w:val="clear" w:color="auto" w:fill="FFFFFF"/>
-            <w:tcMar>
-              <w:top w:w="0" w:type="dxa"/>
-              <w:bottom w:w="0" w:type="dxa"/>
-              <w:left w:w="0" w:type="dxa"/>
-              <w:right w:w="0" w:type="dxa"/>
-            </w:tcMar>
-            <w:vAlign w:val="center"/>
-          </w:tcPr>
-          <w:p>
-            <w:pPr>
-              <w:pStyle w:val="Normal"/>
-              <w:jc w:val="left"/>
-              <w:pBdr>
-                <w:bottom w:val="none" w:sz="0" w:space="0" w:color="000000"/>
-                <w:top w:val="none" w:sz="0" w:space="0" w:color="000000"/>
-                <w:left w:val="none" w:sz="0" w:space="0" w:color="000000"/>
-                <w:right w:val="none" w:sz="0" w:space="0" w:color="000000"/>
-              </w:pBdr>
-              <w:spacing w:after="100" w:before="100" w:line="240"/>
-              <w:ind w:left="100" w:right="100" w:firstLine="0" w:firstLineChars="0"/>
-            </w:pPr>
-            <w:r xmlns:w="http://schemas.openxmlformats.org/wordprocessingml/2006/main" xmlns:wp="http://schemas.openxmlformats.org/drawingml/2006/wordprocessingDrawing" xmlns:r="http://schemas.openxmlformats.org/officeDocument/2006/relationships" xmlns:w14="http://schemas.microsoft.com/office/word/2010/wordml">
-              <w:rPr>
-                <w:rFonts w:ascii="Cambria" w:hAnsi="Cambria" w:eastAsia="Cambria" w:cs="Cambria"/>
-                <w:i w:val="false"/>
-                <w:b w:val="true"/>
-                <w:u w:val="none"/>
-                <w:sz w:val="22"/>
-                <w:szCs w:val="22"/>
-                <w:color w:val="000000"/>
-              </w:rPr>
-              <w:t xml:space="preserve">Avtalepartnere, beregnet multilateral kjernestøtte til Tanzania i 2020</w:t>
-            </w:r>
-          </w:p>
-        </w:tc>
-      </w:tr>
-      <w:tr>
-        <w:trPr>
-          <w:trHeight w:val="360" w:hRule="exact"/>
-          <w:tblHeader/>
-        </w:trPr>
-        header 2
-        <w:tc>
-          <w:tcPr>
-            <w:tcBorders>
-              <w:bottom w:val="single" w:sz="8" w:space="0" w:color="000000"/>
-              <w:top w:val="single" w:sz="8" w:space="0" w:color="000000"/>
-              <w:left w:val="none" w:sz="0" w:space="0" w:color="000000"/>
-              <w:right w:val="none" w:sz="0" w:space="0" w:color="000000"/>
-            </w:tcBorders>
-            <w:shd w:val="clear" w:color="auto" w:fill="FFFFFF"/>
-            <w:tcMar>
-              <w:top w:w="0" w:type="dxa"/>
-              <w:bottom w:w="0" w:type="dxa"/>
-              <w:left w:w="0" w:type="dxa"/>
-              <w:right w:w="0" w:type="dxa"/>
-            </w:tcMar>
-            <w:vAlign w:val="center"/>
-          </w:tcPr>
-          <w:p>
-            <w:pPr>
-              <w:pStyle w:val="Normal"/>
-              <w:jc w:val="left"/>
-              <w:pBdr>
-                <w:bottom w:val="none" w:sz="0" w:space="0" w:color="000000"/>
-                <w:top w:val="none" w:sz="0" w:space="0" w:color="000000"/>
-                <w:left w:val="none" w:sz="0" w:space="0" w:color="000000"/>
-                <w:right w:val="none" w:sz="0" w:space="0" w:color="000000"/>
-              </w:pBdr>
-              <w:spacing w:after="100" w:before="100" w:line="240"/>
-              <w:ind w:left="100" w:right="100" w:firstLine="0" w:firstLineChars="0"/>
-            </w:pPr>
-            <w:r xmlns:w="http://schemas.openxmlformats.org/wordprocessingml/2006/main" xmlns:wp="http://schemas.openxmlformats.org/drawingml/2006/wordprocessingDrawing" xmlns:r="http://schemas.openxmlformats.org/officeDocument/2006/relationships" xmlns:w14="http://schemas.microsoft.com/office/word/2010/wordml">
-              <w:rPr>
-                <w:rFonts w:ascii="Cambria" w:hAnsi="Cambria" w:eastAsia="Cambria" w:cs="Cambria"/>
-                <w:i w:val="false"/>
-                <w:b w:val="false"/>
-                <w:u w:val="none"/>
-                <w:sz w:val="18"/>
-                <w:szCs w:val="18"/>
-                <w:color w:val="000000"/>
-              </w:rPr>
-              <w:t xml:space="preserve">Avtalepartner</w:t>
-            </w:r>
-          </w:p>
-        </w:tc>
-        <w:tc>
-          <w:tcPr>
-            <w:tcBorders>
-              <w:bottom w:val="single" w:sz="8" w:space="0" w:color="000000"/>
-              <w:top w:val="single" w:sz="8" w:space="0" w:color="000000"/>
-              <w:left w:val="none" w:sz="0" w:space="0" w:color="000000"/>
-              <w:right w:val="none" w:sz="0" w:space="0" w:color="000000"/>
-            </w:tcBorders>
-            <w:shd w:val="clear" w:color="auto" w:fill="FFFFFF"/>
-            <w:tcMar>
-              <w:top w:w="0" w:type="dxa"/>
-              <w:bottom w:w="0" w:type="dxa"/>
-              <w:left w:w="0" w:type="dxa"/>
-              <w:right w:w="0" w:type="dxa"/>
-            </w:tcMar>
-            <w:vAlign w:val="center"/>
-          </w:tcPr>
-          <w:p>
-            <w:pPr>
-              <w:pStyle w:val="Normal"/>
-              <w:jc w:val="right"/>
-              <w:pBdr>
-                <w:bottom w:val="none" w:sz="0" w:space="0" w:color="000000"/>
-                <w:top w:val="none" w:sz="0" w:space="0" w:color="000000"/>
-                <w:left w:val="none" w:sz="0" w:space="0" w:color="000000"/>
-                <w:right w:val="none" w:sz="0" w:space="0" w:color="000000"/>
-              </w:pBdr>
-              <w:spacing w:after="100" w:before="100" w:line="240"/>
-              <w:ind w:left="100" w:right="100" w:firstLine="0" w:firstLineChars="0"/>
-            </w:pPr>
-            <w:r xmlns:w="http://schemas.openxmlformats.org/wordprocessingml/2006/main" xmlns:wp="http://schemas.openxmlformats.org/drawingml/2006/wordprocessingDrawing" xmlns:r="http://schemas.openxmlformats.org/officeDocument/2006/relationships" xmlns:w14="http://schemas.microsoft.com/office/word/2010/wordml">
-              <w:rPr>
-                <w:rFonts w:ascii="Cambria" w:hAnsi="Cambria" w:eastAsia="Cambria" w:cs="Cambria"/>
-                <w:i w:val="false"/>
-                <w:b w:val="false"/>
-                <w:u w:val="none"/>
-                <w:sz w:val="18"/>
-                <w:szCs w:val="18"/>
-                <w:color w:val="000000"/>
-              </w:rPr>
-              <w:t xml:space="preserve">NOK mill</w:t>
-            </w:r>
-          </w:p>
-        </w:tc>
-      </w:tr>
-      <w:tr>
-        <w:trPr>
-          <w:trHeight w:val="360" w:hRule="exact"/>
-        </w:trPr>
-        body 1
-        <w:tc>
-          <w:tcPr>
-            <w:tcBorders>
-              <w:bottom w:val="none" w:sz="0" w:space="0" w:color="000000"/>
-              <w:top w:val="single" w:sz="8" w:space="0" w:color="000000"/>
-              <w:left w:val="none" w:sz="0" w:space="0" w:color="000000"/>
-              <w:right w:val="none" w:sz="0" w:space="0" w:color="000000"/>
-            </w:tcBorders>
-            <w:shd w:val="clear" w:color="auto" w:fill="FFA274"/>
-            <w:tcMar>
-              <w:top w:w="0" w:type="dxa"/>
-              <w:bottom w:w="0" w:type="dxa"/>
-              <w:left w:w="0" w:type="dxa"/>
-              <w:right w:w="0" w:type="dxa"/>
-            </w:tcMar>
-            <w:vAlign w:val="center"/>
-          </w:tcPr>
-          <w:p>
-            <w:pPr>
-              <w:pStyle w:val="Normal"/>
-              <w:jc w:val="left"/>
-              <w:pBdr>
-                <w:bottom w:val="none" w:sz="0" w:space="0" w:color="000000"/>
-                <w:top w:val="none" w:sz="0" w:space="0" w:color="000000"/>
-                <w:left w:val="none" w:sz="0" w:space="0" w:color="000000"/>
-                <w:right w:val="none" w:sz="0" w:space="0" w:color="000000"/>
-              </w:pBdr>
-              <w:spacing w:after="100" w:before="100" w:line="240"/>
-              <w:ind w:left="100" w:right="100" w:firstLine="0" w:firstLineChars="0"/>
-            </w:pPr>
-            <w:r xmlns:w="http://schemas.openxmlformats.org/wordprocessingml/2006/main" xmlns:wp="http://schemas.openxmlformats.org/drawingml/2006/wordprocessingDrawing" xmlns:r="http://schemas.openxmlformats.org/officeDocument/2006/relationships" xmlns:w14="http://schemas.microsoft.com/office/word/2010/wordml">
-              <w:rPr>
-                <w:rFonts w:ascii="Cambria" w:hAnsi="Cambria" w:eastAsia="Cambria" w:cs="Cambria"/>
-                <w:i w:val="false"/>
-                <w:b w:val="false"/>
-                <w:u w:val="none"/>
-                <w:sz w:val="18"/>
-                <w:szCs w:val="18"/>
-                <w:color w:val="000000"/>
-              </w:rPr>
-              <w:t xml:space="preserve">GFATM - Global Fund to Fight AIDS, Tuberculosis and Malaria</w:t>
-            </w:r>
-          </w:p>
-        </w:tc>
-        <w:tc>
-          <w:tcPr>
-            <w:tcBorders>
-              <w:bottom w:val="none" w:sz="0" w:space="0" w:color="000000"/>
-              <w:top w:val="single" w:sz="8" w:space="0" w:color="000000"/>
-              <w:left w:val="none" w:sz="0" w:space="0" w:color="000000"/>
-              <w:right w:val="none" w:sz="0" w:space="0" w:color="000000"/>
-            </w:tcBorders>
-            <w:shd w:val="clear" w:color="auto" w:fill="FFA274"/>
-            <w:tcMar>
-              <w:top w:w="0" w:type="dxa"/>
-              <w:bottom w:w="0" w:type="dxa"/>
-              <w:left w:w="0" w:type="dxa"/>
-              <w:right w:w="0" w:type="dxa"/>
-            </w:tcMar>
-            <w:vAlign w:val="center"/>
-          </w:tcPr>
-          <w:p>
-            <w:pPr>
-              <w:pStyle w:val="Normal"/>
-              <w:jc w:val="right"/>
-              <w:pBdr>
-                <w:bottom w:val="none" w:sz="0" w:space="0" w:color="000000"/>
-                <w:top w:val="none" w:sz="0" w:space="0" w:color="000000"/>
-                <w:left w:val="none" w:sz="0" w:space="0" w:color="000000"/>
-                <w:right w:val="none" w:sz="0" w:space="0" w:color="000000"/>
-              </w:pBdr>
-              <w:spacing w:after="100" w:before="100" w:line="240"/>
-              <w:ind w:left="100" w:right="100" w:firstLine="0" w:firstLineChars="0"/>
-            </w:pPr>
-            <w:r xmlns:w="http://schemas.openxmlformats.org/wordprocessingml/2006/main" xmlns:wp="http://schemas.openxmlformats.org/drawingml/2006/wordprocessingDrawing" xmlns:r="http://schemas.openxmlformats.org/officeDocument/2006/relationships" xmlns:w14="http://schemas.microsoft.com/office/word/2010/wordml">
-              <w:rPr>
-                <w:rFonts w:ascii="Cambria" w:hAnsi="Cambria" w:eastAsia="Cambria" w:cs="Cambria"/>
-                <w:i w:val="false"/>
-                <w:b w:val="false"/>
-                <w:u w:val="none"/>
-                <w:sz w:val="18"/>
-                <w:szCs w:val="18"/>
-                <w:color w:val="000000"/>
-              </w:rPr>
-              <w:t xml:space="preserve">54</w:t>
-            </w:r>
-          </w:p>
-        </w:tc>
-      </w:tr>
-      <w:tr>
-        <w:trPr>
-          <w:trHeight w:val="360" w:hRule="exact"/>
-        </w:trPr>
-        body 2
-        <w:tc>
-          <w:tcPr>
-            <w:tcBorders>
-              <w:bottom w:val="none" w:sz="0" w:space="0" w:color="000000"/>
-              <w:top w:val="none" w:sz="0" w:space="0" w:color="000000"/>
-              <w:left w:val="none" w:sz="0" w:space="0" w:color="000000"/>
-              <w:right w:val="none" w:sz="0" w:space="0" w:color="000000"/>
-            </w:tcBorders>
-            <w:shd w:val="clear" w:color="auto" w:fill="FFFFFF"/>
-            <w:tcMar>
-              <w:top w:w="0" w:type="dxa"/>
-              <w:bottom w:w="0" w:type="dxa"/>
-              <w:left w:w="0" w:type="dxa"/>
-              <w:right w:w="0" w:type="dxa"/>
-            </w:tcMar>
-            <w:vAlign w:val="center"/>
-          </w:tcPr>
-          <w:p>
-            <w:pPr>
-              <w:pStyle w:val="Normal"/>
-              <w:jc w:val="left"/>
-              <w:pBdr>
-                <w:bottom w:val="none" w:sz="0" w:space="0" w:color="000000"/>
-                <w:top w:val="none" w:sz="0" w:space="0" w:color="000000"/>
-                <w:left w:val="none" w:sz="0" w:space="0" w:color="000000"/>
-                <w:right w:val="none" w:sz="0" w:space="0" w:color="000000"/>
-              </w:pBdr>
-              <w:spacing w:after="100" w:before="100" w:line="240"/>
-              <w:ind w:left="100" w:right="100" w:firstLine="0" w:firstLineChars="0"/>
-            </w:pPr>
-            <w:r xmlns:w="http://schemas.openxmlformats.org/wordprocessingml/2006/main" xmlns:wp="http://schemas.openxmlformats.org/drawingml/2006/wordprocessingDrawing" xmlns:r="http://schemas.openxmlformats.org/officeDocument/2006/relationships" xmlns:w14="http://schemas.microsoft.com/office/word/2010/wordml">
-              <w:rPr>
-                <w:rFonts w:ascii="Cambria" w:hAnsi="Cambria" w:eastAsia="Cambria" w:cs="Cambria"/>
-                <w:i w:val="false"/>
-                <w:b w:val="false"/>
-                <w:u w:val="none"/>
-                <w:sz w:val="18"/>
-                <w:szCs w:val="18"/>
-                <w:color w:val="000000"/>
-              </w:rPr>
-              <w:t xml:space="preserve">AFDB - African Development Bank</w:t>
-            </w:r>
-          </w:p>
-        </w:tc>
-        <w:tc>
-          <w:tcPr>
-            <w:tcBorders>
-              <w:bottom w:val="none" w:sz="0" w:space="0" w:color="000000"/>
-              <w:top w:val="none" w:sz="0" w:space="0" w:color="000000"/>
-              <w:left w:val="none" w:sz="0" w:space="0" w:color="000000"/>
-              <w:right w:val="none" w:sz="0" w:space="0" w:color="000000"/>
-            </w:tcBorders>
-            <w:shd w:val="clear" w:color="auto" w:fill="FFFFFF"/>
-            <w:tcMar>
-              <w:top w:w="0" w:type="dxa"/>
-              <w:bottom w:w="0" w:type="dxa"/>
-              <w:left w:w="0" w:type="dxa"/>
-              <w:right w:w="0" w:type="dxa"/>
-            </w:tcMar>
-            <w:vAlign w:val="center"/>
-          </w:tcPr>
-          <w:p>
-            <w:pPr>
-              <w:pStyle w:val="Normal"/>
-              <w:jc w:val="right"/>
-              <w:pBdr>
-                <w:bottom w:val="none" w:sz="0" w:space="0" w:color="000000"/>
-                <w:top w:val="none" w:sz="0" w:space="0" w:color="000000"/>
-                <w:left w:val="none" w:sz="0" w:space="0" w:color="000000"/>
-                <w:right w:val="none" w:sz="0" w:space="0" w:color="000000"/>
-              </w:pBdr>
-              <w:spacing w:after="100" w:before="100" w:line="240"/>
-              <w:ind w:left="100" w:right="100" w:firstLine="0" w:firstLineChars="0"/>
-            </w:pPr>
-            <w:r xmlns:w="http://schemas.openxmlformats.org/wordprocessingml/2006/main" xmlns:wp="http://schemas.openxmlformats.org/drawingml/2006/wordprocessingDrawing" xmlns:r="http://schemas.openxmlformats.org/officeDocument/2006/relationships" xmlns:w14="http://schemas.microsoft.com/office/word/2010/wordml">
-              <w:rPr>
-                <w:rFonts w:ascii="Cambria" w:hAnsi="Cambria" w:eastAsia="Cambria" w:cs="Cambria"/>
-                <w:i w:val="false"/>
-                <w:b w:val="false"/>
-                <w:u w:val="none"/>
-                <w:sz w:val="18"/>
-                <w:szCs w:val="18"/>
-                <w:color w:val="000000"/>
-              </w:rPr>
-              <w:t xml:space="preserve">38</w:t>
-            </w:r>
-          </w:p>
-        </w:tc>
-      </w:tr>
-      <w:tr>
-        <w:trPr>
-          <w:trHeight w:val="360" w:hRule="exact"/>
-        </w:trPr>
-        body 3
-        <w:tc>
-          <w:tcPr>
-            <w:tcBorders>
-              <w:bottom w:val="none" w:sz="0" w:space="0" w:color="000000"/>
-              <w:top w:val="none" w:sz="0" w:space="0" w:color="000000"/>
-              <w:left w:val="none" w:sz="0" w:space="0" w:color="000000"/>
-              <w:right w:val="none" w:sz="0" w:space="0" w:color="000000"/>
-            </w:tcBorders>
-            <w:shd w:val="clear" w:color="auto" w:fill="FFA274"/>
-            <w:tcMar>
-              <w:top w:w="0" w:type="dxa"/>
-              <w:bottom w:w="0" w:type="dxa"/>
-              <w:left w:w="0" w:type="dxa"/>
-              <w:right w:w="0" w:type="dxa"/>
-            </w:tcMar>
-            <w:vAlign w:val="center"/>
-          </w:tcPr>
-          <w:p>
-            <w:pPr>
-              <w:pStyle w:val="Normal"/>
-              <w:jc w:val="left"/>
-              <w:pBdr>
-                <w:bottom w:val="none" w:sz="0" w:space="0" w:color="000000"/>
-                <w:top w:val="none" w:sz="0" w:space="0" w:color="000000"/>
-                <w:left w:val="none" w:sz="0" w:space="0" w:color="000000"/>
-                <w:right w:val="none" w:sz="0" w:space="0" w:color="000000"/>
-              </w:pBdr>
-              <w:spacing w:after="100" w:before="100" w:line="240"/>
-              <w:ind w:left="100" w:right="100" w:firstLine="0" w:firstLineChars="0"/>
-            </w:pPr>
-            <w:r xmlns:w="http://schemas.openxmlformats.org/wordprocessingml/2006/main" xmlns:wp="http://schemas.openxmlformats.org/drawingml/2006/wordprocessingDrawing" xmlns:r="http://schemas.openxmlformats.org/officeDocument/2006/relationships" xmlns:w14="http://schemas.microsoft.com/office/word/2010/wordml">
-              <w:rPr>
-                <w:rFonts w:ascii="Cambria" w:hAnsi="Cambria" w:eastAsia="Cambria" w:cs="Cambria"/>
-                <w:i w:val="false"/>
-                <w:b w:val="false"/>
-                <w:u w:val="none"/>
-                <w:sz w:val="18"/>
-                <w:szCs w:val="18"/>
-                <w:color w:val="000000"/>
-              </w:rPr>
-              <w:t xml:space="preserve">AFDB - African Development Bank</w:t>
-            </w:r>
-          </w:p>
-        </w:tc>
-        <w:tc>
-          <w:tcPr>
-            <w:tcBorders>
-              <w:bottom w:val="none" w:sz="0" w:space="0" w:color="000000"/>
-              <w:top w:val="none" w:sz="0" w:space="0" w:color="000000"/>
-              <w:left w:val="none" w:sz="0" w:space="0" w:color="000000"/>
-              <w:right w:val="none" w:sz="0" w:space="0" w:color="000000"/>
-            </w:tcBorders>
-            <w:shd w:val="clear" w:color="auto" w:fill="FFA274"/>
-            <w:tcMar>
-              <w:top w:w="0" w:type="dxa"/>
-              <w:bottom w:w="0" w:type="dxa"/>
-              <w:left w:w="0" w:type="dxa"/>
-              <w:right w:w="0" w:type="dxa"/>
-            </w:tcMar>
-            <w:vAlign w:val="center"/>
-          </w:tcPr>
-          <w:p>
-            <w:pPr>
-              <w:pStyle w:val="Normal"/>
-              <w:jc w:val="right"/>
-              <w:pBdr>
-                <w:bottom w:val="none" w:sz="0" w:space="0" w:color="000000"/>
-                <w:top w:val="none" w:sz="0" w:space="0" w:color="000000"/>
-                <w:left w:val="none" w:sz="0" w:space="0" w:color="000000"/>
-                <w:right w:val="none" w:sz="0" w:space="0" w:color="000000"/>
-              </w:pBdr>
-              <w:spacing w:after="100" w:before="100" w:line="240"/>
-              <w:ind w:left="100" w:right="100" w:firstLine="0" w:firstLineChars="0"/>
-            </w:pPr>
-            <w:r xmlns:w="http://schemas.openxmlformats.org/wordprocessingml/2006/main" xmlns:wp="http://schemas.openxmlformats.org/drawingml/2006/wordprocessingDrawing" xmlns:r="http://schemas.openxmlformats.org/officeDocument/2006/relationships" xmlns:w14="http://schemas.microsoft.com/office/word/2010/wordml">
-              <w:rPr>
-                <w:rFonts w:ascii="Cambria" w:hAnsi="Cambria" w:eastAsia="Cambria" w:cs="Cambria"/>
-                <w:i w:val="false"/>
-                <w:b w:val="false"/>
-                <w:u w:val="none"/>
-                <w:sz w:val="18"/>
-                <w:szCs w:val="18"/>
-                <w:color w:val="000000"/>
-              </w:rPr>
-              <w:t xml:space="preserve">1,9</w:t>
-            </w:r>
-          </w:p>
-        </w:tc>
-      </w:tr>
-      <w:tr>
-        <w:trPr>
-          <w:trHeight w:val="360" w:hRule="exact"/>
-        </w:trPr>
-        body 4
-        <w:tc>
-          <w:tcPr>
-            <w:tcBorders>
-              <w:bottom w:val="none" w:sz="0" w:space="0" w:color="000000"/>
-              <w:top w:val="none" w:sz="0" w:space="0" w:color="000000"/>
-              <w:left w:val="none" w:sz="0" w:space="0" w:color="000000"/>
-              <w:right w:val="none" w:sz="0" w:space="0" w:color="000000"/>
-            </w:tcBorders>
-            <w:shd w:val="clear" w:color="auto" w:fill="FFFFFF"/>
-            <w:tcMar>
-              <w:top w:w="0" w:type="dxa"/>
-              <w:bottom w:w="0" w:type="dxa"/>
-              <w:left w:w="0" w:type="dxa"/>
-              <w:right w:w="0" w:type="dxa"/>
-            </w:tcMar>
-            <w:vAlign w:val="center"/>
-          </w:tcPr>
-          <w:p>
-            <w:pPr>
-              <w:pStyle w:val="Normal"/>
-              <w:jc w:val="left"/>
-              <w:pBdr>
-                <w:bottom w:val="none" w:sz="0" w:space="0" w:color="000000"/>
-                <w:top w:val="none" w:sz="0" w:space="0" w:color="000000"/>
-                <w:left w:val="none" w:sz="0" w:space="0" w:color="000000"/>
-                <w:right w:val="none" w:sz="0" w:space="0" w:color="000000"/>
-              </w:pBdr>
-              <w:spacing w:after="100" w:before="100" w:line="240"/>
-              <w:ind w:left="100" w:right="100" w:firstLine="0" w:firstLineChars="0"/>
-            </w:pPr>
-            <w:r xmlns:w="http://schemas.openxmlformats.org/wordprocessingml/2006/main" xmlns:wp="http://schemas.openxmlformats.org/drawingml/2006/wordprocessingDrawing" xmlns:r="http://schemas.openxmlformats.org/officeDocument/2006/relationships" xmlns:w14="http://schemas.microsoft.com/office/word/2010/wordml">
-              <w:rPr>
-                <w:rFonts w:ascii="Cambria" w:hAnsi="Cambria" w:eastAsia="Cambria" w:cs="Cambria"/>
-                <w:i w:val="false"/>
-                <w:b w:val="false"/>
-                <w:u w:val="none"/>
-                <w:sz w:val="18"/>
-                <w:szCs w:val="18"/>
-                <w:color w:val="000000"/>
-              </w:rPr>
-              <w:t xml:space="preserve">IDA - International Development Association</w:t>
-            </w:r>
-          </w:p>
-        </w:tc>
-        <w:tc>
-          <w:tcPr>
-            <w:tcBorders>
-              <w:bottom w:val="none" w:sz="0" w:space="0" w:color="000000"/>
-              <w:top w:val="none" w:sz="0" w:space="0" w:color="000000"/>
-              <w:left w:val="none" w:sz="0" w:space="0" w:color="000000"/>
-              <w:right w:val="none" w:sz="0" w:space="0" w:color="000000"/>
-            </w:tcBorders>
-            <w:shd w:val="clear" w:color="auto" w:fill="FFFFFF"/>
-            <w:tcMar>
-              <w:top w:w="0" w:type="dxa"/>
-              <w:bottom w:w="0" w:type="dxa"/>
-              <w:left w:w="0" w:type="dxa"/>
-              <w:right w:w="0" w:type="dxa"/>
-            </w:tcMar>
-            <w:vAlign w:val="center"/>
-          </w:tcPr>
-          <w:p>
-            <w:pPr>
-              <w:pStyle w:val="Normal"/>
-              <w:jc w:val="right"/>
-              <w:pBdr>
-                <w:bottom w:val="none" w:sz="0" w:space="0" w:color="000000"/>
-                <w:top w:val="none" w:sz="0" w:space="0" w:color="000000"/>
-                <w:left w:val="none" w:sz="0" w:space="0" w:color="000000"/>
-                <w:right w:val="none" w:sz="0" w:space="0" w:color="000000"/>
-              </w:pBdr>
-              <w:spacing w:after="100" w:before="100" w:line="240"/>
-              <w:ind w:left="100" w:right="100" w:firstLine="0" w:firstLineChars="0"/>
-            </w:pPr>
-            <w:r xmlns:w="http://schemas.openxmlformats.org/wordprocessingml/2006/main" xmlns:wp="http://schemas.openxmlformats.org/drawingml/2006/wordprocessingDrawing" xmlns:r="http://schemas.openxmlformats.org/officeDocument/2006/relationships" xmlns:w14="http://schemas.microsoft.com/office/word/2010/wordml">
-              <w:rPr>
-                <w:rFonts w:ascii="Cambria" w:hAnsi="Cambria" w:eastAsia="Cambria" w:cs="Cambria"/>
-                <w:i w:val="false"/>
-                <w:b w:val="false"/>
-                <w:u w:val="none"/>
-                <w:sz w:val="18"/>
-                <w:szCs w:val="18"/>
-                <w:color w:val="000000"/>
-              </w:rPr>
-              <w:t xml:space="preserve">29</w:t>
-            </w:r>
-          </w:p>
-        </w:tc>
-      </w:tr>
-      <w:tr>
-        <w:trPr>
-          <w:trHeight w:val="360" w:hRule="exact"/>
-        </w:trPr>
-        body 5
-        <w:tc>
-          <w:tcPr>
-            <w:tcBorders>
-              <w:bottom w:val="none" w:sz="0" w:space="0" w:color="000000"/>
-              <w:top w:val="none" w:sz="0" w:space="0" w:color="000000"/>
-              <w:left w:val="none" w:sz="0" w:space="0" w:color="000000"/>
-              <w:right w:val="none" w:sz="0" w:space="0" w:color="000000"/>
-            </w:tcBorders>
-            <w:shd w:val="clear" w:color="auto" w:fill="FFA274"/>
-            <w:tcMar>
-              <w:top w:w="0" w:type="dxa"/>
-              <w:bottom w:w="0" w:type="dxa"/>
-              <w:left w:w="0" w:type="dxa"/>
-              <w:right w:w="0" w:type="dxa"/>
-            </w:tcMar>
-            <w:vAlign w:val="center"/>
-          </w:tcPr>
-          <w:p>
-            <w:pPr>
-              <w:pStyle w:val="Normal"/>
-              <w:jc w:val="left"/>
-              <w:pBdr>
-                <w:bottom w:val="none" w:sz="0" w:space="0" w:color="000000"/>
-                <w:top w:val="none" w:sz="0" w:space="0" w:color="000000"/>
-                <w:left w:val="none" w:sz="0" w:space="0" w:color="000000"/>
-                <w:right w:val="none" w:sz="0" w:space="0" w:color="000000"/>
-              </w:pBdr>
-              <w:spacing w:after="100" w:before="100" w:line="240"/>
-              <w:ind w:left="100" w:right="100" w:firstLine="0" w:firstLineChars="0"/>
-            </w:pPr>
-            <w:r xmlns:w="http://schemas.openxmlformats.org/wordprocessingml/2006/main" xmlns:wp="http://schemas.openxmlformats.org/drawingml/2006/wordprocessingDrawing" xmlns:r="http://schemas.openxmlformats.org/officeDocument/2006/relationships" xmlns:w14="http://schemas.microsoft.com/office/word/2010/wordml">
-              <w:rPr>
-                <w:rFonts w:ascii="Cambria" w:hAnsi="Cambria" w:eastAsia="Cambria" w:cs="Cambria"/>
-                <w:i w:val="false"/>
-                <w:b w:val="false"/>
-                <w:u w:val="none"/>
-                <w:sz w:val="18"/>
-                <w:szCs w:val="18"/>
-                <w:color w:val="000000"/>
-              </w:rPr>
-              <w:t xml:space="preserve">GAVI - Global Alliance for Vaccines and Immunization</w:t>
-            </w:r>
-          </w:p>
-        </w:tc>
-        <w:tc>
-          <w:tcPr>
-            <w:tcBorders>
-              <w:bottom w:val="none" w:sz="0" w:space="0" w:color="000000"/>
-              <w:top w:val="none" w:sz="0" w:space="0" w:color="000000"/>
-              <w:left w:val="none" w:sz="0" w:space="0" w:color="000000"/>
-              <w:right w:val="none" w:sz="0" w:space="0" w:color="000000"/>
-            </w:tcBorders>
-            <w:shd w:val="clear" w:color="auto" w:fill="FFA274"/>
-            <w:tcMar>
-              <w:top w:w="0" w:type="dxa"/>
-              <w:bottom w:w="0" w:type="dxa"/>
-              <w:left w:w="0" w:type="dxa"/>
-              <w:right w:w="0" w:type="dxa"/>
-            </w:tcMar>
-            <w:vAlign w:val="center"/>
-          </w:tcPr>
-          <w:p>
-            <w:pPr>
-              <w:pStyle w:val="Normal"/>
-              <w:jc w:val="right"/>
-              <w:pBdr>
-                <w:bottom w:val="none" w:sz="0" w:space="0" w:color="000000"/>
-                <w:top w:val="none" w:sz="0" w:space="0" w:color="000000"/>
-                <w:left w:val="none" w:sz="0" w:space="0" w:color="000000"/>
-                <w:right w:val="none" w:sz="0" w:space="0" w:color="000000"/>
-              </w:pBdr>
-              <w:spacing w:after="100" w:before="100" w:line="240"/>
-              <w:ind w:left="100" w:right="100" w:firstLine="0" w:firstLineChars="0"/>
-            </w:pPr>
-            <w:r xmlns:w="http://schemas.openxmlformats.org/wordprocessingml/2006/main" xmlns:wp="http://schemas.openxmlformats.org/drawingml/2006/wordprocessingDrawing" xmlns:r="http://schemas.openxmlformats.org/officeDocument/2006/relationships" xmlns:w14="http://schemas.microsoft.com/office/word/2010/wordml">
-              <w:rPr>
-                <w:rFonts w:ascii="Cambria" w:hAnsi="Cambria" w:eastAsia="Cambria" w:cs="Cambria"/>
-                <w:i w:val="false"/>
-                <w:b w:val="false"/>
-                <w:u w:val="none"/>
-                <w:sz w:val="18"/>
-                <w:szCs w:val="18"/>
-                <w:color w:val="000000"/>
-              </w:rPr>
-              <w:t xml:space="preserve">27</w:t>
-            </w:r>
-          </w:p>
-        </w:tc>
-      </w:tr>
-      <w:tr>
-        <w:trPr>
-          <w:trHeight w:val="360" w:hRule="exact"/>
-        </w:trPr>
-        body 6
-        <w:tc>
-          <w:tcPr>
-            <w:tcBorders>
-              <w:bottom w:val="none" w:sz="0" w:space="0" w:color="000000"/>
-              <w:top w:val="none" w:sz="0" w:space="0" w:color="000000"/>
-              <w:left w:val="none" w:sz="0" w:space="0" w:color="000000"/>
-              <w:right w:val="none" w:sz="0" w:space="0" w:color="000000"/>
-            </w:tcBorders>
-            <w:shd w:val="clear" w:color="auto" w:fill="FFFFFF"/>
-            <w:tcMar>
-              <w:top w:w="0" w:type="dxa"/>
-              <w:bottom w:w="0" w:type="dxa"/>
-              <w:left w:w="0" w:type="dxa"/>
-              <w:right w:w="0" w:type="dxa"/>
-            </w:tcMar>
-            <w:vAlign w:val="center"/>
-          </w:tcPr>
-          <w:p>
-            <w:pPr>
-              <w:pStyle w:val="Normal"/>
-              <w:jc w:val="left"/>
-              <w:pBdr>
-                <w:bottom w:val="none" w:sz="0" w:space="0" w:color="000000"/>
-                <w:top w:val="none" w:sz="0" w:space="0" w:color="000000"/>
-                <w:left w:val="none" w:sz="0" w:space="0" w:color="000000"/>
-                <w:right w:val="none" w:sz="0" w:space="0" w:color="000000"/>
-              </w:pBdr>
-              <w:spacing w:after="100" w:before="100" w:line="240"/>
-              <w:ind w:left="100" w:right="100" w:firstLine="0" w:firstLineChars="0"/>
-            </w:pPr>
-            <w:r xmlns:w="http://schemas.openxmlformats.org/wordprocessingml/2006/main" xmlns:wp="http://schemas.openxmlformats.org/drawingml/2006/wordprocessingDrawing" xmlns:r="http://schemas.openxmlformats.org/officeDocument/2006/relationships" xmlns:w14="http://schemas.microsoft.com/office/word/2010/wordml">
-              <w:rPr>
-                <w:rFonts w:ascii="Cambria" w:hAnsi="Cambria" w:eastAsia="Cambria" w:cs="Cambria"/>
-                <w:i w:val="false"/>
-                <w:b w:val="false"/>
-                <w:u w:val="none"/>
-                <w:sz w:val="18"/>
-                <w:szCs w:val="18"/>
-                <w:color w:val="000000"/>
-              </w:rPr>
-              <w:t xml:space="preserve">UNDP - UN Development Programme</w:t>
-            </w:r>
-          </w:p>
-        </w:tc>
-        <w:tc>
-          <w:tcPr>
-            <w:tcBorders>
-              <w:bottom w:val="none" w:sz="0" w:space="0" w:color="000000"/>
-              <w:top w:val="none" w:sz="0" w:space="0" w:color="000000"/>
-              <w:left w:val="none" w:sz="0" w:space="0" w:color="000000"/>
-              <w:right w:val="none" w:sz="0" w:space="0" w:color="000000"/>
-            </w:tcBorders>
-            <w:shd w:val="clear" w:color="auto" w:fill="FFFFFF"/>
-            <w:tcMar>
-              <w:top w:w="0" w:type="dxa"/>
-              <w:bottom w:w="0" w:type="dxa"/>
-              <w:left w:w="0" w:type="dxa"/>
-              <w:right w:w="0" w:type="dxa"/>
-            </w:tcMar>
-            <w:vAlign w:val="center"/>
-          </w:tcPr>
-          <w:p>
-            <w:pPr>
-              <w:pStyle w:val="Normal"/>
-              <w:jc w:val="right"/>
-              <w:pBdr>
-                <w:bottom w:val="none" w:sz="0" w:space="0" w:color="000000"/>
-                <w:top w:val="none" w:sz="0" w:space="0" w:color="000000"/>
-                <w:left w:val="none" w:sz="0" w:space="0" w:color="000000"/>
-                <w:right w:val="none" w:sz="0" w:space="0" w:color="000000"/>
-              </w:pBdr>
-              <w:spacing w:after="100" w:before="100" w:line="240"/>
-              <w:ind w:left="100" w:right="100" w:firstLine="0" w:firstLineChars="0"/>
-            </w:pPr>
-            <w:r xmlns:w="http://schemas.openxmlformats.org/wordprocessingml/2006/main" xmlns:wp="http://schemas.openxmlformats.org/drawingml/2006/wordprocessingDrawing" xmlns:r="http://schemas.openxmlformats.org/officeDocument/2006/relationships" xmlns:w14="http://schemas.microsoft.com/office/word/2010/wordml">
-              <w:rPr>
-                <w:rFonts w:ascii="Cambria" w:hAnsi="Cambria" w:eastAsia="Cambria" w:cs="Cambria"/>
-                <w:i w:val="false"/>
-                <w:b w:val="false"/>
-                <w:u w:val="none"/>
-                <w:sz w:val="18"/>
-                <w:szCs w:val="18"/>
-                <w:color w:val="000000"/>
-              </w:rPr>
-              <w:t xml:space="preserve">10</w:t>
-            </w:r>
-          </w:p>
-        </w:tc>
-      </w:tr>
-      <w:tr>
-        <w:trPr>
-          <w:trHeight w:val="360" w:hRule="exact"/>
-        </w:trPr>
-        body 7
-        <w:tc>
-          <w:tcPr>
-            <w:tcBorders>
-              <w:bottom w:val="none" w:sz="0" w:space="0" w:color="000000"/>
-              <w:top w:val="none" w:sz="0" w:space="0" w:color="000000"/>
-              <w:left w:val="none" w:sz="0" w:space="0" w:color="000000"/>
-              <w:right w:val="none" w:sz="0" w:space="0" w:color="000000"/>
-            </w:tcBorders>
-            <w:shd w:val="clear" w:color="auto" w:fill="FFA274"/>
-            <w:tcMar>
-              <w:top w:w="0" w:type="dxa"/>
-              <w:bottom w:w="0" w:type="dxa"/>
-              <w:left w:w="0" w:type="dxa"/>
-              <w:right w:w="0" w:type="dxa"/>
-            </w:tcMar>
-            <w:vAlign w:val="center"/>
-          </w:tcPr>
-          <w:p>
-            <w:pPr>
-              <w:pStyle w:val="Normal"/>
-              <w:jc w:val="left"/>
-              <w:pBdr>
-                <w:bottom w:val="none" w:sz="0" w:space="0" w:color="000000"/>
-                <w:top w:val="none" w:sz="0" w:space="0" w:color="000000"/>
-                <w:left w:val="none" w:sz="0" w:space="0" w:color="000000"/>
-                <w:right w:val="none" w:sz="0" w:space="0" w:color="000000"/>
-              </w:pBdr>
-              <w:spacing w:after="100" w:before="100" w:line="240"/>
-              <w:ind w:left="100" w:right="100" w:firstLine="0" w:firstLineChars="0"/>
-            </w:pPr>
-            <w:r xmlns:w="http://schemas.openxmlformats.org/wordprocessingml/2006/main" xmlns:wp="http://schemas.openxmlformats.org/drawingml/2006/wordprocessingDrawing" xmlns:r="http://schemas.openxmlformats.org/officeDocument/2006/relationships" xmlns:w14="http://schemas.microsoft.com/office/word/2010/wordml">
-              <w:rPr>
-                <w:rFonts w:ascii="Cambria" w:hAnsi="Cambria" w:eastAsia="Cambria" w:cs="Cambria"/>
-                <w:i w:val="false"/>
-                <w:b w:val="false"/>
-                <w:u w:val="none"/>
-                <w:sz w:val="18"/>
-                <w:szCs w:val="18"/>
-                <w:color w:val="000000"/>
-              </w:rPr>
-              <w:t xml:space="preserve">UNICEF - United Nations Children's Fund</w:t>
-            </w:r>
-          </w:p>
-        </w:tc>
-        <w:tc>
-          <w:tcPr>
-            <w:tcBorders>
-              <w:bottom w:val="none" w:sz="0" w:space="0" w:color="000000"/>
-              <w:top w:val="none" w:sz="0" w:space="0" w:color="000000"/>
-              <w:left w:val="none" w:sz="0" w:space="0" w:color="000000"/>
-              <w:right w:val="none" w:sz="0" w:space="0" w:color="000000"/>
-            </w:tcBorders>
-            <w:shd w:val="clear" w:color="auto" w:fill="FFA274"/>
-            <w:tcMar>
-              <w:top w:w="0" w:type="dxa"/>
-              <w:bottom w:w="0" w:type="dxa"/>
-              <w:left w:w="0" w:type="dxa"/>
-              <w:right w:w="0" w:type="dxa"/>
-            </w:tcMar>
-            <w:vAlign w:val="center"/>
-          </w:tcPr>
-          <w:p>
-            <w:pPr>
-              <w:pStyle w:val="Normal"/>
-              <w:jc w:val="right"/>
-              <w:pBdr>
-                <w:bottom w:val="none" w:sz="0" w:space="0" w:color="000000"/>
-                <w:top w:val="none" w:sz="0" w:space="0" w:color="000000"/>
-                <w:left w:val="none" w:sz="0" w:space="0" w:color="000000"/>
-                <w:right w:val="none" w:sz="0" w:space="0" w:color="000000"/>
-              </w:pBdr>
-              <w:spacing w:after="100" w:before="100" w:line="240"/>
-              <w:ind w:left="100" w:right="100" w:firstLine="0" w:firstLineChars="0"/>
-            </w:pPr>
-            <w:r xmlns:w="http://schemas.openxmlformats.org/wordprocessingml/2006/main" xmlns:wp="http://schemas.openxmlformats.org/drawingml/2006/wordprocessingDrawing" xmlns:r="http://schemas.openxmlformats.org/officeDocument/2006/relationships" xmlns:w14="http://schemas.microsoft.com/office/word/2010/wordml">
-              <w:rPr>
-                <w:rFonts w:ascii="Cambria" w:hAnsi="Cambria" w:eastAsia="Cambria" w:cs="Cambria"/>
-                <w:i w:val="false"/>
-                <w:b w:val="false"/>
-                <w:u w:val="none"/>
-                <w:sz w:val="18"/>
-                <w:szCs w:val="18"/>
-                <w:color w:val="000000"/>
-              </w:rPr>
-              <w:t xml:space="preserve">9</w:t>
-            </w:r>
-          </w:p>
-        </w:tc>
-      </w:tr>
-      <w:tr>
-        <w:trPr>
-          <w:trHeight w:val="360" w:hRule="exact"/>
-        </w:trPr>
-        body 8
-        <w:tc>
-          <w:tcPr>
-            <w:tcBorders>
-              <w:bottom w:val="none" w:sz="0" w:space="0" w:color="000000"/>
-              <w:top w:val="none" w:sz="0" w:space="0" w:color="000000"/>
-              <w:left w:val="none" w:sz="0" w:space="0" w:color="000000"/>
-              <w:right w:val="none" w:sz="0" w:space="0" w:color="000000"/>
-            </w:tcBorders>
-            <w:shd w:val="clear" w:color="auto" w:fill="FFFFFF"/>
-            <w:tcMar>
-              <w:top w:w="0" w:type="dxa"/>
-              <w:bottom w:w="0" w:type="dxa"/>
-              <w:left w:w="0" w:type="dxa"/>
-              <w:right w:w="0" w:type="dxa"/>
-            </w:tcMar>
-            <w:vAlign w:val="center"/>
-          </w:tcPr>
-          <w:p>
-            <w:pPr>
-              <w:pStyle w:val="Normal"/>
-              <w:jc w:val="left"/>
-              <w:pBdr>
-                <w:bottom w:val="none" w:sz="0" w:space="0" w:color="000000"/>
-                <w:top w:val="none" w:sz="0" w:space="0" w:color="000000"/>
-                <w:left w:val="none" w:sz="0" w:space="0" w:color="000000"/>
-                <w:right w:val="none" w:sz="0" w:space="0" w:color="000000"/>
-              </w:pBdr>
-              <w:spacing w:after="100" w:before="100" w:line="240"/>
-              <w:ind w:left="100" w:right="100" w:firstLine="0" w:firstLineChars="0"/>
-            </w:pPr>
-            <w:r xmlns:w="http://schemas.openxmlformats.org/wordprocessingml/2006/main" xmlns:wp="http://schemas.openxmlformats.org/drawingml/2006/wordprocessingDrawing" xmlns:r="http://schemas.openxmlformats.org/officeDocument/2006/relationships" xmlns:w14="http://schemas.microsoft.com/office/word/2010/wordml">
-              <w:rPr>
-                <w:rFonts w:ascii="Cambria" w:hAnsi="Cambria" w:eastAsia="Cambria" w:cs="Cambria"/>
-                <w:i w:val="false"/>
-                <w:b w:val="false"/>
-                <w:u w:val="none"/>
-                <w:sz w:val="18"/>
-                <w:szCs w:val="18"/>
-                <w:color w:val="000000"/>
-              </w:rPr>
-              <w:t xml:space="preserve">UNFPA - UN Population Fund</w:t>
-            </w:r>
-          </w:p>
-        </w:tc>
-        <w:tc>
-          <w:tcPr>
-            <w:tcBorders>
-              <w:bottom w:val="none" w:sz="0" w:space="0" w:color="000000"/>
-              <w:top w:val="none" w:sz="0" w:space="0" w:color="000000"/>
-              <w:left w:val="none" w:sz="0" w:space="0" w:color="000000"/>
-              <w:right w:val="none" w:sz="0" w:space="0" w:color="000000"/>
-            </w:tcBorders>
-            <w:shd w:val="clear" w:color="auto" w:fill="FFFFFF"/>
-            <w:tcMar>
-              <w:top w:w="0" w:type="dxa"/>
-              <w:bottom w:w="0" w:type="dxa"/>
-              <w:left w:w="0" w:type="dxa"/>
-              <w:right w:w="0" w:type="dxa"/>
-            </w:tcMar>
-            <w:vAlign w:val="center"/>
-          </w:tcPr>
-          <w:p>
-            <w:pPr>
-              <w:pStyle w:val="Normal"/>
-              <w:jc w:val="right"/>
-              <w:pBdr>
-                <w:bottom w:val="none" w:sz="0" w:space="0" w:color="000000"/>
-                <w:top w:val="none" w:sz="0" w:space="0" w:color="000000"/>
-                <w:left w:val="none" w:sz="0" w:space="0" w:color="000000"/>
-                <w:right w:val="none" w:sz="0" w:space="0" w:color="000000"/>
-              </w:pBdr>
-              <w:spacing w:after="100" w:before="100" w:line="240"/>
-              <w:ind w:left="100" w:right="100" w:firstLine="0" w:firstLineChars="0"/>
-            </w:pPr>
-            <w:r xmlns:w="http://schemas.openxmlformats.org/wordprocessingml/2006/main" xmlns:wp="http://schemas.openxmlformats.org/drawingml/2006/wordprocessingDrawing" xmlns:r="http://schemas.openxmlformats.org/officeDocument/2006/relationships" xmlns:w14="http://schemas.microsoft.com/office/word/2010/wordml">
-              <w:rPr>
-                <w:rFonts w:ascii="Cambria" w:hAnsi="Cambria" w:eastAsia="Cambria" w:cs="Cambria"/>
-                <w:i w:val="false"/>
-                <w:b w:val="false"/>
-                <w:u w:val="none"/>
-                <w:sz w:val="18"/>
-                <w:szCs w:val="18"/>
-                <w:color w:val="000000"/>
-              </w:rPr>
-              <w:t xml:space="preserve">5</w:t>
-            </w:r>
-          </w:p>
-        </w:tc>
-      </w:tr>
-      <w:tr>
-        <w:trPr>
-          <w:trHeight w:val="360" w:hRule="exact"/>
-        </w:trPr>
-        body 9
-        <w:tc>
-          <w:tcPr>
-            <w:tcBorders>
-              <w:bottom w:val="none" w:sz="0" w:space="0" w:color="000000"/>
-              <w:top w:val="none" w:sz="0" w:space="0" w:color="000000"/>
-              <w:left w:val="none" w:sz="0" w:space="0" w:color="000000"/>
-              <w:right w:val="none" w:sz="0" w:space="0" w:color="000000"/>
-            </w:tcBorders>
-            <w:shd w:val="clear" w:color="auto" w:fill="FFA274"/>
-            <w:tcMar>
-              <w:top w:w="0" w:type="dxa"/>
-              <w:bottom w:w="0" w:type="dxa"/>
-              <w:left w:w="0" w:type="dxa"/>
-              <w:right w:w="0" w:type="dxa"/>
-            </w:tcMar>
-            <w:vAlign w:val="center"/>
-          </w:tcPr>
-          <w:p>
-            <w:pPr>
-              <w:pStyle w:val="Normal"/>
-              <w:jc w:val="left"/>
-              <w:pBdr>
-                <w:bottom w:val="none" w:sz="0" w:space="0" w:color="000000"/>
-                <w:top w:val="none" w:sz="0" w:space="0" w:color="000000"/>
-                <w:left w:val="none" w:sz="0" w:space="0" w:color="000000"/>
-                <w:right w:val="none" w:sz="0" w:space="0" w:color="000000"/>
-              </w:pBdr>
-              <w:spacing w:after="100" w:before="100" w:line="240"/>
-              <w:ind w:left="100" w:right="100" w:firstLine="0" w:firstLineChars="0"/>
-            </w:pPr>
-            <w:r xmlns:w="http://schemas.openxmlformats.org/wordprocessingml/2006/main" xmlns:wp="http://schemas.openxmlformats.org/drawingml/2006/wordprocessingDrawing" xmlns:r="http://schemas.openxmlformats.org/officeDocument/2006/relationships" xmlns:w14="http://schemas.microsoft.com/office/word/2010/wordml">
-              <w:rPr>
-                <w:rFonts w:ascii="Cambria" w:hAnsi="Cambria" w:eastAsia="Cambria" w:cs="Cambria"/>
-                <w:i w:val="false"/>
-                <w:b w:val="false"/>
-                <w:u w:val="none"/>
-                <w:sz w:val="18"/>
-                <w:szCs w:val="18"/>
-                <w:color w:val="000000"/>
-              </w:rPr>
-              <w:t xml:space="preserve">WFP - World Food Programme</w:t>
-            </w:r>
-          </w:p>
-        </w:tc>
-        <w:tc>
-          <w:tcPr>
-            <w:tcBorders>
-              <w:bottom w:val="none" w:sz="0" w:space="0" w:color="000000"/>
-              <w:top w:val="none" w:sz="0" w:space="0" w:color="000000"/>
-              <w:left w:val="none" w:sz="0" w:space="0" w:color="000000"/>
-              <w:right w:val="none" w:sz="0" w:space="0" w:color="000000"/>
-            </w:tcBorders>
-            <w:shd w:val="clear" w:color="auto" w:fill="FFA274"/>
-            <w:tcMar>
-              <w:top w:w="0" w:type="dxa"/>
-              <w:bottom w:w="0" w:type="dxa"/>
-              <w:left w:w="0" w:type="dxa"/>
-              <w:right w:w="0" w:type="dxa"/>
-            </w:tcMar>
-            <w:vAlign w:val="center"/>
-          </w:tcPr>
-          <w:p>
-            <w:pPr>
-              <w:pStyle w:val="Normal"/>
-              <w:jc w:val="right"/>
-              <w:pBdr>
-                <w:bottom w:val="none" w:sz="0" w:space="0" w:color="000000"/>
-                <w:top w:val="none" w:sz="0" w:space="0" w:color="000000"/>
-                <w:left w:val="none" w:sz="0" w:space="0" w:color="000000"/>
-                <w:right w:val="none" w:sz="0" w:space="0" w:color="000000"/>
-              </w:pBdr>
-              <w:spacing w:after="100" w:before="100" w:line="240"/>
-              <w:ind w:left="100" w:right="100" w:firstLine="0" w:firstLineChars="0"/>
-            </w:pPr>
-            <w:r xmlns:w="http://schemas.openxmlformats.org/wordprocessingml/2006/main" xmlns:wp="http://schemas.openxmlformats.org/drawingml/2006/wordprocessingDrawing" xmlns:r="http://schemas.openxmlformats.org/officeDocument/2006/relationships" xmlns:w14="http://schemas.microsoft.com/office/word/2010/wordml">
-              <w:rPr>
-                <w:rFonts w:ascii="Cambria" w:hAnsi="Cambria" w:eastAsia="Cambria" w:cs="Cambria"/>
-                <w:i w:val="false"/>
-                <w:b w:val="false"/>
-                <w:u w:val="none"/>
-                <w:sz w:val="18"/>
-                <w:szCs w:val="18"/>
-                <w:color w:val="000000"/>
-              </w:rPr>
-              <w:t xml:space="preserve">1,7</w:t>
-            </w:r>
-          </w:p>
-        </w:tc>
-      </w:tr>
-      <w:tr>
-        <w:trPr>
-          <w:trHeight w:val="360" w:hRule="exact"/>
-        </w:trPr>
-        body10
-        <w:tc>
-          <w:tcPr>
-            <w:tcBorders>
-              <w:bottom w:val="none" w:sz="0" w:space="0" w:color="000000"/>
-              <w:top w:val="none" w:sz="0" w:space="0" w:color="000000"/>
-              <w:left w:val="none" w:sz="0" w:space="0" w:color="000000"/>
-              <w:right w:val="none" w:sz="0" w:space="0" w:color="000000"/>
-            </w:tcBorders>
-            <w:shd w:val="clear" w:color="auto" w:fill="FFFFFF"/>
-            <w:tcMar>
-              <w:top w:w="0" w:type="dxa"/>
-              <w:bottom w:w="0" w:type="dxa"/>
-              <w:left w:w="0" w:type="dxa"/>
-              <w:right w:w="0" w:type="dxa"/>
-            </w:tcMar>
-            <w:vAlign w:val="center"/>
-          </w:tcPr>
-          <w:p>
-            <w:pPr>
-              <w:pStyle w:val="Normal"/>
-              <w:jc w:val="left"/>
-              <w:pBdr>
-                <w:bottom w:val="none" w:sz="0" w:space="0" w:color="000000"/>
-                <w:top w:val="none" w:sz="0" w:space="0" w:color="000000"/>
-                <w:left w:val="none" w:sz="0" w:space="0" w:color="000000"/>
-                <w:right w:val="none" w:sz="0" w:space="0" w:color="000000"/>
-              </w:pBdr>
-              <w:spacing w:after="100" w:before="100" w:line="240"/>
-              <w:ind w:left="100" w:right="100" w:firstLine="0" w:firstLineChars="0"/>
-            </w:pPr>
-            <w:r xmlns:w="http://schemas.openxmlformats.org/wordprocessingml/2006/main" xmlns:wp="http://schemas.openxmlformats.org/drawingml/2006/wordprocessingDrawing" xmlns:r="http://schemas.openxmlformats.org/officeDocument/2006/relationships" xmlns:w14="http://schemas.microsoft.com/office/word/2010/wordml">
-              <w:rPr>
-                <w:rFonts w:ascii="Cambria" w:hAnsi="Cambria" w:eastAsia="Cambria" w:cs="Cambria"/>
-                <w:i w:val="false"/>
-                <w:b w:val="false"/>
-                <w:u w:val="none"/>
-                <w:sz w:val="18"/>
-                <w:szCs w:val="18"/>
-                <w:color w:val="000000"/>
-              </w:rPr>
-              <w:t xml:space="preserve">GEF - Global Environment Facility</w:t>
-            </w:r>
-          </w:p>
-        </w:tc>
-        <w:tc>
-          <w:tcPr>
-            <w:tcBorders>
-              <w:bottom w:val="none" w:sz="0" w:space="0" w:color="000000"/>
-              <w:top w:val="none" w:sz="0" w:space="0" w:color="000000"/>
-              <w:left w:val="none" w:sz="0" w:space="0" w:color="000000"/>
-              <w:right w:val="none" w:sz="0" w:space="0" w:color="000000"/>
-            </w:tcBorders>
-            <w:shd w:val="clear" w:color="auto" w:fill="FFFFFF"/>
-            <w:tcMar>
-              <w:top w:w="0" w:type="dxa"/>
-              <w:bottom w:w="0" w:type="dxa"/>
-              <w:left w:w="0" w:type="dxa"/>
-              <w:right w:w="0" w:type="dxa"/>
-            </w:tcMar>
-            <w:vAlign w:val="center"/>
-          </w:tcPr>
-          <w:p>
-            <w:pPr>
-              <w:pStyle w:val="Normal"/>
-              <w:jc w:val="right"/>
-              <w:pBdr>
-                <w:bottom w:val="none" w:sz="0" w:space="0" w:color="000000"/>
-                <w:top w:val="none" w:sz="0" w:space="0" w:color="000000"/>
-                <w:left w:val="none" w:sz="0" w:space="0" w:color="000000"/>
-                <w:right w:val="none" w:sz="0" w:space="0" w:color="000000"/>
-              </w:pBdr>
-              <w:spacing w:after="100" w:before="100" w:line="240"/>
-              <w:ind w:left="100" w:right="100" w:firstLine="0" w:firstLineChars="0"/>
-            </w:pPr>
-            <w:r xmlns:w="http://schemas.openxmlformats.org/wordprocessingml/2006/main" xmlns:wp="http://schemas.openxmlformats.org/drawingml/2006/wordprocessingDrawing" xmlns:r="http://schemas.openxmlformats.org/officeDocument/2006/relationships" xmlns:w14="http://schemas.microsoft.com/office/word/2010/wordml">
-              <w:rPr>
-                <w:rFonts w:ascii="Cambria" w:hAnsi="Cambria" w:eastAsia="Cambria" w:cs="Cambria"/>
-                <w:i w:val="false"/>
-                <w:b w:val="false"/>
-                <w:u w:val="none"/>
-                <w:sz w:val="18"/>
-                <w:szCs w:val="18"/>
-                <w:color w:val="000000"/>
-              </w:rPr>
-              <w:t xml:space="preserve">0,6</w:t>
-            </w:r>
-          </w:p>
-        </w:tc>
-      </w:tr>
-      <w:tr>
-        <w:trPr>
-          <w:trHeight w:val="360" w:hRule="exact"/>
-        </w:trPr>
-        body11
-        <w:tc>
-          <w:tcPr>
-            <w:tcBorders>
-              <w:bottom w:val="single" w:sz="8" w:space="0" w:color="000000"/>
-              <w:top w:val="none" w:sz="0" w:space="0" w:color="000000"/>
-              <w:left w:val="none" w:sz="0" w:space="0" w:color="000000"/>
-              <w:right w:val="none" w:sz="0" w:space="0" w:color="000000"/>
-            </w:tcBorders>
-            <w:shd w:val="clear" w:color="auto" w:fill="FFA274"/>
-            <w:tcMar>
-              <w:top w:w="0" w:type="dxa"/>
-              <w:bottom w:w="0" w:type="dxa"/>
-              <w:left w:w="0" w:type="dxa"/>
-              <w:right w:w="0" w:type="dxa"/>
-            </w:tcMar>
-            <w:vAlign w:val="center"/>
-          </w:tcPr>
-          <w:p>
-            <w:pPr>
-              <w:pStyle w:val="Normal"/>
-              <w:jc w:val="left"/>
-              <w:pBdr>
-                <w:bottom w:val="none" w:sz="0" w:space="0" w:color="000000"/>
-                <w:top w:val="none" w:sz="0" w:space="0" w:color="000000"/>
-                <w:left w:val="none" w:sz="0" w:space="0" w:color="000000"/>
-                <w:right w:val="none" w:sz="0" w:space="0" w:color="000000"/>
-              </w:pBdr>
-              <w:spacing w:after="100" w:before="100" w:line="240"/>
-              <w:ind w:left="100" w:right="100" w:firstLine="0" w:firstLineChars="0"/>
-            </w:pPr>
-            <w:r xmlns:w="http://schemas.openxmlformats.org/wordprocessingml/2006/main" xmlns:wp="http://schemas.openxmlformats.org/drawingml/2006/wordprocessingDrawing" xmlns:r="http://schemas.openxmlformats.org/officeDocument/2006/relationships" xmlns:w14="http://schemas.microsoft.com/office/word/2010/wordml">
-              <w:rPr>
-                <w:rFonts w:ascii="Cambria" w:hAnsi="Cambria" w:eastAsia="Cambria" w:cs="Cambria"/>
-                <w:i w:val="false"/>
-                <w:b w:val="false"/>
-                <w:u w:val="none"/>
-                <w:sz w:val="18"/>
-                <w:szCs w:val="18"/>
-                <w:color w:val="000000"/>
-              </w:rPr>
-              <w:t xml:space="preserve">Andre partnere</w:t>
-            </w:r>
-          </w:p>
-        </w:tc>
-        <w:tc>
-          <w:tcPr>
-            <w:tcBorders>
-              <w:bottom w:val="single" w:sz="8" w:space="0" w:color="000000"/>
-              <w:top w:val="none" w:sz="0" w:space="0" w:color="000000"/>
-              <w:left w:val="none" w:sz="0" w:space="0" w:color="000000"/>
-              <w:right w:val="none" w:sz="0" w:space="0" w:color="000000"/>
-            </w:tcBorders>
-            <w:shd w:val="clear" w:color="auto" w:fill="FFA274"/>
-            <w:tcMar>
-              <w:top w:w="0" w:type="dxa"/>
-              <w:bottom w:w="0" w:type="dxa"/>
-              <w:left w:w="0" w:type="dxa"/>
-              <w:right w:w="0" w:type="dxa"/>
-            </w:tcMar>
-            <w:vAlign w:val="center"/>
-          </w:tcPr>
-          <w:p>
-            <w:pPr>
-              <w:pStyle w:val="Normal"/>
-              <w:jc w:val="right"/>
-              <w:pBdr>
-                <w:bottom w:val="none" w:sz="0" w:space="0" w:color="000000"/>
-                <w:top w:val="none" w:sz="0" w:space="0" w:color="000000"/>
-                <w:left w:val="none" w:sz="0" w:space="0" w:color="000000"/>
-                <w:right w:val="none" w:sz="0" w:space="0" w:color="000000"/>
-              </w:pBdr>
-              <w:spacing w:after="100" w:before="100" w:line="240"/>
-              <w:ind w:left="100" w:right="100" w:firstLine="0" w:firstLineChars="0"/>
-            </w:pPr>
-            <w:r xmlns:w="http://schemas.openxmlformats.org/wordprocessingml/2006/main" xmlns:wp="http://schemas.openxmlformats.org/drawingml/2006/wordprocessingDrawing" xmlns:r="http://schemas.openxmlformats.org/officeDocument/2006/relationships" xmlns:w14="http://schemas.microsoft.com/office/word/2010/wordml">
-              <w:rPr>
-                <w:rFonts w:ascii="Cambria" w:hAnsi="Cambria" w:eastAsia="Cambria" w:cs="Cambria"/>
-                <w:i w:val="false"/>
-                <w:b w:val="false"/>
-                <w:u w:val="none"/>
-                <w:sz w:val="18"/>
-                <w:szCs w:val="18"/>
-                <w:color w:val="000000"/>
-              </w:rPr>
-              <w:t xml:space="preserve">0,8</w:t>
-            </w:r>
-          </w:p>
-        </w:tc>
-      </w:tr>
-      <w:tr>
-        <w:trPr>
-          <w:trHeight w:val="360" w:hRule="exact"/>
-        </w:trPr>
-        body12
-        <w:tc>
-          <w:tcPr>
-            <w:tcBorders>
-              <w:bottom w:val="none" w:sz="0" w:space="0" w:color="000000"/>
-              <w:top w:val="single" w:sz="8" w:space="0" w:color="000000"/>
-              <w:left w:val="none" w:sz="0" w:space="0" w:color="000000"/>
-              <w:right w:val="none" w:sz="0" w:space="0" w:color="000000"/>
-            </w:tcBorders>
-            <w:shd w:val="clear" w:color="auto" w:fill="FFFFFF"/>
-            <w:tcMar>
-              <w:top w:w="0" w:type="dxa"/>
-              <w:bottom w:w="0" w:type="dxa"/>
-              <w:left w:w="0" w:type="dxa"/>
-              <w:right w:w="0" w:type="dxa"/>
-            </w:tcMar>
-            <w:vAlign w:val="center"/>
-          </w:tcPr>
-          <w:p>
-            <w:pPr>
-              <w:pStyle w:val="Normal"/>
-              <w:jc w:val="left"/>
-              <w:pBdr>
-                <w:bottom w:val="none" w:sz="0" w:space="0" w:color="000000"/>
-                <w:top w:val="none" w:sz="0" w:space="0" w:color="000000"/>
-                <w:left w:val="none" w:sz="0" w:space="0" w:color="000000"/>
-                <w:right w:val="none" w:sz="0" w:space="0" w:color="000000"/>
-              </w:pBdr>
-              <w:spacing w:after="100" w:before="100" w:line="240"/>
-              <w:ind w:left="100" w:right="100" w:firstLine="0" w:firstLineChars="0"/>
-            </w:pPr>
-            <w:r xmlns:w="http://schemas.openxmlformats.org/wordprocessingml/2006/main" xmlns:wp="http://schemas.openxmlformats.org/drawingml/2006/wordprocessingDrawing" xmlns:r="http://schemas.openxmlformats.org/officeDocument/2006/relationships" xmlns:w14="http://schemas.microsoft.com/office/word/2010/wordml">
-              <w:rPr>
-                <w:rFonts w:ascii="Cambria" w:hAnsi="Cambria" w:eastAsia="Cambria" w:cs="Cambria"/>
-                <w:i w:val="false"/>
-                <w:b w:val="false"/>
-                <w:u w:val="none"/>
-                <w:sz w:val="18"/>
-                <w:szCs w:val="18"/>
-                <w:color w:val="000000"/>
-              </w:rPr>
-              <w:t xml:space="preserve">Total</w:t>
-            </w:r>
-          </w:p>
-        </w:tc>
-        <w:tc>
-          <w:tcPr>
-            <w:tcBorders>
-              <w:bottom w:val="none" w:sz="0" w:space="0" w:color="000000"/>
-              <w:top w:val="single" w:sz="8" w:space="0" w:color="000000"/>
-              <w:left w:val="none" w:sz="0" w:space="0" w:color="000000"/>
-              <w:right w:val="none" w:sz="0" w:space="0" w:color="000000"/>
-            </w:tcBorders>
-            <w:shd w:val="clear" w:color="auto" w:fill="FFFFFF"/>
-            <w:tcMar>
-              <w:top w:w="0" w:type="dxa"/>
-              <w:bottom w:w="0" w:type="dxa"/>
-              <w:left w:w="0" w:type="dxa"/>
-              <w:right w:w="0" w:type="dxa"/>
-            </w:tcMar>
-            <w:vAlign w:val="center"/>
-          </w:tcPr>
-          <w:p>
-            <w:pPr>
-              <w:pStyle w:val="Normal"/>
-              <w:jc w:val="right"/>
-              <w:pBdr>
-                <w:bottom w:val="none" w:sz="0" w:space="0" w:color="000000"/>
-                <w:top w:val="none" w:sz="0" w:space="0" w:color="000000"/>
-                <w:left w:val="none" w:sz="0" w:space="0" w:color="000000"/>
-                <w:right w:val="none" w:sz="0" w:space="0" w:color="000000"/>
-              </w:pBdr>
-              <w:spacing w:after="100" w:before="100" w:line="240"/>
-              <w:ind w:left="100" w:right="100" w:firstLine="0" w:firstLineChars="0"/>
-            </w:pPr>
-            <w:r xmlns:w="http://schemas.openxmlformats.org/wordprocessingml/2006/main" xmlns:wp="http://schemas.openxmlformats.org/drawingml/2006/wordprocessingDrawing" xmlns:r="http://schemas.openxmlformats.org/officeDocument/2006/relationships" xmlns:w14="http://schemas.microsoft.com/office/word/2010/wordml">
-              <w:rPr>
-                <w:rFonts w:ascii="Cambria" w:hAnsi="Cambria" w:eastAsia="Cambria" w:cs="Cambria"/>
-                <w:i w:val="false"/>
-                <w:b w:val="false"/>
-                <w:u w:val="none"/>
-                <w:sz w:val="18"/>
-                <w:szCs w:val="18"/>
-                <w:color w:val="000000"/>
-              </w:rPr>
-              <w:t xml:space="preserve">177</w:t>
-            </w:r>
-          </w:p>
-        </w:tc>
-      </w:tr>
-    </w:tbl>
-    <w:p>
-      <w:pPr>
-        <w:pStyle w:val="BodyText"/>
-      </w:pPr>
-      <w:r>
-        <w:t xml:space="preserve"> </w:t>
-      </w:r>
-      <w:r>
-        <w:t xml:space="preserve"> </w:t>
+        <w:t xml:space="preserve">NA for den beregnede multilaterale kjernestøtten til Mexico i 2020 var NA.</w:t>
       </w:r>
     </w:p>
     <w:p>
@@ -2978,12 +3108,23 @@
         <w:pStyle w:val="BodyText"/>
       </w:pPr>
       <w:r>
-        <w:t xml:space="preserve">Landflaket ble lastet ned den 07. 05. 2023 fra</w:t>
-      </w:r>
-      <w:r>
         <w:t xml:space="preserve"> </w:t>
       </w:r>
-      <w:hyperlink r:id="rId39">
+      <w:r>
+        <w:t xml:space="preserve"> </w:t>
+      </w:r>
+    </w:p>
+    <w:p>
+      <w:pPr>
+        <w:pStyle w:val="BodyText"/>
+      </w:pPr>
+      <w:r>
+        <w:t xml:space="preserve">Landflaket ble lastet ned den 09. 12. 2023 fra</w:t>
+      </w:r>
+      <w:r>
+        <w:t xml:space="preserve"> </w:t>
+      </w:r>
+      <w:hyperlink r:id="rId36">
         <w:r>
           <w:rPr>
             <w:rStyle w:val="Hyperlink"/>
@@ -2997,7 +3138,7 @@
       <w:r>
         <w:t xml:space="preserve"> </w:t>
       </w:r>
-      <w:hyperlink r:id="rId40">
+      <w:hyperlink r:id="rId37">
         <w:r>
           <w:rPr>
             <w:rStyle w:val="Hyperlink"/>
@@ -3009,8 +3150,8 @@
         <w:t xml:space="preserve">.</w:t>
       </w:r>
     </w:p>
-    <w:bookmarkEnd w:id="41"/>
-    <w:bookmarkEnd w:id="42"/>
+    <w:bookmarkEnd w:id="38"/>
+    <w:bookmarkEnd w:id="39"/>
     <w:sectPr>
       <w:footerReference r:id="rId10" w:type="default"/>
       <w:headerReference r:id="rId9" w:type="first"/>
@@ -3093,7 +3234,7 @@
           <w:rPr>
             <w:rStyle w:val="Hyperlink"/>
           </w:rPr>
-          <w:t xml:space="preserve">Landsiden til Tanzania</w:t>
+          <w:t xml:space="preserve">Landsiden til Mexico</w:t>
         </w:r>
       </w:hyperlink>
       <w:r>
@@ -3119,11 +3260,11 @@
         <w:t xml:space="preserve"> </w:t>
       </w:r>
       <w:r>
-        <w:t xml:space="preserve">Beregnet norsk multilateral kjernestøtte til Tanzania er beregnet av OECDs utviklingsdirektorat (DCD), og er basert på de multilaterale organisasjonenes forbruk av kjernestøtte på mottakerland. Bistand til landet gjennom regionale og globale programmer og fond utover multilateral kjernestøtte er ikke inkludert i landflaket.</w:t>
+        <w:t xml:space="preserve">Beregnet norsk multilateral kjernestøtte til Mexico er beregnet av OECDs utviklingsdirektorat (DCD), og er basert på de multilaterale organisasjonenes forbruk av kjernestøtte på mottakerland. Bistand til landet gjennom regionale og globale programmer og fond utover multilateral kjernestøtte er ikke inkludert i landflaket.</w:t>
       </w:r>
     </w:p>
   </w:footnote>
-  <w:footnote w:id="37">
+  <w:footnote w:id="34">
     <w:p>
       <w:pPr>
         <w:pStyle w:val="FootnoteText"/>
@@ -3142,7 +3283,7 @@
       </w:r>
     </w:p>
   </w:footnote>
-  <w:footnote w:id="38">
+  <w:footnote w:id="35">
     <w:p>
       <w:pPr>
         <w:pStyle w:val="FootnoteText"/>

</xml_diff>